<commit_message>
[문서] 04_Logging_Hardening: SecurityConfig 자체 401/403 처리와 Advice의 관계 보강
securityFilterChain/formLoginFilterChain 각각에서 401/403을 처리해야 하는 이유를
DefaultExceptionAdvice(컨트롤러 계층)와 비교해 필터 체인 vs 컨트롤러 계층 관점에서
설명하고, 요청 처리 전체 흐름을 추가했다.
</commit_message>
<xml_diff>
--- a/docs/security/04_Logging_Hardening.docx
+++ b/docs/security/04_Logging_Hardening.docx
@@ -168,25 +168,7 @@
         <w:spacing w:after="50" w:line="264" w:lineRule="auto"/>
       </w:pPr>
       <w:r>
-        <w:t xml:space="preserve">7. </w:t>
-      </w:r>
-      <w:r>
-        <w:t>예외</w:t>
-      </w:r>
-      <w:r>
-        <w:t xml:space="preserve"> </w:t>
-      </w:r>
-      <w:r>
-        <w:t>처리</w:t>
-      </w:r>
-      <w:r>
-        <w:t xml:space="preserve"> </w:t>
-      </w:r>
-      <w:r>
-        <w:t>하드닝</w:t>
-      </w:r>
-      <w:r>
-        <w:t xml:space="preserve"> (OWASP #10)</w:t>
+        <w:t xml:space="preserve">7. 예외 처리 하드닝 (OWASP #10)</w:t>
       </w:r>
     </w:p>
     <w:p>
@@ -929,13 +911,8 @@
         <w:spacing w:after="90" w:line="272" w:lineRule="auto"/>
       </w:pPr>
       <w:r>
-        <w:t xml:space="preserve">SecurityAuditListener — Spring Security 가 발행하는 로그인 성공/실패 이벤트를 받아 감사 로그를 남긴다. 이메일은 </w:t>
-      </w:r>
-      <w:proofErr w:type="spellStart"/>
-      <w:r>
-        <w:t>마스킹</w:t>
-      </w:r>
-      <w:proofErr w:type="spellEnd"/>
+        <w:t xml:space="preserve">SecurityAuditListener — Spring Security 가 발행하는 로그인 성공/실패 이벤트를 받아 감사 로그를 남긴다. 이메일은 마스킹</w:t>
+      </w:r>
       <w:r>
         <w:rPr>
           <w:rFonts w:hint="eastAsia"/>
@@ -1534,6 +1511,831 @@
           <w:szCs w:val="18"/>
         </w:rPr>
         <w:t>logging.level.com.basic.myspringboot.exception.advice=INFO</w:t>
+      </w:r>
+    </w:p>
+    <w:p>
+      <w:pPr>
+        <w:pStyle w:val="2"/>
+        <w:spacing w:before="240" w:after="100"/>
+      </w:pPr>
+      <w:r>
+        <w:rPr>
+          <w:b/>
+          <w:bCs/>
+          <w:color w:val="2E5496"/>
+        </w:rPr>
+        <w:t>4-4. SecurityConfig 자체의 401/403 처리 — Advice만으로 충분하지 않은 이유</w:t>
+      </w:r>
+    </w:p>
+    <w:p>
+      <w:pPr>
+        <w:spacing w:after="90" w:line="272" w:lineRule="auto"/>
+      </w:pPr>
+      <w:r>
+        <w:t xml:space="preserve">4-2의 DefaultExceptionAdvice(@RestControllerAdvice)는 401/403을 이미 [AUDIT]로 남기고 있다. </w:t>
+      </w:r>
+      <w:r>
+        <w:t xml:space="preserve">그런데도 이후 브랜치들에서는 SecurityConfig의 securityFilterChain·formLoginFilterChain 양쪽에 또 [AUDIT] 로그를 추가했다. </w:t>
+      </w:r>
+      <w:r>
+        <w:rPr>
+          <w:b/>
+          <w:bCs/>
+        </w:rPr>
+        <w:t xml:space="preserve">중복이 아니라, Advice가 아예 호출되지 않는 경로가 따로 있기 때문이다.</w:t>
+      </w:r>
+    </w:p>
+    <w:p>
+      <w:pPr>
+        <w:spacing w:after="90" w:line="272" w:lineRule="auto"/>
+      </w:pPr>
+      <w:r>
+        <w:rPr>
+          <w:b/>
+          <w:bCs/>
+        </w:rPr>
+        <w:t xml:space="preserve">핵심 원리</w:t>
+      </w:r>
+      <w:r>
+        <w:t xml:space="preserve">: Spring Security의 필터 체인은 DispatcherServlet(= Controller, @RestControllerAdvice가 동작하는 계층) 이전 단계에서 실행된다. .authorizeHttpRequests(...) 규칙 위반이나 인증 필터의 실패는 필터 체인 안의 ExceptionTranslationFilter가 즉시 가로채 그 체인에 설정된 AuthenticationEntryPoint(401)·AccessDeniedHandler(403)로 응답을 직접 써버린다. 요청이 DispatcherServlet까지 도달하지 못하므로, 컨트롤러 메서드 실행 중에만 동작하는 @RestControllerAdvice는 이 예외를 아예 보지 못한다. 즉 예외가 발생하는 지점(필터 체인 vs. 컨트롤러 계층)에 따라 둘 중 하나만 호출되므로, 두 지점 모두에 로그를 심어야 누락이 없다.</w:t>
+      </w:r>
+    </w:p>
+    <w:p>
+      <w:pPr>
+        <w:spacing w:before="180" w:after="80" w:line="272" w:lineRule="auto"/>
+      </w:pPr>
+      <w:r>
+        <w:rPr>
+          <w:b/>
+          <w:bCs/>
+          <w:color w:val="1F3864"/>
+        </w:rPr>
+        <w:t>① securityFilterChain(API, /api/**) — 왜 필요한가</w:t>
+      </w:r>
+    </w:p>
+    <w:p>
+      <w:pPr>
+        <w:pStyle w:val="a4"/>
+        <w:numPr>
+          <w:ilvl w:val="0"/>
+          <w:numId w:val="1"/>
+        </w:numPr>
+        <w:spacing w:after="60" w:line="264" w:lineRule="auto"/>
+      </w:pPr>
+      <w:r>
+        <w:t xml:space="preserve">401 : JwtAuthenticationFilter가 토큰이 없거나 무효하다고 판단하는 순간 발생. 이 필터 자체가 DispatcherServlet 이전 단계이므로 Advice는 호출될 수 없다.</w:t>
+      </w:r>
+    </w:p>
+    <w:p>
+      <w:pPr>
+        <w:pStyle w:val="a4"/>
+        <w:numPr>
+          <w:ilvl w:val="0"/>
+          <w:numId w:val="1"/>
+        </w:numPr>
+        <w:spacing w:after="60" w:line="264" w:lineRule="auto"/>
+      </w:pPr>
+      <w:r>
+        <w:t xml:space="preserve">403 : .requestMatchers("/api/**").authenticated() 같은 URL 규칙을 AuthorizationFilter가 평가해 거부하는 순간 발생. 역시 필터 체인 단계라 Advice에 도달하지 않는다.</w:t>
+      </w:r>
+    </w:p>
+    <w:p>
+      <w:pPr>
+        <w:pStyle w:val="a4"/>
+        <w:numPr>
+          <w:ilvl w:val="0"/>
+          <w:numId w:val="1"/>
+        </w:numPr>
+        <w:spacing w:after="60" w:line="264" w:lineRule="auto"/>
+      </w:pPr>
+      <w:r>
+        <w:t xml:space="preserve">단, 컨트롤러 메서드에 @PreAuthorize로 거는 메서드 보안은 메서드 호출 시점에 평가되므로 DispatcherServlet을 통과한 뒤이고, 이 경우의 403은 Advice의 AccessDeniedException 핸들러가 정상적으로 캐치한다. 같은 403이라도 어디서 막혔는지에 따라 Advice가 보는 것과 못 보는 것이 갈린다.</w:t>
+      </w:r>
+    </w:p>
+    <w:p>
+      <w:pPr>
+        <w:pBdr>
+          <w:top w:val="single" w:sz="4" w:space="3" w:color="D9D9D9"/>
+          <w:left w:val="single" w:sz="18" w:space="6" w:color="C0C0C0"/>
+        </w:pBdr>
+        <w:shd w:val="clear" w:color="auto" w:fill="F4F4F4"/>
+      </w:pPr>
+      <w:r>
+        <w:rPr>
+          <w:rFonts w:ascii="Consolas" w:eastAsia="Consolas" w:hAnsi="Consolas" w:cs="Consolas"/>
+          <w:sz w:val="18"/>
+          <w:szCs w:val="18"/>
+        </w:rPr>
+        <w:t xml:space="preserve">.exceptionHandling(ex -&gt; ex</w:t>
+      </w:r>
+    </w:p>
+    <w:p>
+      <w:pPr>
+        <w:pBdr>
+          <w:left w:val="single" w:sz="18" w:space="6" w:color="C0C0C0"/>
+        </w:pBdr>
+        <w:shd w:val="clear" w:color="auto" w:fill="F4F4F4"/>
+      </w:pPr>
+      <w:r>
+        <w:rPr>
+          <w:rFonts w:ascii="Consolas" w:eastAsia="Consolas" w:hAnsi="Consolas" w:cs="Consolas"/>
+          <w:sz w:val="18"/>
+          <w:szCs w:val="18"/>
+        </w:rPr>
+        <w:t xml:space="preserve">        .authenticationEntryPoint(authenticationEntryPoint())      // 401 → [AUDIT] 로그 + JSON 응답</w:t>
+      </w:r>
+    </w:p>
+    <w:p>
+      <w:pPr>
+        <w:pBdr>
+          <w:left w:val="single" w:sz="18" w:space="6" w:color="C0C0C0"/>
+          <w:bottom w:val="single" w:sz="4" w:space="3" w:color="D9D9D9"/>
+        </w:pBdr>
+        <w:shd w:val="clear" w:color="auto" w:fill="F4F4F4"/>
+      </w:pPr>
+      <w:r>
+        <w:rPr>
+          <w:rFonts w:ascii="Consolas" w:eastAsia="Consolas" w:hAnsi="Consolas" w:cs="Consolas"/>
+          <w:sz w:val="18"/>
+          <w:szCs w:val="18"/>
+        </w:rPr>
+        <w:t xml:space="preserve">        .accessDeniedHandler(auditedAccessDeniedHandler()))        // 403 → [AUDIT] 로그 + JSON 응답</w:t>
+      </w:r>
+    </w:p>
+    <w:p>
+      <w:pPr>
+        <w:spacing w:before="180" w:after="80" w:line="272" w:lineRule="auto"/>
+      </w:pPr>
+      <w:r>
+        <w:rPr>
+          <w:b/>
+          <w:bCs/>
+          <w:color w:val="1F3864"/>
+        </w:rPr>
+        <w:t>② formLoginFilterChain(세션/폼 로그인, catch-all) — 왜 필요한가</w:t>
+      </w:r>
+    </w:p>
+    <w:p>
+      <w:pPr>
+        <w:pStyle w:val="a4"/>
+        <w:numPr>
+          <w:ilvl w:val="0"/>
+          <w:numId w:val="1"/>
+        </w:numPr>
+        <w:spacing w:after="60" w:line="264" w:lineRule="auto"/>
+      </w:pPr>
+      <w:r>
+        <w:t xml:space="preserve">이 체인은 원래 exceptionHandling 자체가 없었다. /users/**·/actuator/**에 대한 401/403이 Spring Security의 기본 처리로 빠지며 [AUDIT] 로그가 전혀 남지 않았다. (securityFilterChain은 로그가 “Advice에만” 있었던 것과 달리, 이쪽은 아무 데도 없었다.)</w:t>
+      </w:r>
+    </w:p>
+    <w:p>
+      <w:pPr>
+        <w:pStyle w:val="a4"/>
+        <w:numPr>
+          <w:ilvl w:val="0"/>
+          <w:numId w:val="1"/>
+        </w:numPr>
+        <w:spacing w:after="60" w:line="264" w:lineRule="auto"/>
+      </w:pPr>
+      <w:r>
+        <w:t xml:space="preserve">401 : 세션 기반이라 실제 응답은 JSON 401이 아니라 /login으로의 302 리다이렉트다. 그래도 원인은 “인증 안 된 상태로 보호된 경로에 접근”으로 API 체인의 401과 동일하므로, 같은 [AUDIT] 태그로 남기되 응답 자체는 기존 LoginUrlAuthenticationEntryPoint에 위임해 리다이렉트 동작은 그대로 유지한다.</w:t>
+      </w:r>
+    </w:p>
+    <w:p>
+      <w:pPr>
+        <w:pStyle w:val="a4"/>
+        <w:numPr>
+          <w:ilvl w:val="0"/>
+          <w:numId w:val="1"/>
+        </w:numPr>
+        <w:spacing w:after="60" w:line="264" w:lineRule="auto"/>
+      </w:pPr>
+      <w:r>
+        <w:t xml:space="preserve">403 : /actuator/**를 ROLE_ADMIN으로 제한한 규칙을 세션 인증된 사용자가 위반할 때 발생. API 체인과 동일한 auditedAccessDeniedHandler()를 공유해서 쓴다 — 403의 의미(권한 부족)와 응답 형식(JSON)이 같기 때문이다.</w:t>
+      </w:r>
+    </w:p>
+    <w:p>
+      <w:pPr>
+        <w:pBdr>
+          <w:top w:val="single" w:sz="4" w:space="3" w:color="D9D9D9"/>
+          <w:left w:val="single" w:sz="18" w:space="6" w:color="C0C0C0"/>
+        </w:pBdr>
+        <w:shd w:val="clear" w:color="auto" w:fill="F4F4F4"/>
+      </w:pPr>
+      <w:r>
+        <w:rPr>
+          <w:rFonts w:ascii="Consolas" w:eastAsia="Consolas" w:hAnsi="Consolas" w:cs="Consolas"/>
+          <w:sz w:val="18"/>
+          <w:szCs w:val="18"/>
+        </w:rPr>
+        <w:t xml:space="preserve">.exceptionHandling(ex -&gt; ex</w:t>
+      </w:r>
+    </w:p>
+    <w:p>
+      <w:pPr>
+        <w:pBdr>
+          <w:left w:val="single" w:sz="18" w:space="6" w:color="C0C0C0"/>
+        </w:pBdr>
+        <w:shd w:val="clear" w:color="auto" w:fill="F4F4F4"/>
+      </w:pPr>
+      <w:r>
+        <w:rPr>
+          <w:rFonts w:ascii="Consolas" w:eastAsia="Consolas" w:hAnsi="Consolas" w:cs="Consolas"/>
+          <w:sz w:val="18"/>
+          <w:szCs w:val="18"/>
+        </w:rPr>
+        <w:t xml:space="preserve">        .authenticationEntryPoint(auditedLoginEntryPoint())        // 401 → [AUDIT] 로그 + /login 리다이렉트(기존 동작 유지)</w:t>
+      </w:r>
+    </w:p>
+    <w:p>
+      <w:pPr>
+        <w:pBdr>
+          <w:left w:val="single" w:sz="18" w:space="6" w:color="C0C0C0"/>
+          <w:bottom w:val="single" w:sz="4" w:space="3" w:color="D9D9D9"/>
+        </w:pBdr>
+        <w:shd w:val="clear" w:color="auto" w:fill="F4F4F4"/>
+      </w:pPr>
+      <w:r>
+        <w:rPr>
+          <w:rFonts w:ascii="Consolas" w:eastAsia="Consolas" w:hAnsi="Consolas" w:cs="Consolas"/>
+          <w:sz w:val="18"/>
+          <w:szCs w:val="18"/>
+        </w:rPr>
+        <w:t xml:space="preserve">        .accessDeniedHandler(auditedAccessDeniedHandler()))        // 403 → [AUDIT] 로그 + JSON 응답(API 체인과 공유)</w:t>
+      </w:r>
+    </w:p>
+    <w:p>
+      <w:pPr>
+        <w:spacing w:before="180" w:after="80" w:line="272" w:lineRule="auto"/>
+      </w:pPr>
+      <w:r>
+        <w:rPr>
+          <w:b/>
+          <w:bCs/>
+          <w:color w:val="1F3864"/>
+        </w:rPr>
+        <w:t>전체 오류 처리 흐름</w:t>
+      </w:r>
+    </w:p>
+    <w:p>
+      <w:pPr>
+        <w:pBdr>
+          <w:top w:val="single" w:sz="4" w:space="3" w:color="D9D9D9"/>
+          <w:left w:val="single" w:sz="18" w:space="6" w:color="C0C0C0"/>
+        </w:pBdr>
+        <w:shd w:val="clear" w:color="auto" w:fill="F4F4F4"/>
+      </w:pPr>
+      <w:r>
+        <w:rPr>
+          <w:rFonts w:ascii="Consolas" w:eastAsia="Consolas" w:hAnsi="Consolas" w:cs="Consolas"/>
+          <w:sz w:val="18"/>
+          <w:szCs w:val="18"/>
+        </w:rPr>
+        <w:t xml:space="preserve">클라이언트 요청</w:t>
+      </w:r>
+    </w:p>
+    <w:p>
+      <w:pPr>
+        <w:pBdr>
+          <w:left w:val="single" w:sz="18" w:space="6" w:color="C0C0C0"/>
+        </w:pBdr>
+        <w:shd w:val="clear" w:color="auto" w:fill="F4F4F4"/>
+      </w:pPr>
+      <w:r>
+        <w:rPr>
+          <w:rFonts w:ascii="Consolas" w:eastAsia="Consolas" w:hAnsi="Consolas" w:cs="Consolas"/>
+          <w:sz w:val="18"/>
+          <w:szCs w:val="18"/>
+        </w:rPr>
+        <w:t xml:space="preserve">   │</w:t>
+      </w:r>
+    </w:p>
+    <w:p>
+      <w:pPr>
+        <w:pBdr>
+          <w:left w:val="single" w:sz="18" w:space="6" w:color="C0C0C0"/>
+        </w:pBdr>
+        <w:shd w:val="clear" w:color="auto" w:fill="F4F4F4"/>
+      </w:pPr>
+      <w:r>
+        <w:rPr>
+          <w:rFonts w:ascii="Consolas" w:eastAsia="Consolas" w:hAnsi="Consolas" w:cs="Consolas"/>
+          <w:sz w:val="18"/>
+          <w:szCs w:val="18"/>
+        </w:rPr>
+        <w:t xml:space="preserve">   ▼</w:t>
+      </w:r>
+    </w:p>
+    <w:p>
+      <w:pPr>
+        <w:pBdr>
+          <w:left w:val="single" w:sz="18" w:space="6" w:color="C0C0C0"/>
+        </w:pBdr>
+        <w:shd w:val="clear" w:color="auto" w:fill="F4F4F4"/>
+      </w:pPr>
+      <w:r>
+        <w:rPr>
+          <w:rFonts w:ascii="Consolas" w:eastAsia="Consolas" w:hAnsi="Consolas" w:cs="Consolas"/>
+          <w:sz w:val="18"/>
+          <w:szCs w:val="18"/>
+        </w:rPr>
+        <w:t xml:space="preserve">securityMatcher 로 체인 선택 ( "/api/**" → securityFilterChain(@Order 1) ,</w:t>
+      </w:r>
+    </w:p>
+    <w:p>
+      <w:pPr>
+        <w:pBdr>
+          <w:left w:val="single" w:sz="18" w:space="6" w:color="C0C0C0"/>
+        </w:pBdr>
+        <w:shd w:val="clear" w:color="auto" w:fill="F4F4F4"/>
+      </w:pPr>
+      <w:r>
+        <w:rPr>
+          <w:rFonts w:ascii="Consolas" w:eastAsia="Consolas" w:hAnsi="Consolas" w:cs="Consolas"/>
+          <w:sz w:val="18"/>
+          <w:szCs w:val="18"/>
+        </w:rPr>
+        <w:t xml:space="preserve">                              그 외 전부 → formLoginFilterChain(@Order 2) )</w:t>
+      </w:r>
+    </w:p>
+    <w:p>
+      <w:pPr>
+        <w:pBdr>
+          <w:left w:val="single" w:sz="18" w:space="6" w:color="C0C0C0"/>
+        </w:pBdr>
+        <w:shd w:val="clear" w:color="auto" w:fill="F4F4F4"/>
+      </w:pPr>
+      <w:r>
+        <w:rPr>
+          <w:rFonts w:ascii="Consolas" w:eastAsia="Consolas" w:hAnsi="Consolas" w:cs="Consolas"/>
+          <w:sz w:val="18"/>
+          <w:szCs w:val="18"/>
+        </w:rPr>
+        <w:t xml:space="preserve">   │</w:t>
+      </w:r>
+    </w:p>
+    <w:p>
+      <w:pPr>
+        <w:pBdr>
+          <w:left w:val="single" w:sz="18" w:space="6" w:color="C0C0C0"/>
+        </w:pBdr>
+        <w:shd w:val="clear" w:color="auto" w:fill="F4F4F4"/>
+      </w:pPr>
+      <w:r>
+        <w:rPr>
+          <w:rFonts w:ascii="Consolas" w:eastAsia="Consolas" w:hAnsi="Consolas" w:cs="Consolas"/>
+          <w:sz w:val="18"/>
+          <w:szCs w:val="18"/>
+        </w:rPr>
+        <w:t xml:space="preserve">   ▼</w:t>
+      </w:r>
+    </w:p>
+    <w:p>
+      <w:pPr>
+        <w:pBdr>
+          <w:left w:val="single" w:sz="18" w:space="6" w:color="C0C0C0"/>
+        </w:pBdr>
+        <w:shd w:val="clear" w:color="auto" w:fill="F4F4F4"/>
+      </w:pPr>
+      <w:r>
+        <w:rPr>
+          <w:rFonts w:ascii="Consolas" w:eastAsia="Consolas" w:hAnsi="Consolas" w:cs="Consolas"/>
+          <w:sz w:val="18"/>
+          <w:szCs w:val="18"/>
+        </w:rPr>
+        <w:t xml:space="preserve">[ 필터 체인 내부 ]</w:t>
+      </w:r>
+    </w:p>
+    <w:p>
+      <w:pPr>
+        <w:pBdr>
+          <w:left w:val="single" w:sz="18" w:space="6" w:color="C0C0C0"/>
+        </w:pBdr>
+        <w:shd w:val="clear" w:color="auto" w:fill="F4F4F4"/>
+      </w:pPr>
+      <w:r>
+        <w:rPr>
+          <w:rFonts w:ascii="Consolas" w:eastAsia="Consolas" w:hAnsi="Consolas" w:cs="Consolas"/>
+          <w:sz w:val="18"/>
+          <w:szCs w:val="18"/>
+        </w:rPr>
+        <w:t xml:space="preserve">  인증 필터 (JwtAuthenticationFilter / 세션+폼 로그인) 통과?</w:t>
+      </w:r>
+    </w:p>
+    <w:p>
+      <w:pPr>
+        <w:pBdr>
+          <w:left w:val="single" w:sz="18" w:space="6" w:color="C0C0C0"/>
+        </w:pBdr>
+        <w:shd w:val="clear" w:color="auto" w:fill="F4F4F4"/>
+      </w:pPr>
+      <w:r>
+        <w:rPr>
+          <w:rFonts w:ascii="Consolas" w:eastAsia="Consolas" w:hAnsi="Consolas" w:cs="Consolas"/>
+          <w:sz w:val="18"/>
+          <w:szCs w:val="18"/>
+        </w:rPr>
+        <w:t xml:space="preserve">       │ 실패(토큰 없음·무효, 또는 미인증 상태로 보호 경로 접근)</w:t>
+      </w:r>
+    </w:p>
+    <w:p>
+      <w:pPr>
+        <w:pBdr>
+          <w:left w:val="single" w:sz="18" w:space="6" w:color="C0C0C0"/>
+        </w:pBdr>
+        <w:shd w:val="clear" w:color="auto" w:fill="F4F4F4"/>
+      </w:pPr>
+      <w:r>
+        <w:rPr>
+          <w:rFonts w:ascii="Consolas" w:eastAsia="Consolas" w:hAnsi="Consolas" w:cs="Consolas"/>
+          <w:sz w:val="18"/>
+          <w:szCs w:val="18"/>
+        </w:rPr>
+        <w:t xml:space="preserve">       └──▶ ExceptionTranslationFilter 가 AuthenticationException 포착</w:t>
+      </w:r>
+    </w:p>
+    <w:p>
+      <w:pPr>
+        <w:pBdr>
+          <w:left w:val="single" w:sz="18" w:space="6" w:color="C0C0C0"/>
+        </w:pBdr>
+        <w:shd w:val="clear" w:color="auto" w:fill="F4F4F4"/>
+      </w:pPr>
+      <w:r>
+        <w:rPr>
+          <w:rFonts w:ascii="Consolas" w:eastAsia="Consolas" w:hAnsi="Consolas" w:cs="Consolas"/>
+          <w:sz w:val="18"/>
+          <w:szCs w:val="18"/>
+        </w:rPr>
+        <w:t xml:space="preserve">                 └──▶ 그 체인에 설정된 AuthenticationEntryPoint 호출</w:t>
+      </w:r>
+    </w:p>
+    <w:p>
+      <w:pPr>
+        <w:pBdr>
+          <w:left w:val="single" w:sz="18" w:space="6" w:color="C0C0C0"/>
+        </w:pBdr>
+        <w:shd w:val="clear" w:color="auto" w:fill="F4F4F4"/>
+      </w:pPr>
+      <w:r>
+        <w:rPr>
+          <w:rFonts w:ascii="Consolas" w:eastAsia="Consolas" w:hAnsi="Consolas" w:cs="Consolas"/>
+          <w:sz w:val="18"/>
+          <w:szCs w:val="18"/>
+        </w:rPr>
+        <w:t xml:space="preserve">                        → [AUDIT] 인증 실패(401) 로그</w:t>
+      </w:r>
+    </w:p>
+    <w:p>
+      <w:pPr>
+        <w:pBdr>
+          <w:left w:val="single" w:sz="18" w:space="6" w:color="C0C0C0"/>
+        </w:pBdr>
+        <w:shd w:val="clear" w:color="auto" w:fill="F4F4F4"/>
+      </w:pPr>
+      <w:r>
+        <w:rPr>
+          <w:rFonts w:ascii="Consolas" w:eastAsia="Consolas" w:hAnsi="Consolas" w:cs="Consolas"/>
+          <w:sz w:val="18"/>
+          <w:szCs w:val="18"/>
+        </w:rPr>
+        <w:t xml:space="preserve">                        → 응답 직접 작성 (API: JSON 401 / 폼: /login 리다이렉트)</w:t>
+      </w:r>
+    </w:p>
+    <w:p>
+      <w:pPr>
+        <w:pBdr>
+          <w:left w:val="single" w:sz="18" w:space="6" w:color="C0C0C0"/>
+        </w:pBdr>
+        <w:shd w:val="clear" w:color="auto" w:fill="F4F4F4"/>
+      </w:pPr>
+      <w:r>
+        <w:rPr>
+          <w:rFonts w:ascii="Consolas" w:eastAsia="Consolas" w:hAnsi="Consolas" w:cs="Consolas"/>
+          <w:sz w:val="18"/>
+          <w:szCs w:val="18"/>
+        </w:rPr>
+        <w:t xml:space="preserve">                        ⚠ DispatcherServlet·Controller·Advice 는 전혀 호출되지 않는다</w:t>
+      </w:r>
+    </w:p>
+    <w:p>
+      <w:pPr>
+        <w:pBdr>
+          <w:left w:val="single" w:sz="18" w:space="6" w:color="C0C0C0"/>
+        </w:pBdr>
+        <w:shd w:val="clear" w:color="auto" w:fill="F4F4F4"/>
+      </w:pPr>
+      <w:r>
+        <w:rPr>
+          <w:rFonts w:ascii="Consolas" w:eastAsia="Consolas" w:hAnsi="Consolas" w:cs="Consolas"/>
+          <w:sz w:val="18"/>
+          <w:szCs w:val="18"/>
+        </w:rPr>
+        <w:t xml:space="preserve">       │ 통과</w:t>
+      </w:r>
+    </w:p>
+    <w:p>
+      <w:pPr>
+        <w:pBdr>
+          <w:left w:val="single" w:sz="18" w:space="6" w:color="C0C0C0"/>
+        </w:pBdr>
+        <w:shd w:val="clear" w:color="auto" w:fill="F4F4F4"/>
+      </w:pPr>
+      <w:r>
+        <w:rPr>
+          <w:rFonts w:ascii="Consolas" w:eastAsia="Consolas" w:hAnsi="Consolas" w:cs="Consolas"/>
+          <w:sz w:val="18"/>
+          <w:szCs w:val="18"/>
+        </w:rPr>
+        <w:t xml:space="preserve">       ▼</w:t>
+      </w:r>
+    </w:p>
+    <w:p>
+      <w:pPr>
+        <w:pBdr>
+          <w:left w:val="single" w:sz="18" w:space="6" w:color="C0C0C0"/>
+        </w:pBdr>
+        <w:shd w:val="clear" w:color="auto" w:fill="F4F4F4"/>
+      </w:pPr>
+      <w:r>
+        <w:rPr>
+          <w:rFonts w:ascii="Consolas" w:eastAsia="Consolas" w:hAnsi="Consolas" w:cs="Consolas"/>
+          <w:sz w:val="18"/>
+          <w:szCs w:val="18"/>
+        </w:rPr>
+        <w:t xml:space="preserve">  인가 필터 (AuthorizationFilter, .authorizeHttpRequests 규칙) 통과?</w:t>
+      </w:r>
+    </w:p>
+    <w:p>
+      <w:pPr>
+        <w:pBdr>
+          <w:left w:val="single" w:sz="18" w:space="6" w:color="C0C0C0"/>
+        </w:pBdr>
+        <w:shd w:val="clear" w:color="auto" w:fill="F4F4F4"/>
+      </w:pPr>
+      <w:r>
+        <w:rPr>
+          <w:rFonts w:ascii="Consolas" w:eastAsia="Consolas" w:hAnsi="Consolas" w:cs="Consolas"/>
+          <w:sz w:val="18"/>
+          <w:szCs w:val="18"/>
+        </w:rPr>
+        <w:t xml:space="preserve">       │ 거부(인증은 됐지만 권한 부족)</w:t>
+      </w:r>
+    </w:p>
+    <w:p>
+      <w:pPr>
+        <w:pBdr>
+          <w:left w:val="single" w:sz="18" w:space="6" w:color="C0C0C0"/>
+        </w:pBdr>
+        <w:shd w:val="clear" w:color="auto" w:fill="F4F4F4"/>
+      </w:pPr>
+      <w:r>
+        <w:rPr>
+          <w:rFonts w:ascii="Consolas" w:eastAsia="Consolas" w:hAnsi="Consolas" w:cs="Consolas"/>
+          <w:sz w:val="18"/>
+          <w:szCs w:val="18"/>
+        </w:rPr>
+        <w:t xml:space="preserve">       └──▶ ExceptionTranslationFilter 가 AccessDeniedException 포착</w:t>
+      </w:r>
+    </w:p>
+    <w:p>
+      <w:pPr>
+        <w:pBdr>
+          <w:left w:val="single" w:sz="18" w:space="6" w:color="C0C0C0"/>
+        </w:pBdr>
+        <w:shd w:val="clear" w:color="auto" w:fill="F4F4F4"/>
+      </w:pPr>
+      <w:r>
+        <w:rPr>
+          <w:rFonts w:ascii="Consolas" w:eastAsia="Consolas" w:hAnsi="Consolas" w:cs="Consolas"/>
+          <w:sz w:val="18"/>
+          <w:szCs w:val="18"/>
+        </w:rPr>
+        <w:t xml:space="preserve">                 └──▶ 그 체인에 설정된 AccessDeniedHandler 호출</w:t>
+      </w:r>
+    </w:p>
+    <w:p>
+      <w:pPr>
+        <w:pBdr>
+          <w:left w:val="single" w:sz="18" w:space="6" w:color="C0C0C0"/>
+        </w:pBdr>
+        <w:shd w:val="clear" w:color="auto" w:fill="F4F4F4"/>
+      </w:pPr>
+      <w:r>
+        <w:rPr>
+          <w:rFonts w:ascii="Consolas" w:eastAsia="Consolas" w:hAnsi="Consolas" w:cs="Consolas"/>
+          <w:sz w:val="18"/>
+          <w:szCs w:val="18"/>
+        </w:rPr>
+        <w:t xml:space="preserve">                        → [AUDIT] 접근 거부(403) 로그</w:t>
+      </w:r>
+    </w:p>
+    <w:p>
+      <w:pPr>
+        <w:pBdr>
+          <w:left w:val="single" w:sz="18" w:space="6" w:color="C0C0C0"/>
+        </w:pBdr>
+        <w:shd w:val="clear" w:color="auto" w:fill="F4F4F4"/>
+      </w:pPr>
+      <w:r>
+        <w:rPr>
+          <w:rFonts w:ascii="Consolas" w:eastAsia="Consolas" w:hAnsi="Consolas" w:cs="Consolas"/>
+          <w:sz w:val="18"/>
+          <w:szCs w:val="18"/>
+        </w:rPr>
+        <w:t xml:space="preserve">                        → 응답 직접 작성 (JSON 403)</w:t>
+      </w:r>
+    </w:p>
+    <w:p>
+      <w:pPr>
+        <w:pBdr>
+          <w:left w:val="single" w:sz="18" w:space="6" w:color="C0C0C0"/>
+        </w:pBdr>
+        <w:shd w:val="clear" w:color="auto" w:fill="F4F4F4"/>
+      </w:pPr>
+      <w:r>
+        <w:rPr>
+          <w:rFonts w:ascii="Consolas" w:eastAsia="Consolas" w:hAnsi="Consolas" w:cs="Consolas"/>
+          <w:sz w:val="18"/>
+          <w:szCs w:val="18"/>
+        </w:rPr>
+        <w:t xml:space="preserve">                        ⚠ 이 경우도 DispatcherServlet·Advice 는 호출되지 않는다</w:t>
+      </w:r>
+    </w:p>
+    <w:p>
+      <w:pPr>
+        <w:pBdr>
+          <w:left w:val="single" w:sz="18" w:space="6" w:color="C0C0C0"/>
+        </w:pBdr>
+        <w:shd w:val="clear" w:color="auto" w:fill="F4F4F4"/>
+      </w:pPr>
+      <w:r>
+        <w:rPr>
+          <w:rFonts w:ascii="Consolas" w:eastAsia="Consolas" w:hAnsi="Consolas" w:cs="Consolas"/>
+          <w:sz w:val="18"/>
+          <w:szCs w:val="18"/>
+        </w:rPr>
+        <w:t xml:space="preserve">       │ 통과</w:t>
+      </w:r>
+    </w:p>
+    <w:p>
+      <w:pPr>
+        <w:pBdr>
+          <w:left w:val="single" w:sz="18" w:space="6" w:color="C0C0C0"/>
+        </w:pBdr>
+        <w:shd w:val="clear" w:color="auto" w:fill="F4F4F4"/>
+      </w:pPr>
+      <w:r>
+        <w:rPr>
+          <w:rFonts w:ascii="Consolas" w:eastAsia="Consolas" w:hAnsi="Consolas" w:cs="Consolas"/>
+          <w:sz w:val="18"/>
+          <w:szCs w:val="18"/>
+        </w:rPr>
+        <w:t xml:space="preserve">       ▼</w:t>
+      </w:r>
+    </w:p>
+    <w:p>
+      <w:pPr>
+        <w:pBdr>
+          <w:left w:val="single" w:sz="18" w:space="6" w:color="C0C0C0"/>
+        </w:pBdr>
+        <w:shd w:val="clear" w:color="auto" w:fill="F4F4F4"/>
+      </w:pPr>
+      <w:r>
+        <w:rPr>
+          <w:rFonts w:ascii="Consolas" w:eastAsia="Consolas" w:hAnsi="Consolas" w:cs="Consolas"/>
+          <w:sz w:val="18"/>
+          <w:szCs w:val="18"/>
+        </w:rPr>
+        <w:t xml:space="preserve">DispatcherServlet → Controller 메서드 실행</w:t>
+      </w:r>
+    </w:p>
+    <w:p>
+      <w:pPr>
+        <w:pBdr>
+          <w:left w:val="single" w:sz="18" w:space="6" w:color="C0C0C0"/>
+        </w:pBdr>
+        <w:shd w:val="clear" w:color="auto" w:fill="F4F4F4"/>
+      </w:pPr>
+      <w:r>
+        <w:rPr>
+          <w:rFonts w:ascii="Consolas" w:eastAsia="Consolas" w:hAnsi="Consolas" w:cs="Consolas"/>
+          <w:sz w:val="18"/>
+          <w:szCs w:val="18"/>
+        </w:rPr>
+        <w:t xml:space="preserve">       │</w:t>
+      </w:r>
+    </w:p>
+    <w:p>
+      <w:pPr>
+        <w:pBdr>
+          <w:left w:val="single" w:sz="18" w:space="6" w:color="C0C0C0"/>
+        </w:pBdr>
+        <w:shd w:val="clear" w:color="auto" w:fill="F4F4F4"/>
+      </w:pPr>
+      <w:r>
+        <w:rPr>
+          <w:rFonts w:ascii="Consolas" w:eastAsia="Consolas" w:hAnsi="Consolas" w:cs="Consolas"/>
+          <w:sz w:val="18"/>
+          <w:szCs w:val="18"/>
+        </w:rPr>
+        <w:t xml:space="preserve">       ├─ 메서드 보안(@PreAuthorize 등) 평가 실패 → AccessDeniedException 발생</w:t>
+      </w:r>
+    </w:p>
+    <w:p>
+      <w:pPr>
+        <w:pBdr>
+          <w:left w:val="single" w:sz="18" w:space="6" w:color="C0C0C0"/>
+        </w:pBdr>
+        <w:shd w:val="clear" w:color="auto" w:fill="F4F4F4"/>
+      </w:pPr>
+      <w:r>
+        <w:rPr>
+          <w:rFonts w:ascii="Consolas" w:eastAsia="Consolas" w:hAnsi="Consolas" w:cs="Consolas"/>
+          <w:sz w:val="18"/>
+          <w:szCs w:val="18"/>
+        </w:rPr>
+        <w:t xml:space="preserve">       │        └──▶ Spring MVC 예외 처리 → @RestControllerAdvice(DefaultExceptionAdvice) 가 캐치</w:t>
+      </w:r>
+    </w:p>
+    <w:p>
+      <w:pPr>
+        <w:pBdr>
+          <w:left w:val="single" w:sz="18" w:space="6" w:color="C0C0C0"/>
+        </w:pBdr>
+        <w:shd w:val="clear" w:color="auto" w:fill="F4F4F4"/>
+      </w:pPr>
+      <w:r>
+        <w:rPr>
+          <w:rFonts w:ascii="Consolas" w:eastAsia="Consolas" w:hAnsi="Consolas" w:cs="Consolas"/>
+          <w:sz w:val="18"/>
+          <w:szCs w:val="18"/>
+        </w:rPr>
+        <w:t xml:space="preserve">       │                 → [AUDIT] 접근 거부(403) 로그 (4-2 참고) + ResponseEntity 작성</w:t>
+      </w:r>
+    </w:p>
+    <w:p>
+      <w:pPr>
+        <w:pBdr>
+          <w:left w:val="single" w:sz="18" w:space="6" w:color="C0C0C0"/>
+        </w:pBdr>
+        <w:shd w:val="clear" w:color="auto" w:fill="F4F4F4"/>
+      </w:pPr>
+      <w:r>
+        <w:rPr>
+          <w:rFonts w:ascii="Consolas" w:eastAsia="Consolas" w:hAnsi="Consolas" w:cs="Consolas"/>
+          <w:sz w:val="18"/>
+          <w:szCs w:val="18"/>
+        </w:rPr>
+        <w:t xml:space="preserve">       │</w:t>
+      </w:r>
+    </w:p>
+    <w:p>
+      <w:pPr>
+        <w:pBdr>
+          <w:left w:val="single" w:sz="18" w:space="6" w:color="C0C0C0"/>
+        </w:pBdr>
+        <w:shd w:val="clear" w:color="auto" w:fill="F4F4F4"/>
+      </w:pPr>
+      <w:r>
+        <w:rPr>
+          <w:rFonts w:ascii="Consolas" w:eastAsia="Consolas" w:hAnsi="Consolas" w:cs="Consolas"/>
+          <w:sz w:val="18"/>
+          <w:szCs w:val="18"/>
+        </w:rPr>
+        <w:t xml:space="preserve">       └─ 로그인 처리 중 자격 증명 불일치 등 → AuthenticationException 발생</w:t>
+      </w:r>
+    </w:p>
+    <w:p>
+      <w:pPr>
+        <w:pBdr>
+          <w:left w:val="single" w:sz="18" w:space="6" w:color="C0C0C0"/>
+          <w:bottom w:val="single" w:sz="4" w:space="3" w:color="D9D9D9"/>
+        </w:pBdr>
+        <w:shd w:val="clear" w:color="auto" w:fill="F4F4F4"/>
+      </w:pPr>
+      <w:r>
+        <w:rPr>
+          <w:rFonts w:ascii="Consolas" w:eastAsia="Consolas" w:hAnsi="Consolas" w:cs="Consolas"/>
+          <w:sz w:val="18"/>
+          <w:szCs w:val="18"/>
+        </w:rPr>
+        <w:t xml:space="preserve">                └──▶ 동일하게 DefaultExceptionAdvice 가 캐치 → [AUDIT] 인증 실패(401) 로그</w:t>
+      </w:r>
+    </w:p>
+    <w:p>
+      <w:pPr>
+        <w:spacing w:after="90" w:line="272" w:lineRule="auto"/>
+      </w:pPr>
+      <w:r>
+        <w:rPr>
+          <w:b/>
+          <w:bCs/>
+        </w:rPr>
+        <w:t xml:space="preserve">결론</w:t>
+      </w:r>
+      <w:r>
+        <w:t xml:space="preserve">: [AUDIT] 401/403 이라는 로그 태그는 같지만, 예외가 발생하는 지점이 “필터 체인”이냐 “컨트롤러 계층”이냐에 따라 Advice와 SecurityConfig 중 정확히 한쪽만 호출된다. 어느 한쪽에만 로그를 남기면 다른 경로로 들어온 401/403은 감사 추적에서 통째로 빠진다. 그래서 두 지점 모두에 [AUDIT] 로그를 심어야 한다.</w:t>
       </w:r>
     </w:p>
     <w:p>
@@ -2019,39 +2821,312 @@
           <w:sz w:val="18"/>
           <w:szCs w:val="18"/>
         </w:rPr>
-        <w:t xml:space="preserve">[AUDIT] </w:t>
-      </w:r>
+        <w:t xml:space="preserve">[AUDIT] 로그인 실패 - user=us***@aa.com, reason=BadCredentialsException</w:t>
+      </w:r>
+    </w:p>
+    <w:p>
+      <w:pPr>
+        <w:pBdr>
+          <w:left w:val="single" w:sz="18" w:space="6" w:color="C0C0C0"/>
+          <w:bottom w:val="single" w:sz="4" w:space="3" w:color="D9D9D9"/>
+        </w:pBdr>
+        <w:shd w:val="clear" w:color="auto" w:fill="F4F4F4"/>
+      </w:pPr>
       <w:r>
         <w:rPr>
           <w:rFonts w:ascii="Consolas" w:hAnsi="Consolas"/>
           <w:sz w:val="18"/>
           <w:szCs w:val="18"/>
         </w:rPr>
-        <w:t>로그인</w:t>
-      </w:r>
+        <w:t xml:space="preserve">[AUDIT] 인증 실패(401) - POST /api/userinfos/login from ...::1 : 자격 증명에 실패하였습니다.</w:t>
+      </w:r>
+    </w:p>
+    <w:p>
+      <w:pPr>
+        <w:spacing w:after="70" w:line="272" w:lineRule="auto"/>
+      </w:pPr>
+      <w:r>
+        <w:rPr>
+          <w:b/>
+          <w:bCs/>
+        </w:rPr>
+        <w:t>확인</w:t>
+      </w:r>
+    </w:p>
+    <w:p>
+      <w:pPr>
+        <w:pBdr>
+          <w:top w:val="single" w:sz="4" w:space="3" w:color="D9D9D9"/>
+          <w:left w:val="single" w:sz="18" w:space="6" w:color="C0C0C0"/>
+          <w:bottom w:val="single" w:sz="4" w:space="3" w:color="D9D9D9"/>
+        </w:pBdr>
+        <w:shd w:val="clear" w:color="auto" w:fill="F4F4F4"/>
+      </w:pPr>
       <w:r>
         <w:rPr>
           <w:rFonts w:ascii="Consolas" w:hAnsi="Consolas"/>
           <w:sz w:val="18"/>
           <w:szCs w:val="18"/>
         </w:rPr>
+        <w:t xml:space="preserve">grep -E "로그인 실패|인증 실패" logs/spring.log | tail -2</w:t>
+      </w:r>
+    </w:p>
+    <w:p>
+      <w:pPr>
+        <w:spacing w:after="70" w:line="272" w:lineRule="auto"/>
+      </w:pPr>
+      <w:r>
+        <w:rPr>
+          <w:b/>
+          <w:bCs/>
+          <w:color w:val="2E7D32"/>
+        </w:rPr>
+        <w:t>② 로그인 성공 → HTTP 200 (토큰 발급)</w:t>
+      </w:r>
+    </w:p>
+    <w:p>
+      <w:pPr>
+        <w:spacing w:after="70" w:line="272" w:lineRule="auto"/>
+        <w:rPr>
+          <w:b/>
+          <w:bCs/>
+        </w:rPr>
+      </w:pPr>
+    </w:p>
+    <w:p>
+      <w:pPr>
+        <w:spacing w:after="70" w:line="272" w:lineRule="auto"/>
+      </w:pPr>
+      <w:r>
+        <w:rPr>
+          <w:b/>
+          <w:bCs/>
+        </w:rPr>
+        <w:t>요청</w:t>
+      </w:r>
+    </w:p>
+    <w:p>
+      <w:pPr>
+        <w:pBdr>
+          <w:top w:val="single" w:sz="4" w:space="3" w:color="D9D9D9"/>
+          <w:left w:val="single" w:sz="18" w:space="6" w:color="C0C0C0"/>
+        </w:pBdr>
+        <w:shd w:val="clear" w:color="auto" w:fill="F4F4F4"/>
+      </w:pPr>
+      <w:r>
+        <w:rPr>
+          <w:rFonts w:ascii="Consolas" w:hAnsi="Consolas"/>
+          <w:sz w:val="18"/>
+          <w:szCs w:val="18"/>
+        </w:rPr>
+        <w:t>curl -s -X POST "http://localhost:8080/api/userinfos/login" \</w:t>
+      </w:r>
+    </w:p>
+    <w:p>
+      <w:pPr>
+        <w:pBdr>
+          <w:left w:val="single" w:sz="18" w:space="6" w:color="C0C0C0"/>
+          <w:bottom w:val="single" w:sz="4" w:space="3" w:color="D9D9D9"/>
+        </w:pBdr>
+        <w:shd w:val="clear" w:color="auto" w:fill="F4F4F4"/>
+      </w:pPr>
+      <w:r>
+        <w:rPr>
+          <w:rFonts w:ascii="Consolas" w:hAnsi="Consolas"/>
+          <w:sz w:val="18"/>
+          <w:szCs w:val="18"/>
+        </w:rPr>
+        <w:t xml:space="preserve">  -H "Content-Type: application/json" -d '{"email":"user@aa.com","password":"pwd2"}'</w:t>
+      </w:r>
+    </w:p>
+    <w:p>
+      <w:pPr>
+        <w:spacing w:after="70" w:line="272" w:lineRule="auto"/>
+      </w:pPr>
+      <w:r>
+        <w:rPr>
+          <w:b/>
+          <w:bCs/>
+        </w:rPr>
+        <w:t>출력 로그 (1줄)</w:t>
+      </w:r>
+    </w:p>
+    <w:p>
+      <w:pPr>
+        <w:pBdr>
+          <w:top w:val="single" w:sz="4" w:space="3" w:color="D9D9D9"/>
+          <w:left w:val="single" w:sz="18" w:space="6" w:color="C0C0C0"/>
+          <w:bottom w:val="single" w:sz="4" w:space="3" w:color="D9D9D9"/>
+        </w:pBdr>
+        <w:shd w:val="clear" w:color="auto" w:fill="F4F4F4"/>
+      </w:pPr>
+      <w:r>
+        <w:rPr>
+          <w:rFonts w:ascii="Consolas" w:hAnsi="Consolas"/>
+          <w:sz w:val="18"/>
+          <w:szCs w:val="18"/>
+        </w:rPr>
+        <w:t xml:space="preserve">[AUDIT] 로그인 성공 - user=us***@aa.com</w:t>
+      </w:r>
+    </w:p>
+    <w:p>
+      <w:pPr>
+        <w:spacing w:after="70" w:line="272" w:lineRule="auto"/>
+      </w:pPr>
+      <w:r>
+        <w:rPr>
+          <w:b/>
+          <w:bCs/>
+        </w:rPr>
+        <w:t>확인</w:t>
+      </w:r>
+    </w:p>
+    <w:p>
+      <w:pPr>
+        <w:pBdr>
+          <w:top w:val="single" w:sz="4" w:space="3" w:color="D9D9D9"/>
+          <w:left w:val="single" w:sz="18" w:space="6" w:color="C0C0C0"/>
+          <w:bottom w:val="single" w:sz="4" w:space="3" w:color="D9D9D9"/>
+        </w:pBdr>
+        <w:shd w:val="clear" w:color="auto" w:fill="F4F4F4"/>
+      </w:pPr>
+      <w:r>
+        <w:rPr>
+          <w:rFonts w:ascii="Consolas" w:hAnsi="Consolas"/>
+          <w:sz w:val="18"/>
+          <w:szCs w:val="18"/>
+        </w:rPr>
+        <w:t xml:space="preserve">grep "로그인 성공" logs/spring.log | tail -1</w:t>
+      </w:r>
+    </w:p>
+    <w:p>
+      <w:pPr>
+        <w:spacing w:after="70" w:line="272" w:lineRule="auto"/>
+      </w:pPr>
+      <w:r>
+        <w:rPr>
+          <w:b/>
+          <w:bCs/>
+          <w:color w:val="C00000"/>
+        </w:rPr>
+        <w:t>③ 접근 거부 (user가 admin 프로필) → HTTP 403</w:t>
+      </w:r>
+    </w:p>
+    <w:p>
+      <w:pPr>
+        <w:spacing w:after="70" w:line="272" w:lineRule="auto"/>
+      </w:pPr>
+      <w:r>
+        <w:rPr>
+          <w:b/>
+          <w:bCs/>
+        </w:rPr>
+        <w:t>요청 (</w:t>
+      </w:r>
+      <w:r>
+        <w:rPr>
+          <w:b/>
+          <w:bCs/>
+          <w:color w:val="FF0000"/>
+        </w:rPr>
+        <w:t>TOKEN</w:t>
+      </w:r>
+      <w:r>
+        <w:rPr>
+          <w:rFonts w:hint="eastAsia"/>
+          <w:b/>
+          <w:bCs/>
+          <w:color w:val="FF0000"/>
+        </w:rPr>
+        <w:t>변수의 값은</w:t>
+      </w:r>
+      <w:r>
+        <w:rPr>
+          <w:b/>
+          <w:bCs/>
+          <w:color w:val="FF0000"/>
+        </w:rPr>
+        <w:t xml:space="preserve"> 위 ②에서 받은 </w:t>
+      </w:r>
+      <w:r>
+        <w:rPr>
+          <w:rFonts w:hint="eastAsia"/>
+          <w:b/>
+          <w:bCs/>
+          <w:color w:val="FF0000"/>
+        </w:rPr>
+        <w:t xml:space="preserve">토큰 값을 </w:t>
+      </w:r>
+      <w:r>
+        <w:rPr>
+          <w:b/>
+          <w:bCs/>
+          <w:color w:val="FF0000"/>
+        </w:rPr>
+        <w:t>사용</w:t>
+      </w:r>
+      <w:r>
+        <w:rPr>
+          <w:rFonts w:hint="eastAsia"/>
+          <w:b/>
+          <w:bCs/>
+          <w:color w:val="FF0000"/>
+        </w:rPr>
+        <w:t>해야 합니다.</w:t>
+      </w:r>
+      <w:r>
+        <w:rPr>
+          <w:b/>
+          <w:bCs/>
+          <w:color w:val="FF0000"/>
+        </w:rPr>
         <w:t xml:space="preserve"> </w:t>
       </w:r>
       <w:r>
         <w:rPr>
+          <w:b/>
+          <w:bCs/>
+        </w:rPr>
+        <w:t>)</w:t>
+      </w:r>
+    </w:p>
+    <w:p>
+      <w:pPr>
+        <w:pBdr>
+          <w:top w:val="single" w:sz="4" w:space="3" w:color="D9D9D9"/>
+          <w:left w:val="single" w:sz="18" w:space="6" w:color="C0C0C0"/>
+        </w:pBdr>
+        <w:shd w:val="clear" w:color="auto" w:fill="F4F4F4"/>
+        <w:rPr>
           <w:rFonts w:ascii="Consolas" w:hAnsi="Consolas"/>
           <w:sz w:val="18"/>
           <w:szCs w:val="18"/>
         </w:rPr>
-        <w:t>실패</w:t>
-      </w:r>
+      </w:pPr>
       <w:r>
         <w:rPr>
           <w:rFonts w:ascii="Consolas" w:hAnsi="Consolas"/>
           <w:sz w:val="18"/>
           <w:szCs w:val="18"/>
         </w:rPr>
-        <w:t xml:space="preserve"> - user=us***@aa.com, reason=BadCredentialsException</w:t>
+        <w:t>TOKEN=eyJhbGciOiJIUz</w:t>
+      </w:r>
+    </w:p>
+    <w:p>
+      <w:pPr>
+        <w:pBdr>
+          <w:top w:val="single" w:sz="4" w:space="3" w:color="D9D9D9"/>
+          <w:left w:val="single" w:sz="18" w:space="6" w:color="C0C0C0"/>
+        </w:pBdr>
+        <w:shd w:val="clear" w:color="auto" w:fill="F4F4F4"/>
+      </w:pPr>
+      <w:r>
+        <w:rPr>
+          <w:rFonts w:ascii="Consolas" w:hAnsi="Consolas"/>
+          <w:sz w:val="18"/>
+          <w:szCs w:val="18"/>
+        </w:rPr>
+        <w:t>curl -s -o /dev/null -H "Authorization: Bearer $TOKEN" \</w:t>
       </w:r>
     </w:p>
     <w:p>
@@ -2068,732 +3143,67 @@
           <w:sz w:val="18"/>
           <w:szCs w:val="18"/>
         </w:rPr>
-        <w:t xml:space="preserve">[AUDIT] </w:t>
-      </w:r>
+        <w:t xml:space="preserve">  "http://localhost:8080/api/idor/profiles-safe/1"</w:t>
+      </w:r>
+    </w:p>
+    <w:p>
+      <w:pPr>
+        <w:spacing w:after="70" w:line="272" w:lineRule="auto"/>
+      </w:pPr>
+      <w:r>
+        <w:rPr>
+          <w:b/>
+          <w:bCs/>
+        </w:rPr>
+        <w:t>출력 로그 (1줄)</w:t>
+      </w:r>
+    </w:p>
+    <w:p>
+      <w:pPr>
+        <w:pBdr>
+          <w:top w:val="single" w:sz="4" w:space="3" w:color="D9D9D9"/>
+          <w:left w:val="single" w:sz="18" w:space="6" w:color="C0C0C0"/>
+          <w:bottom w:val="single" w:sz="4" w:space="3" w:color="D9D9D9"/>
+        </w:pBdr>
+        <w:shd w:val="clear" w:color="auto" w:fill="F4F4F4"/>
+      </w:pPr>
       <w:r>
         <w:rPr>
           <w:rFonts w:ascii="Consolas" w:hAnsi="Consolas"/>
           <w:sz w:val="18"/>
           <w:szCs w:val="18"/>
         </w:rPr>
-        <w:t>인증</w:t>
-      </w:r>
+        <w:t xml:space="preserve">[AUDIT] 접근 거부(403) - GET /api/idor/profiles-safe/1 from ...::1 : 본인 또는 관리자만 조회할 수 있습니다</w:t>
+      </w:r>
+    </w:p>
+    <w:p>
+      <w:pPr>
+        <w:spacing w:after="70" w:line="272" w:lineRule="auto"/>
+      </w:pPr>
+      <w:r>
+        <w:rPr>
+          <w:b/>
+          <w:bCs/>
+        </w:rPr>
+        <w:t>확인</w:t>
+      </w:r>
+    </w:p>
+    <w:p>
+      <w:pPr>
+        <w:pBdr>
+          <w:top w:val="single" w:sz="4" w:space="3" w:color="D9D9D9"/>
+          <w:left w:val="single" w:sz="18" w:space="6" w:color="C0C0C0"/>
+          <w:bottom w:val="single" w:sz="4" w:space="3" w:color="D9D9D9"/>
+        </w:pBdr>
+        <w:shd w:val="clear" w:color="auto" w:fill="F4F4F4"/>
+      </w:pPr>
       <w:r>
         <w:rPr>
           <w:rFonts w:ascii="Consolas" w:hAnsi="Consolas"/>
           <w:sz w:val="18"/>
           <w:szCs w:val="18"/>
         </w:rPr>
-        <w:t xml:space="preserve"> </w:t>
-      </w:r>
-      <w:r>
-        <w:rPr>
-          <w:rFonts w:ascii="Consolas" w:hAnsi="Consolas"/>
-          <w:sz w:val="18"/>
-          <w:szCs w:val="18"/>
-        </w:rPr>
-        <w:t>실패</w:t>
-      </w:r>
-      <w:r>
-        <w:rPr>
-          <w:rFonts w:ascii="Consolas" w:hAnsi="Consolas"/>
-          <w:sz w:val="18"/>
-          <w:szCs w:val="18"/>
-        </w:rPr>
-        <w:t xml:space="preserve">(401) - POST /api/userinfos/login from ...::1 : </w:t>
-      </w:r>
-      <w:r>
-        <w:rPr>
-          <w:rFonts w:ascii="Consolas" w:hAnsi="Consolas"/>
-          <w:sz w:val="18"/>
-          <w:szCs w:val="18"/>
-        </w:rPr>
-        <w:t>자격</w:t>
-      </w:r>
-      <w:r>
-        <w:rPr>
-          <w:rFonts w:ascii="Consolas" w:hAnsi="Consolas"/>
-          <w:sz w:val="18"/>
-          <w:szCs w:val="18"/>
-        </w:rPr>
-        <w:t xml:space="preserve"> </w:t>
-      </w:r>
-      <w:r>
-        <w:rPr>
-          <w:rFonts w:ascii="Consolas" w:hAnsi="Consolas"/>
-          <w:sz w:val="18"/>
-          <w:szCs w:val="18"/>
-        </w:rPr>
-        <w:t>증명에</w:t>
-      </w:r>
-      <w:r>
-        <w:rPr>
-          <w:rFonts w:ascii="Consolas" w:hAnsi="Consolas"/>
-          <w:sz w:val="18"/>
-          <w:szCs w:val="18"/>
-        </w:rPr>
-        <w:t xml:space="preserve"> </w:t>
-      </w:r>
-      <w:r>
-        <w:rPr>
-          <w:rFonts w:ascii="Consolas" w:hAnsi="Consolas"/>
-          <w:sz w:val="18"/>
-          <w:szCs w:val="18"/>
-        </w:rPr>
-        <w:t>실패하였습니다</w:t>
-      </w:r>
-      <w:r>
-        <w:rPr>
-          <w:rFonts w:ascii="Consolas" w:hAnsi="Consolas"/>
-          <w:sz w:val="18"/>
-          <w:szCs w:val="18"/>
-        </w:rPr>
-        <w:t>.</w:t>
-      </w:r>
-    </w:p>
-    <w:p>
-      <w:pPr>
-        <w:spacing w:after="70" w:line="272" w:lineRule="auto"/>
-      </w:pPr>
-      <w:r>
-        <w:rPr>
-          <w:b/>
-          <w:bCs/>
-        </w:rPr>
-        <w:t>확인</w:t>
-      </w:r>
-    </w:p>
-    <w:p>
-      <w:pPr>
-        <w:pBdr>
-          <w:top w:val="single" w:sz="4" w:space="3" w:color="D9D9D9"/>
-          <w:left w:val="single" w:sz="18" w:space="6" w:color="C0C0C0"/>
-          <w:bottom w:val="single" w:sz="4" w:space="3" w:color="D9D9D9"/>
-        </w:pBdr>
-        <w:shd w:val="clear" w:color="auto" w:fill="F4F4F4"/>
-      </w:pPr>
-      <w:r>
-        <w:rPr>
-          <w:rFonts w:ascii="Consolas" w:hAnsi="Consolas"/>
-          <w:sz w:val="18"/>
-          <w:szCs w:val="18"/>
-        </w:rPr>
-        <w:t>grep -E "</w:t>
-      </w:r>
-      <w:r>
-        <w:rPr>
-          <w:rFonts w:ascii="Consolas" w:hAnsi="Consolas"/>
-          <w:sz w:val="18"/>
-          <w:szCs w:val="18"/>
-        </w:rPr>
-        <w:t>로그인</w:t>
-      </w:r>
-      <w:r>
-        <w:rPr>
-          <w:rFonts w:ascii="Consolas" w:hAnsi="Consolas"/>
-          <w:sz w:val="18"/>
-          <w:szCs w:val="18"/>
-        </w:rPr>
-        <w:t xml:space="preserve"> </w:t>
-      </w:r>
-      <w:r>
-        <w:rPr>
-          <w:rFonts w:ascii="Consolas" w:hAnsi="Consolas"/>
-          <w:sz w:val="18"/>
-          <w:szCs w:val="18"/>
-        </w:rPr>
-        <w:t>실패</w:t>
-      </w:r>
-      <w:r>
-        <w:rPr>
-          <w:rFonts w:ascii="Consolas" w:hAnsi="Consolas"/>
-          <w:sz w:val="18"/>
-          <w:szCs w:val="18"/>
-        </w:rPr>
-        <w:t>|</w:t>
-      </w:r>
-      <w:r>
-        <w:rPr>
-          <w:rFonts w:ascii="Consolas" w:hAnsi="Consolas"/>
-          <w:sz w:val="18"/>
-          <w:szCs w:val="18"/>
-        </w:rPr>
-        <w:t>인증</w:t>
-      </w:r>
-      <w:r>
-        <w:rPr>
-          <w:rFonts w:ascii="Consolas" w:hAnsi="Consolas"/>
-          <w:sz w:val="18"/>
-          <w:szCs w:val="18"/>
-        </w:rPr>
-        <w:t xml:space="preserve"> </w:t>
-      </w:r>
-      <w:r>
-        <w:rPr>
-          <w:rFonts w:ascii="Consolas" w:hAnsi="Consolas"/>
-          <w:sz w:val="18"/>
-          <w:szCs w:val="18"/>
-        </w:rPr>
-        <w:t>실패</w:t>
-      </w:r>
-      <w:r>
-        <w:rPr>
-          <w:rFonts w:ascii="Consolas" w:hAnsi="Consolas"/>
-          <w:sz w:val="18"/>
-          <w:szCs w:val="18"/>
-        </w:rPr>
-        <w:t>" logs/spring.log | tail -2</w:t>
-      </w:r>
-    </w:p>
-    <w:p>
-      <w:pPr>
-        <w:spacing w:after="70" w:line="272" w:lineRule="auto"/>
-      </w:pPr>
-      <w:r>
-        <w:rPr>
-          <w:b/>
-          <w:bCs/>
-          <w:color w:val="2E7D32"/>
-        </w:rPr>
-        <w:t>② 로그인 성공 → HTTP 200 (토큰 발급)</w:t>
-      </w:r>
-    </w:p>
-    <w:p>
-      <w:pPr>
-        <w:spacing w:after="70" w:line="272" w:lineRule="auto"/>
-        <w:rPr>
-          <w:b/>
-          <w:bCs/>
-        </w:rPr>
-      </w:pPr>
-    </w:p>
-    <w:p>
-      <w:pPr>
-        <w:spacing w:after="70" w:line="272" w:lineRule="auto"/>
-      </w:pPr>
-      <w:r>
-        <w:rPr>
-          <w:b/>
-          <w:bCs/>
-        </w:rPr>
-        <w:t>요청</w:t>
-      </w:r>
-    </w:p>
-    <w:p>
-      <w:pPr>
-        <w:pBdr>
-          <w:top w:val="single" w:sz="4" w:space="3" w:color="D9D9D9"/>
-          <w:left w:val="single" w:sz="18" w:space="6" w:color="C0C0C0"/>
-        </w:pBdr>
-        <w:shd w:val="clear" w:color="auto" w:fill="F4F4F4"/>
-      </w:pPr>
-      <w:r>
-        <w:rPr>
-          <w:rFonts w:ascii="Consolas" w:hAnsi="Consolas"/>
-          <w:sz w:val="18"/>
-          <w:szCs w:val="18"/>
-        </w:rPr>
-        <w:t>curl -s -X POST "http://localhost:8080/api/userinfos/login" \</w:t>
-      </w:r>
-    </w:p>
-    <w:p>
-      <w:pPr>
-        <w:pBdr>
-          <w:left w:val="single" w:sz="18" w:space="6" w:color="C0C0C0"/>
-          <w:bottom w:val="single" w:sz="4" w:space="3" w:color="D9D9D9"/>
-        </w:pBdr>
-        <w:shd w:val="clear" w:color="auto" w:fill="F4F4F4"/>
-      </w:pPr>
-      <w:r>
-        <w:rPr>
-          <w:rFonts w:ascii="Consolas" w:hAnsi="Consolas"/>
-          <w:sz w:val="18"/>
-          <w:szCs w:val="18"/>
-        </w:rPr>
-        <w:t xml:space="preserve">  -H "Content-Type: application/json" -d '{"email":"user@aa.com","password":"pwd2"}'</w:t>
-      </w:r>
-    </w:p>
-    <w:p>
-      <w:pPr>
-        <w:spacing w:after="70" w:line="272" w:lineRule="auto"/>
-      </w:pPr>
-      <w:r>
-        <w:rPr>
-          <w:b/>
-          <w:bCs/>
-        </w:rPr>
-        <w:t>출력 로그 (1줄)</w:t>
-      </w:r>
-    </w:p>
-    <w:p>
-      <w:pPr>
-        <w:pBdr>
-          <w:top w:val="single" w:sz="4" w:space="3" w:color="D9D9D9"/>
-          <w:left w:val="single" w:sz="18" w:space="6" w:color="C0C0C0"/>
-          <w:bottom w:val="single" w:sz="4" w:space="3" w:color="D9D9D9"/>
-        </w:pBdr>
-        <w:shd w:val="clear" w:color="auto" w:fill="F4F4F4"/>
-      </w:pPr>
-      <w:r>
-        <w:rPr>
-          <w:rFonts w:ascii="Consolas" w:hAnsi="Consolas"/>
-          <w:sz w:val="18"/>
-          <w:szCs w:val="18"/>
-        </w:rPr>
-        <w:t xml:space="preserve">[AUDIT] </w:t>
-      </w:r>
-      <w:r>
-        <w:rPr>
-          <w:rFonts w:ascii="Consolas" w:hAnsi="Consolas"/>
-          <w:sz w:val="18"/>
-          <w:szCs w:val="18"/>
-        </w:rPr>
-        <w:t>로그인</w:t>
-      </w:r>
-      <w:r>
-        <w:rPr>
-          <w:rFonts w:ascii="Consolas" w:hAnsi="Consolas"/>
-          <w:sz w:val="18"/>
-          <w:szCs w:val="18"/>
-        </w:rPr>
-        <w:t xml:space="preserve"> </w:t>
-      </w:r>
-      <w:r>
-        <w:rPr>
-          <w:rFonts w:ascii="Consolas" w:hAnsi="Consolas"/>
-          <w:sz w:val="18"/>
-          <w:szCs w:val="18"/>
-        </w:rPr>
-        <w:t>성공</w:t>
-      </w:r>
-      <w:r>
-        <w:rPr>
-          <w:rFonts w:ascii="Consolas" w:hAnsi="Consolas"/>
-          <w:sz w:val="18"/>
-          <w:szCs w:val="18"/>
-        </w:rPr>
-        <w:t xml:space="preserve"> - user=us***@aa.com</w:t>
-      </w:r>
-    </w:p>
-    <w:p>
-      <w:pPr>
-        <w:spacing w:after="70" w:line="272" w:lineRule="auto"/>
-      </w:pPr>
-      <w:r>
-        <w:rPr>
-          <w:b/>
-          <w:bCs/>
-        </w:rPr>
-        <w:t>확인</w:t>
-      </w:r>
-    </w:p>
-    <w:p>
-      <w:pPr>
-        <w:pBdr>
-          <w:top w:val="single" w:sz="4" w:space="3" w:color="D9D9D9"/>
-          <w:left w:val="single" w:sz="18" w:space="6" w:color="C0C0C0"/>
-          <w:bottom w:val="single" w:sz="4" w:space="3" w:color="D9D9D9"/>
-        </w:pBdr>
-        <w:shd w:val="clear" w:color="auto" w:fill="F4F4F4"/>
-      </w:pPr>
-      <w:r>
-        <w:rPr>
-          <w:rFonts w:ascii="Consolas" w:hAnsi="Consolas"/>
-          <w:sz w:val="18"/>
-          <w:szCs w:val="18"/>
-        </w:rPr>
-        <w:t>grep "</w:t>
-      </w:r>
-      <w:r>
-        <w:rPr>
-          <w:rFonts w:ascii="Consolas" w:hAnsi="Consolas"/>
-          <w:sz w:val="18"/>
-          <w:szCs w:val="18"/>
-        </w:rPr>
-        <w:t>로그인</w:t>
-      </w:r>
-      <w:r>
-        <w:rPr>
-          <w:rFonts w:ascii="Consolas" w:hAnsi="Consolas"/>
-          <w:sz w:val="18"/>
-          <w:szCs w:val="18"/>
-        </w:rPr>
-        <w:t xml:space="preserve"> </w:t>
-      </w:r>
-      <w:r>
-        <w:rPr>
-          <w:rFonts w:ascii="Consolas" w:hAnsi="Consolas"/>
-          <w:sz w:val="18"/>
-          <w:szCs w:val="18"/>
-        </w:rPr>
-        <w:t>성공</w:t>
-      </w:r>
-      <w:r>
-        <w:rPr>
-          <w:rFonts w:ascii="Consolas" w:hAnsi="Consolas"/>
-          <w:sz w:val="18"/>
-          <w:szCs w:val="18"/>
-        </w:rPr>
-        <w:t>" logs/spring.log | tail -1</w:t>
-      </w:r>
-    </w:p>
-    <w:p>
-      <w:pPr>
-        <w:spacing w:after="70" w:line="272" w:lineRule="auto"/>
-      </w:pPr>
-      <w:r>
-        <w:rPr>
-          <w:b/>
-          <w:bCs/>
-          <w:color w:val="C00000"/>
-        </w:rPr>
-        <w:t>③ 접근 거부 (user가 admin 프로필) → HTTP 403</w:t>
-      </w:r>
-    </w:p>
-    <w:p>
-      <w:pPr>
-        <w:spacing w:after="70" w:line="272" w:lineRule="auto"/>
-      </w:pPr>
-      <w:r>
-        <w:rPr>
-          <w:b/>
-          <w:bCs/>
-        </w:rPr>
-        <w:t>요청 (</w:t>
-      </w:r>
-      <w:r>
-        <w:rPr>
-          <w:b/>
-          <w:bCs/>
-          <w:color w:val="FF0000"/>
-        </w:rPr>
-        <w:t>TOKEN</w:t>
-      </w:r>
-      <w:r>
-        <w:rPr>
-          <w:rFonts w:hint="eastAsia"/>
-          <w:b/>
-          <w:bCs/>
-          <w:color w:val="FF0000"/>
-        </w:rPr>
-        <w:t>변수의 값은</w:t>
-      </w:r>
-      <w:r>
-        <w:rPr>
-          <w:b/>
-          <w:bCs/>
-          <w:color w:val="FF0000"/>
-        </w:rPr>
-        <w:t xml:space="preserve"> 위 ②에서 받은 </w:t>
-      </w:r>
-      <w:r>
-        <w:rPr>
-          <w:rFonts w:hint="eastAsia"/>
-          <w:b/>
-          <w:bCs/>
-          <w:color w:val="FF0000"/>
-        </w:rPr>
-        <w:t xml:space="preserve">토큰 값을 </w:t>
-      </w:r>
-      <w:r>
-        <w:rPr>
-          <w:b/>
-          <w:bCs/>
-          <w:color w:val="FF0000"/>
-        </w:rPr>
-        <w:t>사용</w:t>
-      </w:r>
-      <w:r>
-        <w:rPr>
-          <w:rFonts w:hint="eastAsia"/>
-          <w:b/>
-          <w:bCs/>
-          <w:color w:val="FF0000"/>
-        </w:rPr>
-        <w:t>해야 합니다.</w:t>
-      </w:r>
-      <w:r>
-        <w:rPr>
-          <w:b/>
-          <w:bCs/>
-          <w:color w:val="FF0000"/>
-        </w:rPr>
-        <w:t xml:space="preserve"> </w:t>
-      </w:r>
-      <w:r>
-        <w:rPr>
-          <w:b/>
-          <w:bCs/>
-        </w:rPr>
-        <w:t>)</w:t>
-      </w:r>
-    </w:p>
-    <w:p>
-      <w:pPr>
-        <w:pBdr>
-          <w:top w:val="single" w:sz="4" w:space="3" w:color="D9D9D9"/>
-          <w:left w:val="single" w:sz="18" w:space="6" w:color="C0C0C0"/>
-        </w:pBdr>
-        <w:shd w:val="clear" w:color="auto" w:fill="F4F4F4"/>
-        <w:rPr>
-          <w:rFonts w:ascii="Consolas" w:hAnsi="Consolas"/>
-          <w:sz w:val="18"/>
-          <w:szCs w:val="18"/>
-        </w:rPr>
-      </w:pPr>
-      <w:r>
-        <w:rPr>
-          <w:rFonts w:ascii="Consolas" w:hAnsi="Consolas"/>
-          <w:sz w:val="18"/>
-          <w:szCs w:val="18"/>
-        </w:rPr>
-        <w:t>TOKEN=eyJhbGciOiJIUz</w:t>
-      </w:r>
-    </w:p>
-    <w:p>
-      <w:pPr>
-        <w:pBdr>
-          <w:top w:val="single" w:sz="4" w:space="3" w:color="D9D9D9"/>
-          <w:left w:val="single" w:sz="18" w:space="6" w:color="C0C0C0"/>
-        </w:pBdr>
-        <w:shd w:val="clear" w:color="auto" w:fill="F4F4F4"/>
-      </w:pPr>
-      <w:r>
-        <w:rPr>
-          <w:rFonts w:ascii="Consolas" w:hAnsi="Consolas"/>
-          <w:sz w:val="18"/>
-          <w:szCs w:val="18"/>
-        </w:rPr>
-        <w:t>curl -s -o /dev/null -H "Authorization: Bearer $TOKEN" \</w:t>
-      </w:r>
-    </w:p>
-    <w:p>
-      <w:pPr>
-        <w:pBdr>
-          <w:left w:val="single" w:sz="18" w:space="6" w:color="C0C0C0"/>
-          <w:bottom w:val="single" w:sz="4" w:space="3" w:color="D9D9D9"/>
-        </w:pBdr>
-        <w:shd w:val="clear" w:color="auto" w:fill="F4F4F4"/>
-      </w:pPr>
-      <w:r>
-        <w:rPr>
-          <w:rFonts w:ascii="Consolas" w:hAnsi="Consolas"/>
-          <w:sz w:val="18"/>
-          <w:szCs w:val="18"/>
-        </w:rPr>
-        <w:t xml:space="preserve">  "http://localhost:8080/api/idor/profiles-safe/1"</w:t>
-      </w:r>
-    </w:p>
-    <w:p>
-      <w:pPr>
-        <w:spacing w:after="70" w:line="272" w:lineRule="auto"/>
-      </w:pPr>
-      <w:r>
-        <w:rPr>
-          <w:b/>
-          <w:bCs/>
-        </w:rPr>
-        <w:t>출력 로그 (1줄)</w:t>
-      </w:r>
-    </w:p>
-    <w:p>
-      <w:pPr>
-        <w:pBdr>
-          <w:top w:val="single" w:sz="4" w:space="3" w:color="D9D9D9"/>
-          <w:left w:val="single" w:sz="18" w:space="6" w:color="C0C0C0"/>
-          <w:bottom w:val="single" w:sz="4" w:space="3" w:color="D9D9D9"/>
-        </w:pBdr>
-        <w:shd w:val="clear" w:color="auto" w:fill="F4F4F4"/>
-      </w:pPr>
-      <w:r>
-        <w:rPr>
-          <w:rFonts w:ascii="Consolas" w:hAnsi="Consolas"/>
-          <w:sz w:val="18"/>
-          <w:szCs w:val="18"/>
-        </w:rPr>
-        <w:t xml:space="preserve">[AUDIT] </w:t>
-      </w:r>
-      <w:r>
-        <w:rPr>
-          <w:rFonts w:ascii="Consolas" w:hAnsi="Consolas"/>
-          <w:sz w:val="18"/>
-          <w:szCs w:val="18"/>
-        </w:rPr>
-        <w:t>접근</w:t>
-      </w:r>
-      <w:r>
-        <w:rPr>
-          <w:rFonts w:ascii="Consolas" w:hAnsi="Consolas"/>
-          <w:sz w:val="18"/>
-          <w:szCs w:val="18"/>
-        </w:rPr>
-        <w:t xml:space="preserve"> </w:t>
-      </w:r>
-      <w:r>
-        <w:rPr>
-          <w:rFonts w:ascii="Consolas" w:hAnsi="Consolas"/>
-          <w:sz w:val="18"/>
-          <w:szCs w:val="18"/>
-        </w:rPr>
-        <w:t>거부</w:t>
-      </w:r>
-      <w:r>
-        <w:rPr>
-          <w:rFonts w:ascii="Consolas" w:hAnsi="Consolas"/>
-          <w:sz w:val="18"/>
-          <w:szCs w:val="18"/>
-        </w:rPr>
-        <w:t xml:space="preserve">(403) - GET /api/idor/profiles-safe/1 from ...::1 : </w:t>
-      </w:r>
-      <w:r>
-        <w:rPr>
-          <w:rFonts w:ascii="Consolas" w:hAnsi="Consolas"/>
-          <w:sz w:val="18"/>
-          <w:szCs w:val="18"/>
-        </w:rPr>
-        <w:t>본인</w:t>
-      </w:r>
-      <w:r>
-        <w:rPr>
-          <w:rFonts w:ascii="Consolas" w:hAnsi="Consolas"/>
-          <w:sz w:val="18"/>
-          <w:szCs w:val="18"/>
-        </w:rPr>
-        <w:t xml:space="preserve"> </w:t>
-      </w:r>
-      <w:r>
-        <w:rPr>
-          <w:rFonts w:ascii="Consolas" w:hAnsi="Consolas"/>
-          <w:sz w:val="18"/>
-          <w:szCs w:val="18"/>
-        </w:rPr>
-        <w:t>또는</w:t>
-      </w:r>
-      <w:r>
-        <w:rPr>
-          <w:rFonts w:ascii="Consolas" w:hAnsi="Consolas"/>
-          <w:sz w:val="18"/>
-          <w:szCs w:val="18"/>
-        </w:rPr>
-        <w:t xml:space="preserve"> </w:t>
-      </w:r>
-      <w:r>
-        <w:rPr>
-          <w:rFonts w:ascii="Consolas" w:hAnsi="Consolas"/>
-          <w:sz w:val="18"/>
-          <w:szCs w:val="18"/>
-        </w:rPr>
-        <w:t>관리자만</w:t>
-      </w:r>
-      <w:r>
-        <w:rPr>
-          <w:rFonts w:ascii="Consolas" w:hAnsi="Consolas"/>
-          <w:sz w:val="18"/>
-          <w:szCs w:val="18"/>
-        </w:rPr>
-        <w:t xml:space="preserve"> </w:t>
-      </w:r>
-      <w:r>
-        <w:rPr>
-          <w:rFonts w:ascii="Consolas" w:hAnsi="Consolas"/>
-          <w:sz w:val="18"/>
-          <w:szCs w:val="18"/>
-        </w:rPr>
-        <w:t>조회할</w:t>
-      </w:r>
-      <w:r>
-        <w:rPr>
-          <w:rFonts w:ascii="Consolas" w:hAnsi="Consolas"/>
-          <w:sz w:val="18"/>
-          <w:szCs w:val="18"/>
-        </w:rPr>
-        <w:t xml:space="preserve"> </w:t>
-      </w:r>
-      <w:r>
-        <w:rPr>
-          <w:rFonts w:ascii="Consolas" w:hAnsi="Consolas"/>
-          <w:sz w:val="18"/>
-          <w:szCs w:val="18"/>
-        </w:rPr>
-        <w:t>수</w:t>
-      </w:r>
-      <w:r>
-        <w:rPr>
-          <w:rFonts w:ascii="Consolas" w:hAnsi="Consolas"/>
-          <w:sz w:val="18"/>
-          <w:szCs w:val="18"/>
-        </w:rPr>
-        <w:t xml:space="preserve"> </w:t>
-      </w:r>
-      <w:r>
-        <w:rPr>
-          <w:rFonts w:ascii="Consolas" w:hAnsi="Consolas"/>
-          <w:sz w:val="18"/>
-          <w:szCs w:val="18"/>
-        </w:rPr>
-        <w:t>있습니다</w:t>
-      </w:r>
-    </w:p>
-    <w:p>
-      <w:pPr>
-        <w:spacing w:after="70" w:line="272" w:lineRule="auto"/>
-      </w:pPr>
-      <w:r>
-        <w:rPr>
-          <w:b/>
-          <w:bCs/>
-        </w:rPr>
-        <w:t>확인</w:t>
-      </w:r>
-    </w:p>
-    <w:p>
-      <w:pPr>
-        <w:pBdr>
-          <w:top w:val="single" w:sz="4" w:space="3" w:color="D9D9D9"/>
-          <w:left w:val="single" w:sz="18" w:space="6" w:color="C0C0C0"/>
-          <w:bottom w:val="single" w:sz="4" w:space="3" w:color="D9D9D9"/>
-        </w:pBdr>
-        <w:shd w:val="clear" w:color="auto" w:fill="F4F4F4"/>
-      </w:pPr>
-      <w:r>
-        <w:rPr>
-          <w:rFonts w:ascii="Consolas" w:hAnsi="Consolas"/>
-          <w:sz w:val="18"/>
-          <w:szCs w:val="18"/>
-        </w:rPr>
-        <w:t>grep "</w:t>
-      </w:r>
-      <w:r>
-        <w:rPr>
-          <w:rFonts w:ascii="Consolas" w:hAnsi="Consolas"/>
-          <w:sz w:val="18"/>
-          <w:szCs w:val="18"/>
-        </w:rPr>
-        <w:t>접근</w:t>
-      </w:r>
-      <w:r>
-        <w:rPr>
-          <w:rFonts w:ascii="Consolas" w:hAnsi="Consolas"/>
-          <w:sz w:val="18"/>
-          <w:szCs w:val="18"/>
-        </w:rPr>
-        <w:t xml:space="preserve"> </w:t>
-      </w:r>
-      <w:r>
-        <w:rPr>
-          <w:rFonts w:ascii="Consolas" w:hAnsi="Consolas"/>
-          <w:sz w:val="18"/>
-          <w:szCs w:val="18"/>
-        </w:rPr>
-        <w:t>거부</w:t>
-      </w:r>
-      <w:r>
-        <w:rPr>
-          <w:rFonts w:ascii="Consolas" w:hAnsi="Consolas"/>
-          <w:sz w:val="18"/>
-          <w:szCs w:val="18"/>
-        </w:rPr>
-        <w:t>" logs/spring.log | tail -1</w:t>
+        <w:t xml:space="preserve">grep "접근 거부" logs/spring.log | tail -1</w:t>
       </w:r>
     </w:p>
     <w:p>
@@ -2861,55 +3271,7 @@
           <w:bCs/>
           <w:color w:val="1F3864"/>
         </w:rPr>
-        <w:t xml:space="preserve">7. </w:t>
-      </w:r>
-      <w:r>
-        <w:rPr>
-          <w:b/>
-          <w:bCs/>
-          <w:color w:val="1F3864"/>
-        </w:rPr>
-        <w:t>예외</w:t>
-      </w:r>
-      <w:r>
-        <w:rPr>
-          <w:b/>
-          <w:bCs/>
-          <w:color w:val="1F3864"/>
-        </w:rPr>
-        <w:t xml:space="preserve"> </w:t>
-      </w:r>
-      <w:r>
-        <w:rPr>
-          <w:b/>
-          <w:bCs/>
-          <w:color w:val="1F3864"/>
-        </w:rPr>
-        <w:t>처리</w:t>
-      </w:r>
-      <w:r>
-        <w:rPr>
-          <w:b/>
-          <w:bCs/>
-          <w:color w:val="1F3864"/>
-        </w:rPr>
-        <w:t xml:space="preserve"> </w:t>
-      </w:r>
-      <w:r>
-        <w:rPr>
-          <w:b/>
-          <w:bCs/>
-          <w:color w:val="1F3864"/>
-        </w:rPr>
-        <w:t>하드닝</w:t>
-      </w:r>
-      <w:r>
-        <w:rPr>
-          <w:b/>
-          <w:bCs/>
-          <w:color w:val="1F3864"/>
-        </w:rPr>
-        <w:t xml:space="preserve"> (OWASP #10)</w:t>
+        <w:t xml:space="preserve">7. 예외 처리 하드닝 (OWASP #10)</w:t>
       </w:r>
     </w:p>
     <w:p>
@@ -2917,198 +3279,17 @@
         <w:spacing w:after="80" w:line="272" w:lineRule="auto"/>
       </w:pPr>
       <w:r>
-        <w:t>#9(</w:t>
-      </w:r>
-      <w:r>
-        <w:t>로깅</w:t>
-      </w:r>
-      <w:r>
-        <w:t>)</w:t>
-      </w:r>
-      <w:r>
-        <w:t>과</w:t>
-      </w:r>
-      <w:r>
-        <w:t xml:space="preserve"> </w:t>
-      </w:r>
-      <w:r>
-        <w:t>짝을</w:t>
-      </w:r>
-      <w:r>
-        <w:t xml:space="preserve"> </w:t>
-      </w:r>
-      <w:r>
-        <w:t>이루는</w:t>
-      </w:r>
-      <w:r>
-        <w:t xml:space="preserve"> #10(</w:t>
-      </w:r>
-      <w:r>
-        <w:t>예외</w:t>
-      </w:r>
-      <w:r>
-        <w:t xml:space="preserve"> </w:t>
-      </w:r>
-      <w:r>
-        <w:t>상황</w:t>
-      </w:r>
-      <w:r>
-        <w:t xml:space="preserve"> </w:t>
-      </w:r>
-      <w:r>
-        <w:t>처리</w:t>
-      </w:r>
-      <w:r>
-        <w:t xml:space="preserve"> </w:t>
-      </w:r>
-      <w:r>
-        <w:t>미흡</w:t>
-      </w:r>
-      <w:r>
-        <w:t xml:space="preserve">) </w:t>
-      </w:r>
-      <w:r>
-        <w:t>대응이다</w:t>
-      </w:r>
-      <w:r>
-        <w:t xml:space="preserve">. </w:t>
-      </w:r>
-      <w:r>
-        <w:t>예외</w:t>
-      </w:r>
-      <w:r>
-        <w:t xml:space="preserve"> </w:t>
-      </w:r>
-      <w:r>
-        <w:t>발생</w:t>
-      </w:r>
-      <w:r>
-        <w:t xml:space="preserve"> </w:t>
-      </w:r>
-      <w:r>
-        <w:t>시</w:t>
-      </w:r>
-      <w:r>
-        <w:t xml:space="preserve"> </w:t>
-      </w:r>
-      <w:r>
-        <w:t>내부</w:t>
-      </w:r>
-      <w:r>
-        <w:t xml:space="preserve"> </w:t>
-      </w:r>
-      <w:r>
-        <w:t>정보를</w:t>
-      </w:r>
-      <w:r>
-        <w:t xml:space="preserve"> </w:t>
-      </w:r>
-      <w:r>
-        <w:t>외부에</w:t>
-      </w:r>
-      <w:r>
-        <w:t xml:space="preserve"> </w:t>
-      </w:r>
-      <w:r>
-        <w:t>노출하지</w:t>
-      </w:r>
-      <w:r>
-        <w:t xml:space="preserve"> </w:t>
-      </w:r>
-      <w:r>
-        <w:t>않고</w:t>
-      </w:r>
-      <w:r>
-        <w:t xml:space="preserve">(fail-closed), </w:t>
-      </w:r>
-      <w:r>
-        <w:rPr>
-          <w:b/>
-          <w:bCs/>
-        </w:rPr>
-        <w:t>외부엔</w:t>
-      </w:r>
-      <w:r>
-        <w:rPr>
-          <w:b/>
-          <w:bCs/>
-        </w:rPr>
-        <w:t xml:space="preserve"> </w:t>
-      </w:r>
-      <w:r>
-        <w:rPr>
-          <w:b/>
-          <w:bCs/>
-        </w:rPr>
-        <w:t>일반</w:t>
-      </w:r>
-      <w:r>
-        <w:rPr>
-          <w:b/>
-          <w:bCs/>
-        </w:rPr>
-        <w:t xml:space="preserve"> </w:t>
-      </w:r>
-      <w:r>
-        <w:rPr>
-          <w:b/>
-          <w:bCs/>
-        </w:rPr>
-        <w:t>메시지</w:t>
-      </w:r>
-      <w:r>
-        <w:rPr>
-          <w:b/>
-          <w:bCs/>
-        </w:rPr>
-        <w:t xml:space="preserve">+traceId, </w:t>
-      </w:r>
-      <w:r>
-        <w:rPr>
-          <w:b/>
-          <w:bCs/>
-        </w:rPr>
-        <w:t>내부</w:t>
-      </w:r>
-      <w:r>
-        <w:rPr>
-          <w:b/>
-          <w:bCs/>
-        </w:rPr>
-        <w:t xml:space="preserve"> </w:t>
-      </w:r>
-      <w:r>
-        <w:rPr>
-          <w:b/>
-          <w:bCs/>
-        </w:rPr>
-        <w:t>로그엔</w:t>
-      </w:r>
-      <w:r>
-        <w:rPr>
-          <w:b/>
-          <w:bCs/>
-        </w:rPr>
-        <w:t xml:space="preserve"> </w:t>
-      </w:r>
-      <w:r>
-        <w:rPr>
-          <w:b/>
-          <w:bCs/>
-        </w:rPr>
-        <w:t>상세</w:t>
-      </w:r>
-      <w:r>
-        <w:t>를</w:t>
-      </w:r>
-      <w:r>
-        <w:t xml:space="preserve"> </w:t>
-      </w:r>
-      <w:r>
-        <w:t>남긴다</w:t>
-      </w:r>
-      <w:r>
-        <w:t>.</w:t>
+        <w:t xml:space="preserve">#9(로깅)과 짝을 이루는 #10(예외 상황 처리 미흡) 대응이다. 예외 발생 시 내부 정보를 외부에 노출하지 않고(fail-closed), </w:t>
+      </w:r>
+      <w:r>
+        <w:rPr>
+          <w:b/>
+          <w:bCs/>
+        </w:rPr>
+        <w:t xml:space="preserve">외부엔 일반 메시지+traceId, 내부 로그엔 상세</w:t>
+      </w:r>
+      <w:r>
+        <w:t xml:space="preserve">를 남긴다.</w:t>
       </w:r>
     </w:p>
     <w:p>
@@ -3122,31 +3303,7 @@
           <w:bCs/>
           <w:color w:val="2E5496"/>
         </w:rPr>
-        <w:t xml:space="preserve">7-1. </w:t>
-      </w:r>
-      <w:r>
-        <w:rPr>
-          <w:b/>
-          <w:bCs/>
-          <w:color w:val="2E5496"/>
-        </w:rPr>
-        <w:t>무엇을</w:t>
-      </w:r>
-      <w:r>
-        <w:rPr>
-          <w:b/>
-          <w:bCs/>
-          <w:color w:val="2E5496"/>
-        </w:rPr>
-        <w:t xml:space="preserve"> </w:t>
-      </w:r>
-      <w:r>
-        <w:rPr>
-          <w:b/>
-          <w:bCs/>
-          <w:color w:val="2E5496"/>
-        </w:rPr>
-        <w:t>바꿔나</w:t>
+        <w:t xml:space="preserve">7-1. 무엇을 바꿔나</w:t>
       </w:r>
     </w:p>
     <w:p>
@@ -3161,25 +3318,7 @@
         <w:t xml:space="preserve">• </w:t>
       </w:r>
       <w:r>
-        <w:t xml:space="preserve">500(RuntimeException) → </w:t>
-      </w:r>
-      <w:r>
-        <w:t>일반</w:t>
-      </w:r>
-      <w:r>
-        <w:t xml:space="preserve"> </w:t>
-      </w:r>
-      <w:r>
-        <w:t>메시지</w:t>
-      </w:r>
-      <w:r>
-        <w:t xml:space="preserve">+traceId (e.getMessage() </w:t>
-      </w:r>
-      <w:r>
-        <w:t>숨김</w:t>
-      </w:r>
-      <w:r>
-        <w:t>)</w:t>
+        <w:t xml:space="preserve">500(RuntimeException) → 일반 메시지+traceId (e.getMessage() 숨김)</w:t>
       </w:r>
     </w:p>
     <w:p>
@@ -3194,25 +3333,7 @@
         <w:t xml:space="preserve">• </w:t>
       </w:r>
       <w:r>
-        <w:t xml:space="preserve">catch-all @ExceptionHandler(Exception.class) → </w:t>
-      </w:r>
-      <w:r>
-        <w:t>안</w:t>
-      </w:r>
-      <w:r>
-        <w:t xml:space="preserve"> </w:t>
-      </w:r>
-      <w:r>
-        <w:t>잡힌</w:t>
-      </w:r>
-      <w:r>
-        <w:t xml:space="preserve"> </w:t>
-      </w:r>
-      <w:r>
-        <w:t>예외도</w:t>
-      </w:r>
-      <w:r>
-        <w:t xml:space="preserve"> fail-closed 500</w:t>
+        <w:t xml:space="preserve">catch-all @ExceptionHandler(Exception.class) → 안 잡힌 예외도 fail-closed 500</w:t>
       </w:r>
     </w:p>
     <w:p>
@@ -3228,49 +3349,7 @@
         <w:t xml:space="preserve">• </w:t>
       </w:r>
       <w:r>
-        <w:t xml:space="preserve">400 </w:t>
-      </w:r>
-      <w:r>
-        <w:t>본문</w:t>
-      </w:r>
-      <w:r>
-        <w:t xml:space="preserve"> </w:t>
-      </w:r>
-      <w:r>
-        <w:t>파싱</w:t>
-      </w:r>
-      <w:r>
-        <w:t xml:space="preserve"> </w:t>
-      </w:r>
-      <w:r>
-        <w:t>오류도</w:t>
-      </w:r>
-      <w:r>
-        <w:t xml:space="preserve"> </w:t>
-      </w:r>
-      <w:r>
-        <w:t>일반화</w:t>
-      </w:r>
-      <w:r>
-        <w:t>(</w:t>
-      </w:r>
-      <w:r>
-        <w:t>파서</w:t>
-      </w:r>
-      <w:r>
-        <w:t xml:space="preserve"> </w:t>
-      </w:r>
-      <w:r>
-        <w:t>상세</w:t>
-      </w:r>
-      <w:r>
-        <w:t xml:space="preserve"> </w:t>
-      </w:r>
-      <w:r>
-        <w:t>숨김</w:t>
-      </w:r>
-      <w:r>
-        <w:t>)</w:t>
+        <w:t xml:space="preserve">400 본문 파싱 오류도 일반화(파서 상세 숨김)</w:t>
       </w:r>
     </w:p>
     <w:p>
@@ -3285,37 +3364,7 @@
         <w:t xml:space="preserve">• </w:t>
       </w:r>
       <w:r>
-        <w:t>server.error.include-*=never (</w:t>
-      </w:r>
-      <w:r>
-        <w:t>층</w:t>
-      </w:r>
-      <w:r>
-        <w:t xml:space="preserve">1 </w:t>
-      </w:r>
-      <w:r>
-        <w:t>기본</w:t>
-      </w:r>
-      <w:r>
-        <w:t xml:space="preserve"> </w:t>
-      </w:r>
-      <w:r>
-        <w:t>오류</w:t>
-      </w:r>
-      <w:r>
-        <w:t xml:space="preserve"> </w:t>
-      </w:r>
-      <w:r>
-        <w:t>처리기</w:t>
-      </w:r>
-      <w:r>
-        <w:t xml:space="preserve"> </w:t>
-      </w:r>
-      <w:r>
-        <w:t>명시</w:t>
-      </w:r>
-      <w:r>
-        <w:t>)</w:t>
+        <w:t xml:space="preserve">server.error.include-*=never (층1 기본 오류 처리기 명시)</w:t>
       </w:r>
     </w:p>
     <w:p>
@@ -3348,15 +3397,23 @@
           <w:sz w:val="18"/>
           <w:szCs w:val="18"/>
         </w:rPr>
-        <w:t xml:space="preserve">    String t</w:t>
-      </w:r>
+        <w:t xml:space="preserve">    String traceId = newTraceId();</w:t>
+      </w:r>
+    </w:p>
+    <w:p>
+      <w:pPr>
+        <w:pBdr>
+          <w:left w:val="single" w:sz="18" w:space="6" w:color="C0C0C0"/>
+        </w:pBdr>
+        <w:shd w:val="clear" w:color="auto" w:fill="F4F4F4"/>
+      </w:pPr>
       <w:r>
         <w:rPr>
           <w:rFonts w:ascii="Consolas" w:hAnsi="Consolas"/>
           <w:sz w:val="18"/>
           <w:szCs w:val="18"/>
         </w:rPr>
-        <w:t>raceId = newTraceId();</w:t>
+        <w:t xml:space="preserve">    // 내부 로그: 상세 + traceId</w:t>
       </w:r>
     </w:p>
     <w:p>
@@ -3372,287 +3429,39 @@
           <w:sz w:val="18"/>
           <w:szCs w:val="18"/>
         </w:rPr>
-        <w:t xml:space="preserve">    // </w:t>
-      </w:r>
+        <w:t xml:space="preserve">    log.error("[ERROR][{}] {} {} : {}", traceId, request.getMethod(), request.getRequestURI(), e.getMessage(), e);</w:t>
+      </w:r>
+    </w:p>
+    <w:p>
+      <w:pPr>
+        <w:pBdr>
+          <w:left w:val="single" w:sz="18" w:space="6" w:color="C0C0C0"/>
+        </w:pBdr>
+        <w:shd w:val="clear" w:color="auto" w:fill="F4F4F4"/>
+      </w:pPr>
       <w:r>
         <w:rPr>
           <w:rFonts w:ascii="Consolas" w:hAnsi="Consolas"/>
           <w:sz w:val="18"/>
           <w:szCs w:val="18"/>
         </w:rPr>
-        <w:t>내부</w:t>
-      </w:r>
+        <w:t xml:space="preserve">    // 외부 응답: 일반 메시지 + traceId (내부 메시지 숨김)</w:t>
+      </w:r>
+    </w:p>
+    <w:p>
+      <w:pPr>
+        <w:pBdr>
+          <w:left w:val="single" w:sz="18" w:space="6" w:color="C0C0C0"/>
+        </w:pBdr>
+        <w:shd w:val="clear" w:color="auto" w:fill="F4F4F4"/>
+      </w:pPr>
       <w:r>
         <w:rPr>
           <w:rFonts w:ascii="Consolas" w:hAnsi="Consolas"/>
           <w:sz w:val="18"/>
           <w:szCs w:val="18"/>
         </w:rPr>
-        <w:t xml:space="preserve"> </w:t>
-      </w:r>
-      <w:r>
-        <w:rPr>
-          <w:rFonts w:ascii="Consolas" w:hAnsi="Consolas"/>
-          <w:sz w:val="18"/>
-          <w:szCs w:val="18"/>
-        </w:rPr>
-        <w:t>로그</w:t>
-      </w:r>
-      <w:r>
-        <w:rPr>
-          <w:rFonts w:ascii="Consolas" w:hAnsi="Consolas"/>
-          <w:sz w:val="18"/>
-          <w:szCs w:val="18"/>
-        </w:rPr>
-        <w:t xml:space="preserve">: </w:t>
-      </w:r>
-      <w:r>
-        <w:rPr>
-          <w:rFonts w:ascii="Consolas" w:hAnsi="Consolas"/>
-          <w:sz w:val="18"/>
-          <w:szCs w:val="18"/>
-        </w:rPr>
-        <w:t>상세</w:t>
-      </w:r>
-      <w:r>
-        <w:rPr>
-          <w:rFonts w:ascii="Consolas" w:hAnsi="Consolas"/>
-          <w:sz w:val="18"/>
-          <w:szCs w:val="18"/>
-        </w:rPr>
-        <w:t xml:space="preserve"> + traceId</w:t>
-      </w:r>
-    </w:p>
-    <w:p>
-      <w:pPr>
-        <w:pBdr>
-          <w:left w:val="single" w:sz="18" w:space="6" w:color="C0C0C0"/>
-        </w:pBdr>
-        <w:shd w:val="clear" w:color="auto" w:fill="F4F4F4"/>
-      </w:pPr>
-      <w:r>
-        <w:rPr>
-          <w:rFonts w:ascii="Consolas" w:hAnsi="Consolas"/>
-          <w:sz w:val="18"/>
-          <w:szCs w:val="18"/>
-        </w:rPr>
-        <w:t xml:space="preserve">    log.error("[ERROR][{}] {} {} : {}", traceId, request.getMethod(), request.getRequestURI(), e.getMessage(), e);</w:t>
-      </w:r>
-    </w:p>
-    <w:p>
-      <w:pPr>
-        <w:pBdr>
-          <w:left w:val="single" w:sz="18" w:space="6" w:color="C0C0C0"/>
-        </w:pBdr>
-        <w:shd w:val="clear" w:color="auto" w:fill="F4F4F4"/>
-      </w:pPr>
-      <w:r>
-        <w:rPr>
-          <w:rFonts w:ascii="Consolas" w:hAnsi="Consolas"/>
-          <w:sz w:val="18"/>
-          <w:szCs w:val="18"/>
-        </w:rPr>
-        <w:t xml:space="preserve">    // </w:t>
-      </w:r>
-      <w:r>
-        <w:rPr>
-          <w:rFonts w:ascii="Consolas" w:hAnsi="Consolas"/>
-          <w:sz w:val="18"/>
-          <w:szCs w:val="18"/>
-        </w:rPr>
-        <w:t>외부</w:t>
-      </w:r>
-      <w:r>
-        <w:rPr>
-          <w:rFonts w:ascii="Consolas" w:hAnsi="Consolas"/>
-          <w:sz w:val="18"/>
-          <w:szCs w:val="18"/>
-        </w:rPr>
-        <w:t xml:space="preserve"> </w:t>
-      </w:r>
-      <w:r>
-        <w:rPr>
-          <w:rFonts w:ascii="Consolas" w:hAnsi="Consolas"/>
-          <w:sz w:val="18"/>
-          <w:szCs w:val="18"/>
-        </w:rPr>
-        <w:t>응답</w:t>
-      </w:r>
-      <w:r>
-        <w:rPr>
-          <w:rFonts w:ascii="Consolas" w:hAnsi="Consolas"/>
-          <w:sz w:val="18"/>
-          <w:szCs w:val="18"/>
-        </w:rPr>
-        <w:t xml:space="preserve">: </w:t>
-      </w:r>
-      <w:r>
-        <w:rPr>
-          <w:rFonts w:ascii="Consolas" w:hAnsi="Consolas"/>
-          <w:sz w:val="18"/>
-          <w:szCs w:val="18"/>
-        </w:rPr>
-        <w:t>일반</w:t>
-      </w:r>
-      <w:r>
-        <w:rPr>
-          <w:rFonts w:ascii="Consolas" w:hAnsi="Consolas"/>
-          <w:sz w:val="18"/>
-          <w:szCs w:val="18"/>
-        </w:rPr>
-        <w:t xml:space="preserve"> </w:t>
-      </w:r>
-      <w:r>
-        <w:rPr>
-          <w:rFonts w:ascii="Consolas" w:hAnsi="Consolas"/>
-          <w:sz w:val="18"/>
-          <w:szCs w:val="18"/>
-        </w:rPr>
-        <w:t>메시지</w:t>
-      </w:r>
-      <w:r>
-        <w:rPr>
-          <w:rFonts w:ascii="Consolas" w:hAnsi="Consolas"/>
-          <w:sz w:val="18"/>
-          <w:szCs w:val="18"/>
-        </w:rPr>
-        <w:t xml:space="preserve"> + traceId (</w:t>
-      </w:r>
-      <w:r>
-        <w:rPr>
-          <w:rFonts w:ascii="Consolas" w:hAnsi="Consolas"/>
-          <w:sz w:val="18"/>
-          <w:szCs w:val="18"/>
-        </w:rPr>
-        <w:t>내부</w:t>
-      </w:r>
-      <w:r>
-        <w:rPr>
-          <w:rFonts w:ascii="Consolas" w:hAnsi="Consolas"/>
-          <w:sz w:val="18"/>
-          <w:szCs w:val="18"/>
-        </w:rPr>
-        <w:t xml:space="preserve"> </w:t>
-      </w:r>
-      <w:r>
-        <w:rPr>
-          <w:rFonts w:ascii="Consolas" w:hAnsi="Consolas"/>
-          <w:sz w:val="18"/>
-          <w:szCs w:val="18"/>
-        </w:rPr>
-        <w:t>메시지</w:t>
-      </w:r>
-      <w:r>
-        <w:rPr>
-          <w:rFonts w:ascii="Consolas" w:hAnsi="Consolas"/>
-          <w:sz w:val="18"/>
-          <w:szCs w:val="18"/>
-        </w:rPr>
-        <w:t xml:space="preserve"> </w:t>
-      </w:r>
-      <w:r>
-        <w:rPr>
-          <w:rFonts w:ascii="Consolas" w:hAnsi="Consolas"/>
-          <w:sz w:val="18"/>
-          <w:szCs w:val="18"/>
-        </w:rPr>
-        <w:t>숨김</w:t>
-      </w:r>
-      <w:r>
-        <w:rPr>
-          <w:rFonts w:ascii="Consolas" w:hAnsi="Consolas"/>
-          <w:sz w:val="18"/>
-          <w:szCs w:val="18"/>
-        </w:rPr>
-        <w:t>)</w:t>
-      </w:r>
-    </w:p>
-    <w:p>
-      <w:pPr>
-        <w:pBdr>
-          <w:left w:val="single" w:sz="18" w:space="6" w:color="C0C0C0"/>
-        </w:pBdr>
-        <w:shd w:val="clear" w:color="auto" w:fill="F4F4F4"/>
-      </w:pPr>
-      <w:r>
-        <w:rPr>
-          <w:rFonts w:ascii="Consolas" w:hAnsi="Consolas"/>
-          <w:sz w:val="18"/>
-          <w:szCs w:val="18"/>
-        </w:rPr>
-        <w:t xml:space="preserve">    errorObject.setMessage("</w:t>
-      </w:r>
-      <w:r>
-        <w:rPr>
-          <w:rFonts w:ascii="Consolas" w:hAnsi="Consolas"/>
-          <w:sz w:val="18"/>
-          <w:szCs w:val="18"/>
-        </w:rPr>
-        <w:t>서버</w:t>
-      </w:r>
-      <w:r>
-        <w:rPr>
-          <w:rFonts w:ascii="Consolas" w:hAnsi="Consolas"/>
-          <w:sz w:val="18"/>
-          <w:szCs w:val="18"/>
-        </w:rPr>
-        <w:t xml:space="preserve"> </w:t>
-      </w:r>
-      <w:r>
-        <w:rPr>
-          <w:rFonts w:ascii="Consolas" w:hAnsi="Consolas"/>
-          <w:sz w:val="18"/>
-          <w:szCs w:val="18"/>
-        </w:rPr>
-        <w:t>내부</w:t>
-      </w:r>
-      <w:r>
-        <w:rPr>
-          <w:rFonts w:ascii="Consolas" w:hAnsi="Consolas"/>
-          <w:sz w:val="18"/>
-          <w:szCs w:val="18"/>
-        </w:rPr>
-        <w:t xml:space="preserve"> </w:t>
-      </w:r>
-      <w:r>
-        <w:rPr>
-          <w:rFonts w:ascii="Consolas" w:hAnsi="Consolas"/>
-          <w:sz w:val="18"/>
-          <w:szCs w:val="18"/>
-        </w:rPr>
-        <w:t>오류가</w:t>
-      </w:r>
-      <w:r>
-        <w:rPr>
-          <w:rFonts w:ascii="Consolas" w:hAnsi="Consolas"/>
-          <w:sz w:val="18"/>
-          <w:szCs w:val="18"/>
-        </w:rPr>
-        <w:t xml:space="preserve"> </w:t>
-      </w:r>
-      <w:r>
-        <w:rPr>
-          <w:rFonts w:ascii="Consolas" w:hAnsi="Consolas"/>
-          <w:sz w:val="18"/>
-          <w:szCs w:val="18"/>
-        </w:rPr>
-        <w:t>발생했습니다</w:t>
-      </w:r>
-      <w:r>
-        <w:rPr>
-          <w:rFonts w:ascii="Consolas" w:hAnsi="Consolas"/>
-          <w:sz w:val="18"/>
-          <w:szCs w:val="18"/>
-        </w:rPr>
-        <w:t>. (t</w:t>
-      </w:r>
-      <w:r>
-        <w:rPr>
-          <w:rFonts w:ascii="Consolas" w:hAnsi="Consolas"/>
-          <w:sz w:val="18"/>
-          <w:szCs w:val="18"/>
-        </w:rPr>
-        <w:t>raceId: " + traceId + ")");</w:t>
+        <w:t xml:space="preserve">    errorObject.setMessage("서버 내부 오류가 발생했습니다. (traceId: " + traceId + ")");</w:t>
       </w:r>
     </w:p>
     <w:p>
@@ -3699,567 +3508,141 @@
           <w:bCs/>
           <w:color w:val="2E5496"/>
         </w:rPr>
-        <w:t xml:space="preserve">7-2. </w:t>
-      </w:r>
-      <w:r>
-        <w:rPr>
-          <w:b/>
-          <w:bCs/>
-          <w:color w:val="2E5496"/>
-        </w:rPr>
-        <w:t>실습</w:t>
-      </w:r>
-      <w:r>
-        <w:rPr>
-          <w:b/>
-          <w:bCs/>
-          <w:color w:val="2E5496"/>
-        </w:rPr>
-        <w:t xml:space="preserve"> : 500 </w:t>
-      </w:r>
-      <w:r>
-        <w:rPr>
-          <w:b/>
-          <w:bCs/>
-          <w:color w:val="2E5496"/>
-        </w:rPr>
-        <w:t>오류</w:t>
-      </w:r>
-      <w:r>
-        <w:rPr>
-          <w:b/>
-          <w:bCs/>
-          <w:color w:val="2E5496"/>
-        </w:rPr>
-        <w:t xml:space="preserve"> </w:t>
-      </w:r>
-      <w:r>
-        <w:rPr>
-          <w:b/>
-          <w:bCs/>
-          <w:color w:val="2E5496"/>
-        </w:rPr>
-        <w:t>하드닝</w:t>
-      </w:r>
-      <w:r>
-        <w:rPr>
-          <w:b/>
-          <w:bCs/>
-          <w:color w:val="2E5496"/>
-        </w:rPr>
-        <w:t xml:space="preserve"> </w:t>
-      </w:r>
-      <w:r>
-        <w:rPr>
-          <w:b/>
-          <w:bCs/>
-          <w:color w:val="2E5496"/>
+        <w:t xml:space="preserve">7-2. 실습 : 500 오류 하드닝 확인</w:t>
+      </w:r>
+    </w:p>
+    <w:p>
+      <w:pPr>
+        <w:spacing w:after="80" w:line="272" w:lineRule="auto"/>
+      </w:pPr>
+      <w:r>
+        <w:t xml:space="preserve">깨진 SQL 페이로드(단일 따옴표)로 500을 유발하고, 외부 응답과 내부 로그를 비교한다.</w:t>
+      </w:r>
+    </w:p>
+    <w:p>
+      <w:pPr>
+        <w:pBdr>
+          <w:top w:val="single" w:sz="4" w:space="3" w:color="D9D9D9"/>
+          <w:left w:val="single" w:sz="18" w:space="6" w:color="C0C0C0"/>
+          <w:bottom w:val="single" w:sz="4" w:space="3" w:color="D9D9D9"/>
+        </w:pBdr>
+        <w:shd w:val="clear" w:color="auto" w:fill="F4F4F4"/>
+      </w:pPr>
+      <w:r>
+        <w:rPr>
+          <w:rFonts w:ascii="Consolas" w:hAnsi="Consolas"/>
+          <w:sz w:val="18"/>
+          <w:szCs w:val="18"/>
+        </w:rPr>
+        <w:t>curl -s -w "\n[HTTP %{http_code}]\n" "http://localhost:8080/api/vuln/sqli/students?name=%27"</w:t>
+      </w:r>
+    </w:p>
+    <w:p>
+      <w:pPr>
+        <w:spacing w:after="80" w:line="272" w:lineRule="auto"/>
+      </w:pPr>
+      <w:r>
+        <w:rPr>
+          <w:b/>
+          <w:bCs/>
+          <w:color w:val="2E7D32"/>
+        </w:rPr>
+        <w:t xml:space="preserve">외부 응답 (일반 메시지+traceId)</w:t>
+      </w:r>
+    </w:p>
+    <w:p>
+      <w:pPr>
+        <w:pBdr>
+          <w:top w:val="single" w:sz="4" w:space="3" w:color="D9D9D9"/>
+          <w:left w:val="single" w:sz="18" w:space="6" w:color="C0C0C0"/>
+          <w:bottom w:val="single" w:sz="4" w:space="3" w:color="D9D9D9"/>
+        </w:pBdr>
+        <w:shd w:val="clear" w:color="auto" w:fill="F4F4F4"/>
+      </w:pPr>
+      <w:r>
+        <w:rPr>
+          <w:rFonts w:ascii="Consolas" w:hAnsi="Consolas"/>
+          <w:sz w:val="18"/>
+          <w:szCs w:val="18"/>
+        </w:rPr>
+        <w:t xml:space="preserve">{"statusCode":500,"message":"서버 내부 오류가 발생했습니다. (traceId: 9a51a868)", ...}</w:t>
+      </w:r>
+    </w:p>
+    <w:p>
+      <w:pPr>
+        <w:spacing w:after="80" w:line="272" w:lineRule="auto"/>
+      </w:pPr>
+      <w:r>
+        <w:rPr>
+          <w:b/>
+          <w:bCs/>
+          <w:color w:val="C00000"/>
+        </w:rPr>
+        <w:t xml:space="preserve">내부 로그 (상세 + 동일 traceId)</w:t>
+      </w:r>
+    </w:p>
+    <w:p>
+      <w:pPr>
+        <w:pBdr>
+          <w:top w:val="single" w:sz="4" w:space="3" w:color="D9D9D9"/>
+          <w:left w:val="single" w:sz="18" w:space="6" w:color="C0C0C0"/>
+          <w:bottom w:val="single" w:sz="4" w:space="3" w:color="D9D9D9"/>
+        </w:pBdr>
+        <w:shd w:val="clear" w:color="auto" w:fill="F4F4F4"/>
+      </w:pPr>
+      <w:r>
+        <w:rPr>
+          <w:rFonts w:ascii="Consolas" w:hAnsi="Consolas"/>
+          <w:sz w:val="18"/>
+          <w:szCs w:val="18"/>
+        </w:rPr>
+        <w:t>[ERROR][9a51a868] GET /api/vuln/sqli/students : bad SQL grammar [SELECT ... WHERE name LIKE '%'%']</w:t>
+      </w:r>
+    </w:p>
+    <w:p>
+      <w:pPr>
+        <w:spacing w:after="80" w:line="272" w:lineRule="auto"/>
+      </w:pPr>
+      <w:r>
+        <w:rPr>
+          <w:b/>
+          <w:bCs/>
         </w:rPr>
         <w:t>확인</w:t>
       </w:r>
     </w:p>
     <w:p>
       <w:pPr>
+        <w:pBdr>
+          <w:top w:val="single" w:sz="4" w:space="3" w:color="D9D9D9"/>
+          <w:left w:val="single" w:sz="18" w:space="6" w:color="C0C0C0"/>
+          <w:bottom w:val="single" w:sz="4" w:space="3" w:color="D9D9D9"/>
+        </w:pBdr>
+        <w:shd w:val="clear" w:color="auto" w:fill="F4F4F4"/>
+      </w:pPr>
+      <w:r>
+        <w:rPr>
+          <w:rFonts w:ascii="Consolas" w:hAnsi="Consolas"/>
+          <w:sz w:val="18"/>
+          <w:szCs w:val="18"/>
+        </w:rPr>
+        <w:t>grep "\[ERROR\]" logs/spring.log | tail -1</w:t>
+      </w:r>
+    </w:p>
+    <w:p>
+      <w:pPr>
         <w:spacing w:after="80" w:line="272" w:lineRule="auto"/>
       </w:pPr>
       <w:r>
-        <w:t>깨진</w:t>
-      </w:r>
-      <w:r>
-        <w:t xml:space="preserve"> SQL </w:t>
-      </w:r>
-      <w:r>
-        <w:t>페이로드</w:t>
-      </w:r>
-      <w:r>
-        <w:t>(</w:t>
-      </w:r>
-      <w:r>
-        <w:t>단일</w:t>
-      </w:r>
-      <w:r>
-        <w:t xml:space="preserve"> </w:t>
-      </w:r>
-      <w:r>
-        <w:t>따옴표</w:t>
-      </w:r>
-      <w:r>
-        <w:t>)</w:t>
-      </w:r>
-      <w:r>
-        <w:t>로</w:t>
-      </w:r>
-      <w:r>
-        <w:t xml:space="preserve"> 500</w:t>
-      </w:r>
-      <w:r>
-        <w:t>을</w:t>
-      </w:r>
-      <w:r>
-        <w:t xml:space="preserve"> </w:t>
-      </w:r>
-      <w:r>
-        <w:t>유발하고</w:t>
-      </w:r>
-      <w:r>
-        <w:t xml:space="preserve">, </w:t>
-      </w:r>
-      <w:r>
-        <w:t>외부</w:t>
-      </w:r>
-      <w:r>
-        <w:t xml:space="preserve"> </w:t>
-      </w:r>
-      <w:r>
-        <w:t>응답과</w:t>
-      </w:r>
-      <w:r>
-        <w:t xml:space="preserve"> </w:t>
-      </w:r>
-      <w:r>
-        <w:t>내부</w:t>
-      </w:r>
-      <w:r>
-        <w:t xml:space="preserve"> </w:t>
-      </w:r>
-      <w:r>
-        <w:t>로그를</w:t>
-      </w:r>
-      <w:r>
-        <w:t xml:space="preserve"> </w:t>
-      </w:r>
-      <w:r>
-        <w:t>비교한다</w:t>
-      </w:r>
-      <w:r>
-        <w:t>.</w:t>
-      </w:r>
-    </w:p>
-    <w:p>
-      <w:pPr>
-        <w:pBdr>
-          <w:top w:val="single" w:sz="4" w:space="3" w:color="D9D9D9"/>
-          <w:left w:val="single" w:sz="18" w:space="6" w:color="C0C0C0"/>
-          <w:bottom w:val="single" w:sz="4" w:space="3" w:color="D9D9D9"/>
-        </w:pBdr>
-        <w:shd w:val="clear" w:color="auto" w:fill="F4F4F4"/>
-      </w:pPr>
-      <w:r>
-        <w:rPr>
-          <w:rFonts w:ascii="Consolas" w:hAnsi="Consolas"/>
-          <w:sz w:val="18"/>
-          <w:szCs w:val="18"/>
-        </w:rPr>
-        <w:t>curl -s -w "\n[HTTP %{http_code}]\n" "http://localhost:8080/api/vuln/sqli/students?name=%27"</w:t>
-      </w:r>
-    </w:p>
-    <w:p>
-      <w:pPr>
-        <w:spacing w:after="80" w:line="272" w:lineRule="auto"/>
-      </w:pPr>
-      <w:r>
-        <w:rPr>
-          <w:b/>
-          <w:bCs/>
-          <w:color w:val="2E7D32"/>
-        </w:rPr>
-        <w:t>외부</w:t>
-      </w:r>
-      <w:r>
-        <w:rPr>
-          <w:b/>
-          <w:bCs/>
-          <w:color w:val="2E7D32"/>
-        </w:rPr>
-        <w:t xml:space="preserve"> </w:t>
-      </w:r>
-      <w:r>
-        <w:rPr>
-          <w:b/>
-          <w:bCs/>
-          <w:color w:val="2E7D32"/>
-        </w:rPr>
-        <w:t>응답</w:t>
-      </w:r>
-      <w:r>
-        <w:rPr>
-          <w:b/>
-          <w:bCs/>
-          <w:color w:val="2E7D32"/>
-        </w:rPr>
-        <w:t xml:space="preserve"> (</w:t>
-      </w:r>
-      <w:r>
-        <w:rPr>
-          <w:b/>
-          <w:bCs/>
-          <w:color w:val="2E7D32"/>
-        </w:rPr>
-        <w:t>일반</w:t>
-      </w:r>
-      <w:r>
-        <w:rPr>
-          <w:b/>
-          <w:bCs/>
-          <w:color w:val="2E7D32"/>
-        </w:rPr>
-        <w:t xml:space="preserve"> </w:t>
-      </w:r>
-      <w:r>
-        <w:rPr>
-          <w:b/>
-          <w:bCs/>
-          <w:color w:val="2E7D32"/>
-        </w:rPr>
-        <w:t>메시지</w:t>
-      </w:r>
-      <w:r>
-        <w:rPr>
-          <w:b/>
-          <w:bCs/>
-          <w:color w:val="2E7D32"/>
-        </w:rPr>
-        <w:t>+traceId)</w:t>
-      </w:r>
-    </w:p>
-    <w:p>
-      <w:pPr>
-        <w:pBdr>
-          <w:top w:val="single" w:sz="4" w:space="3" w:color="D9D9D9"/>
-          <w:left w:val="single" w:sz="18" w:space="6" w:color="C0C0C0"/>
-          <w:bottom w:val="single" w:sz="4" w:space="3" w:color="D9D9D9"/>
-        </w:pBdr>
-        <w:shd w:val="clear" w:color="auto" w:fill="F4F4F4"/>
-      </w:pPr>
-      <w:r>
-        <w:rPr>
-          <w:rFonts w:ascii="Consolas" w:hAnsi="Consolas"/>
-          <w:sz w:val="18"/>
-          <w:szCs w:val="18"/>
-        </w:rPr>
-        <w:t>{"statusCode":500,"message":"</w:t>
-      </w:r>
-      <w:r>
-        <w:rPr>
-          <w:rFonts w:ascii="Consolas" w:hAnsi="Consolas"/>
-          <w:sz w:val="18"/>
-          <w:szCs w:val="18"/>
-        </w:rPr>
-        <w:t>서버</w:t>
-      </w:r>
-      <w:r>
-        <w:rPr>
-          <w:rFonts w:ascii="Consolas" w:hAnsi="Consolas"/>
-          <w:sz w:val="18"/>
-          <w:szCs w:val="18"/>
-        </w:rPr>
-        <w:t xml:space="preserve"> </w:t>
-      </w:r>
-      <w:r>
-        <w:rPr>
-          <w:rFonts w:ascii="Consolas" w:hAnsi="Consolas"/>
-          <w:sz w:val="18"/>
-          <w:szCs w:val="18"/>
-        </w:rPr>
-        <w:t>내부</w:t>
-      </w:r>
-      <w:r>
-        <w:rPr>
-          <w:rFonts w:ascii="Consolas" w:hAnsi="Consolas"/>
-          <w:sz w:val="18"/>
-          <w:szCs w:val="18"/>
-        </w:rPr>
-        <w:t xml:space="preserve"> </w:t>
-      </w:r>
-      <w:r>
-        <w:rPr>
-          <w:rFonts w:ascii="Consolas" w:hAnsi="Consolas"/>
-          <w:sz w:val="18"/>
-          <w:szCs w:val="18"/>
-        </w:rPr>
-        <w:t>오류가</w:t>
-      </w:r>
-      <w:r>
-        <w:rPr>
-          <w:rFonts w:ascii="Consolas" w:hAnsi="Consolas"/>
-          <w:sz w:val="18"/>
-          <w:szCs w:val="18"/>
-        </w:rPr>
-        <w:t xml:space="preserve"> </w:t>
-      </w:r>
-      <w:r>
-        <w:rPr>
-          <w:rFonts w:ascii="Consolas" w:hAnsi="Consolas"/>
-          <w:sz w:val="18"/>
-          <w:szCs w:val="18"/>
-        </w:rPr>
-        <w:t>발생했습니다</w:t>
-      </w:r>
-      <w:r>
-        <w:rPr>
-          <w:rFonts w:ascii="Consolas" w:hAnsi="Consolas"/>
-          <w:sz w:val="18"/>
-          <w:szCs w:val="18"/>
-        </w:rPr>
-        <w:t>. (traceId: 9a51a868)", ...}</w:t>
-      </w:r>
-    </w:p>
-    <w:p>
-      <w:pPr>
-        <w:spacing w:after="80" w:line="272" w:lineRule="auto"/>
-      </w:pPr>
-      <w:r>
-        <w:rPr>
-          <w:b/>
-          <w:bCs/>
-          <w:color w:val="C00000"/>
-        </w:rPr>
-        <w:t>내부</w:t>
-      </w:r>
-      <w:r>
-        <w:rPr>
-          <w:b/>
-          <w:bCs/>
-          <w:color w:val="C00000"/>
-        </w:rPr>
-        <w:t xml:space="preserve"> </w:t>
-      </w:r>
-      <w:r>
-        <w:rPr>
-          <w:b/>
-          <w:bCs/>
-          <w:color w:val="C00000"/>
-        </w:rPr>
-        <w:t>로그</w:t>
-      </w:r>
-      <w:r>
-        <w:rPr>
-          <w:b/>
-          <w:bCs/>
-          <w:color w:val="C00000"/>
-        </w:rPr>
-        <w:t xml:space="preserve"> (</w:t>
-      </w:r>
-      <w:r>
-        <w:rPr>
-          <w:b/>
-          <w:bCs/>
-          <w:color w:val="C00000"/>
-        </w:rPr>
-        <w:t>상세</w:t>
-      </w:r>
-      <w:r>
-        <w:rPr>
-          <w:b/>
-          <w:bCs/>
-          <w:color w:val="C00000"/>
-        </w:rPr>
-        <w:t xml:space="preserve"> + </w:t>
-      </w:r>
-      <w:r>
-        <w:rPr>
-          <w:b/>
-          <w:bCs/>
-          <w:color w:val="C00000"/>
-        </w:rPr>
-        <w:t>동일</w:t>
-      </w:r>
-      <w:r>
-        <w:rPr>
-          <w:b/>
-          <w:bCs/>
-          <w:color w:val="C00000"/>
-        </w:rPr>
-        <w:t xml:space="preserve"> traceId)</w:t>
-      </w:r>
-    </w:p>
-    <w:p>
-      <w:pPr>
-        <w:pBdr>
-          <w:top w:val="single" w:sz="4" w:space="3" w:color="D9D9D9"/>
-          <w:left w:val="single" w:sz="18" w:space="6" w:color="C0C0C0"/>
-          <w:bottom w:val="single" w:sz="4" w:space="3" w:color="D9D9D9"/>
-        </w:pBdr>
-        <w:shd w:val="clear" w:color="auto" w:fill="F4F4F4"/>
-      </w:pPr>
-      <w:r>
-        <w:rPr>
-          <w:rFonts w:ascii="Consolas" w:hAnsi="Consolas"/>
-          <w:sz w:val="18"/>
-          <w:szCs w:val="18"/>
-        </w:rPr>
-        <w:t>[ERROR][9a51a868] GET /api/vuln/sqli/students : bad SQL grammar [SELECT ... WHERE name LIKE '%'%']</w:t>
-      </w:r>
-    </w:p>
-    <w:p>
-      <w:pPr>
-        <w:spacing w:after="80" w:line="272" w:lineRule="auto"/>
-      </w:pPr>
-      <w:r>
-        <w:rPr>
-          <w:b/>
-          <w:bCs/>
-        </w:rPr>
-        <w:t>확인</w:t>
-      </w:r>
-    </w:p>
-    <w:p>
-      <w:pPr>
-        <w:pBdr>
-          <w:top w:val="single" w:sz="4" w:space="3" w:color="D9D9D9"/>
-          <w:left w:val="single" w:sz="18" w:space="6" w:color="C0C0C0"/>
-          <w:bottom w:val="single" w:sz="4" w:space="3" w:color="D9D9D9"/>
-        </w:pBdr>
-        <w:shd w:val="clear" w:color="auto" w:fill="F4F4F4"/>
-      </w:pPr>
-      <w:r>
-        <w:rPr>
-          <w:rFonts w:ascii="Consolas" w:hAnsi="Consolas"/>
-          <w:sz w:val="18"/>
-          <w:szCs w:val="18"/>
-        </w:rPr>
-        <w:t>grep "\[ERROR\]" logs/spring.log | tail -1</w:t>
-      </w:r>
-    </w:p>
-    <w:p>
-      <w:pPr>
-        <w:spacing w:after="80" w:line="272" w:lineRule="auto"/>
-      </w:pPr>
-      <w:r>
         <w:rPr>
           <w:b/>
           <w:bCs/>
           <w:color w:val="1F3864"/>
         </w:rPr>
-        <w:t>핵심</w:t>
-      </w:r>
-      <w:r>
-        <w:rPr>
-          <w:b/>
-          <w:bCs/>
-          <w:color w:val="1F3864"/>
-        </w:rPr>
-        <w:t xml:space="preserve"> — </w:t>
-      </w:r>
-      <w:r>
-        <w:t>traceId(</w:t>
-      </w:r>
-      <w:r>
-        <w:t>9a51a868)</w:t>
-      </w:r>
-      <w:r>
-        <w:t>로</w:t>
-      </w:r>
-      <w:r>
-        <w:t xml:space="preserve"> </w:t>
-      </w:r>
-      <w:r>
-        <w:t>외부</w:t>
-      </w:r>
-      <w:r>
-        <w:t xml:space="preserve"> </w:t>
-      </w:r>
-      <w:r>
-        <w:t>응답과</w:t>
-      </w:r>
-      <w:r>
-        <w:t xml:space="preserve"> </w:t>
-      </w:r>
-      <w:r>
-        <w:t>내부</w:t>
-      </w:r>
-      <w:r>
-        <w:t xml:space="preserve"> </w:t>
-      </w:r>
-      <w:r>
-        <w:t>로그가</w:t>
-      </w:r>
-      <w:r>
-        <w:t xml:space="preserve"> </w:t>
-      </w:r>
-      <w:r>
-        <w:t>연결되며</w:t>
-      </w:r>
-      <w:r>
-        <w:t xml:space="preserve">, </w:t>
-      </w:r>
-      <w:r>
-        <w:t>외부엔</w:t>
-      </w:r>
-      <w:r>
-        <w:t xml:space="preserve"> SQL </w:t>
-      </w:r>
-      <w:r>
-        <w:t>내부</w:t>
-      </w:r>
-      <w:r>
-        <w:t xml:space="preserve"> </w:t>
-      </w:r>
-      <w:r>
-        <w:t>구조가</w:t>
-      </w:r>
-      <w:r>
-        <w:t xml:space="preserve"> </w:t>
-      </w:r>
-      <w:r>
-        <w:t>노출되지</w:t>
-      </w:r>
-      <w:r>
-        <w:t xml:space="preserve"> </w:t>
-      </w:r>
-      <w:r>
-        <w:t>않는다</w:t>
-      </w:r>
-      <w:r>
-        <w:t xml:space="preserve">. </w:t>
-      </w:r>
-      <w:r>
-        <w:t>하드닝</w:t>
-      </w:r>
-      <w:r>
-        <w:t xml:space="preserve"> </w:t>
-      </w:r>
-      <w:r>
-        <w:t>전엔</w:t>
-      </w:r>
-      <w:r>
-        <w:t xml:space="preserve"> e.getMessage()</w:t>
-      </w:r>
-      <w:r>
-        <w:t>가</w:t>
-      </w:r>
-      <w:r>
-        <w:t xml:space="preserve"> </w:t>
-      </w:r>
-      <w:r>
-        <w:t>응답에</w:t>
-      </w:r>
-      <w:r>
-        <w:t xml:space="preserve"> </w:t>
-      </w:r>
-      <w:r>
-        <w:t>담겨</w:t>
-      </w:r>
-      <w:r>
-        <w:t xml:space="preserve"> SQL </w:t>
-      </w:r>
-      <w:r>
-        <w:t>오류가</w:t>
-      </w:r>
-      <w:r>
-        <w:t xml:space="preserve"> </w:t>
-      </w:r>
-      <w:r>
-        <w:t>그대로</w:t>
-      </w:r>
-      <w:r>
-        <w:t xml:space="preserve"> </w:t>
-      </w:r>
-      <w:r>
-        <w:t>노출됐다</w:t>
-      </w:r>
-      <w:r>
-        <w:t>.</w:t>
+        <w:t xml:space="preserve">핵심 — </w:t>
+      </w:r>
+      <w:r>
+        <w:t xml:space="preserve">traceId(9a51a868)로 외부 응답과 내부 로그가 연결되며, 외부엔 SQL 내부 구조가 노출되지 않는다. 하드닝 전엔 e.getMessage()가 응답에 담겨 SQL 오류가 그대로 노출됐다.</w:t>
       </w:r>
     </w:p>
     <w:p>

</xml_diff>

<commit_message>
[Fix] 401/403 접근 거부 시 AUDIT 로그 누락 수정 + formLoginFilterChain 403 HTML 에러 페이지
이 브랜치는 SecurityConfig 에 감사 로깅이 전혀 없던 원형 상태였다(401/403 모두 무로깅,
formLoginFilterChain 은 exceptionHandling 자체가 없음). API 체인(JSON)과 폼 로그인 체인
(401은 /login 리다이렉트 + 로그, 403은 templates/error/403.html HTML 에러 페이지 + 로그)을
분리해 적용하고, 04_Logging_Hardening 문서에 이 403 HTML 분리 내용을 반영했다.
</commit_message>
<xml_diff>
--- a/docs/security/04_Logging_Hardening.docx
+++ b/docs/security/04_Logging_Hardening.docx
@@ -1189,81 +1189,10 @@
           <w:b/>
           <w:bCs/>
         </w:rPr>
-        <w:t>리스너는</w:t>
-      </w:r>
-      <w:r>
-        <w:rPr>
-          <w:b/>
-          <w:bCs/>
-        </w:rPr>
-        <w:t xml:space="preserve"> </w:t>
-      </w:r>
-      <w:r>
-        <w:rPr>
-          <w:b/>
-          <w:bCs/>
-        </w:rPr>
-        <w:t>어떻게</w:t>
-      </w:r>
-      <w:r>
-        <w:rPr>
-          <w:b/>
-          <w:bCs/>
-        </w:rPr>
-        <w:t xml:space="preserve"> </w:t>
-      </w:r>
-      <w:r>
-        <w:rPr>
-          <w:b/>
-          <w:bCs/>
-        </w:rPr>
-        <w:t>호출되나</w:t>
-      </w:r>
-      <w:r>
-        <w:rPr>
-          <w:b/>
-          <w:bCs/>
-        </w:rPr>
-        <w:t xml:space="preserve"> — </w:t>
-      </w:r>
-      <w:r>
-        <w:t xml:space="preserve">SecurityAuditListener </w:t>
-      </w:r>
-      <w:r>
-        <w:t>에는</w:t>
-      </w:r>
-      <w:r>
-        <w:t xml:space="preserve"> </w:t>
-      </w:r>
-      <w:r>
-        <w:t>메서드를</w:t>
-      </w:r>
-      <w:r>
-        <w:t xml:space="preserve"> </w:t>
-      </w:r>
-      <w:r>
-        <w:t>직접</w:t>
-      </w:r>
-      <w:r>
-        <w:t xml:space="preserve"> </w:t>
-      </w:r>
-      <w:r>
-        <w:t>호출하는</w:t>
-      </w:r>
-      <w:r>
-        <w:t xml:space="preserve"> </w:t>
-      </w:r>
-      <w:r>
-        <w:t>코드가</w:t>
-      </w:r>
-      <w:r>
-        <w:t xml:space="preserve"> </w:t>
-      </w:r>
-      <w:r>
-        <w:t>없다</w:t>
-      </w:r>
-      <w:r>
-        <w:t xml:space="preserve">. </w:t>
+        <w:t xml:space="preserve">리스너는 어떻게 호출되나 — </w:t>
+      </w:r>
+      <w:r>
+        <w:t xml:space="preserve">SecurityAuditListener 에는 메서드를 직접 호출하는 코드가 없다. </w:t>
       </w:r>
       <w:r>
         <w:rPr>
@@ -1273,55 +1202,7 @@
         <w:t>@EventListener</w:t>
       </w:r>
       <w:r>
-        <w:t xml:space="preserve"> </w:t>
-      </w:r>
-      <w:r>
-        <w:t>가</w:t>
-      </w:r>
-      <w:r>
-        <w:t xml:space="preserve"> Spring </w:t>
-      </w:r>
-      <w:r>
-        <w:t>의</w:t>
-      </w:r>
-      <w:r>
-        <w:t xml:space="preserve"> </w:t>
-      </w:r>
-      <w:r>
-        <w:t>이벤트</w:t>
-      </w:r>
-      <w:r>
-        <w:t xml:space="preserve"> </w:t>
-      </w:r>
-      <w:r>
-        <w:t>발행</w:t>
-      </w:r>
-      <w:r>
-        <w:t>/</w:t>
-      </w:r>
-      <w:r>
-        <w:t>구독</w:t>
-      </w:r>
-      <w:r>
-        <w:t xml:space="preserve"> </w:t>
-      </w:r>
-      <w:r>
-        <w:t>메커니즘에</w:t>
-      </w:r>
-      <w:r>
-        <w:t xml:space="preserve"> </w:t>
-      </w:r>
-      <w:r>
-        <w:t>올라타</w:t>
-      </w:r>
-      <w:r>
-        <w:t xml:space="preserve"> </w:t>
-      </w:r>
-      <w:r>
-        <w:t>있어서</w:t>
-      </w:r>
-      <w:r>
-        <w:t xml:space="preserve">, </w:t>
+        <w:t xml:space="preserve"> 가 Spring 의 이벤트 발행/구독 메커니즘에 올라타 있어서, </w:t>
       </w:r>
       <w:r>
         <w:rPr>
@@ -1331,229 +1212,7 @@
         <w:t>AuthenticationManager</w:t>
       </w:r>
       <w:r>
-        <w:t>(</w:t>
-      </w:r>
-      <w:r>
-        <w:t>내부적으로</w:t>
-      </w:r>
-      <w:r>
-        <w:t xml:space="preserve"> ProviderManager)</w:t>
-      </w:r>
-      <w:r>
-        <w:t>가</w:t>
-      </w:r>
-      <w:r>
-        <w:t xml:space="preserve"> </w:t>
-      </w:r>
-      <w:r>
-        <w:t>인증</w:t>
-      </w:r>
-      <w:r>
-        <w:t xml:space="preserve"> </w:t>
-      </w:r>
-      <w:r>
-        <w:t>결과에</w:t>
-      </w:r>
-      <w:r>
-        <w:t xml:space="preserve"> </w:t>
-      </w:r>
-      <w:r>
-        <w:t>맞는</w:t>
-      </w:r>
-      <w:r>
-        <w:t xml:space="preserve"> </w:t>
-      </w:r>
-      <w:r>
-        <w:t>이벤트를</w:t>
-      </w:r>
-      <w:r>
-        <w:t xml:space="preserve"> </w:t>
-      </w:r>
-      <w:r>
-        <w:t>발행하면</w:t>
-      </w:r>
-      <w:r>
-        <w:t xml:space="preserve">, Spring </w:t>
-      </w:r>
-      <w:r>
-        <w:t>컨테이너가</w:t>
-      </w:r>
-      <w:r>
-        <w:t xml:space="preserve"> </w:t>
-      </w:r>
-      <w:r>
-        <w:t>파라미터</w:t>
-      </w:r>
-      <w:r>
-        <w:t xml:space="preserve"> </w:t>
-      </w:r>
-      <w:r>
-        <w:t>타입이</w:t>
-      </w:r>
-      <w:r>
-        <w:t xml:space="preserve"> </w:t>
-      </w:r>
-      <w:r>
-        <w:t>일치하는</w:t>
-      </w:r>
-      <w:r>
-        <w:t xml:space="preserve"> </w:t>
-      </w:r>
-      <w:r>
-        <w:t>리스너</w:t>
-      </w:r>
-      <w:r>
-        <w:t xml:space="preserve"> </w:t>
-      </w:r>
-      <w:r>
-        <w:t>메서드를</w:t>
-      </w:r>
-      <w:r>
-        <w:t xml:space="preserve"> </w:t>
-      </w:r>
-      <w:r>
-        <w:t>찾아</w:t>
-      </w:r>
-      <w:r>
-        <w:t xml:space="preserve"> </w:t>
-      </w:r>
-      <w:r>
-        <w:t>자동으로</w:t>
-      </w:r>
-      <w:r>
-        <w:t xml:space="preserve"> </w:t>
-      </w:r>
-      <w:r>
-        <w:t>호출한다</w:t>
-      </w:r>
-      <w:r>
-        <w:t xml:space="preserve">. </w:t>
-      </w:r>
-      <w:r>
-        <w:t>그래서</w:t>
-      </w:r>
-      <w:r>
-        <w:t xml:space="preserve"> </w:t>
-      </w:r>
-      <w:r>
-        <w:t>리스너는</w:t>
-      </w:r>
-      <w:r>
-        <w:t xml:space="preserve"> </w:t>
-      </w:r>
-      <w:r>
-        <w:t>인증</w:t>
-      </w:r>
-      <w:r>
-        <w:t xml:space="preserve"> </w:t>
-      </w:r>
-      <w:r>
-        <w:t>처리</w:t>
-      </w:r>
-      <w:r>
-        <w:t xml:space="preserve"> </w:t>
-      </w:r>
-      <w:r>
-        <w:t>코드를</w:t>
-      </w:r>
-      <w:r>
-        <w:t xml:space="preserve"> </w:t>
-      </w:r>
-      <w:r>
-        <w:t>직접</w:t>
-      </w:r>
-      <w:r>
-        <w:t xml:space="preserve"> </w:t>
-      </w:r>
-      <w:r>
-        <w:t>참조하지</w:t>
-      </w:r>
-      <w:r>
-        <w:t xml:space="preserve"> </w:t>
-      </w:r>
-      <w:r>
-        <w:t>않고도</w:t>
-      </w:r>
-      <w:r>
-        <w:t xml:space="preserve"> </w:t>
-      </w:r>
-      <w:r>
-        <w:t>폼</w:t>
-      </w:r>
-      <w:r>
-        <w:t xml:space="preserve"> </w:t>
-      </w:r>
-      <w:r>
-        <w:t>로그인</w:t>
-      </w:r>
-      <w:r>
-        <w:t xml:space="preserve">·REST </w:t>
-      </w:r>
-      <w:r>
-        <w:t>로그인</w:t>
-      </w:r>
-      <w:r>
-        <w:t xml:space="preserve"> </w:t>
-      </w:r>
-      <w:r>
-        <w:t>등</w:t>
-      </w:r>
-      <w:r>
-        <w:t xml:space="preserve"> </w:t>
-      </w:r>
-      <w:r>
-        <w:t>모든</w:t>
-      </w:r>
-      <w:r>
-        <w:t xml:space="preserve"> </w:t>
-      </w:r>
-      <w:r>
-        <w:t>인증</w:t>
-      </w:r>
-      <w:r>
-        <w:t xml:space="preserve"> </w:t>
-      </w:r>
-      <w:r>
-        <w:t>경로의</w:t>
-      </w:r>
-      <w:r>
-        <w:t xml:space="preserve"> </w:t>
-      </w:r>
-      <w:r>
-        <w:t>결과를</w:t>
-      </w:r>
-      <w:r>
-        <w:t xml:space="preserve"> </w:t>
-      </w:r>
-      <w:r>
-        <w:t>감사</w:t>
-      </w:r>
-      <w:r>
-        <w:t xml:space="preserve"> </w:t>
-      </w:r>
-      <w:r>
-        <w:t>로그로</w:t>
-      </w:r>
-      <w:r>
-        <w:t xml:space="preserve"> </w:t>
-      </w:r>
-      <w:r>
-        <w:t>남길</w:t>
-      </w:r>
-      <w:r>
-        <w:t xml:space="preserve"> </w:t>
-      </w:r>
-      <w:r>
-        <w:t>수</w:t>
-      </w:r>
-      <w:r>
-        <w:t xml:space="preserve"> </w:t>
-      </w:r>
-      <w:r>
-        <w:t>있다</w:t>
-      </w:r>
-      <w:r>
-        <w:t>.</w:t>
+        <w:t xml:space="preserve">(내부적으로 ProviderManager)가 인증 결과에 맞는 이벤트를 발행하면, Spring 컨테이너가 파라미터 타입이 일치하는 리스너 메서드를 찾아 자동으로 호출한다. 그래서 리스너는 인증 처리 코드를 직접 참조하지 않고도 폼 로그인·REST 로그인 등 모든 인증 경로의 결과를 감사 로그로 남길 수 있다.</w:t>
       </w:r>
     </w:p>
     <w:p>
@@ -1568,34 +1227,7 @@
         <w:t xml:space="preserve">AuthenticationSuccessEvent — </w:t>
       </w:r>
       <w:r>
-        <w:t>인증이</w:t>
-      </w:r>
-      <w:r>
-        <w:t xml:space="preserve"> </w:t>
-      </w:r>
-      <w:r>
-        <w:t>성공했을</w:t>
-      </w:r>
-      <w:r>
-        <w:t xml:space="preserve"> </w:t>
-      </w:r>
-      <w:r>
-        <w:t>때</w:t>
-      </w:r>
-      <w:r>
-        <w:t xml:space="preserve"> </w:t>
-      </w:r>
-      <w:r>
-        <w:t>발행되는</w:t>
-      </w:r>
-      <w:r>
-        <w:t xml:space="preserve"> </w:t>
-      </w:r>
-      <w:r>
-        <w:t>이벤트</w:t>
-      </w:r>
-      <w:r>
-        <w:t xml:space="preserve">. </w:t>
+        <w:t xml:space="preserve">인증이 성공했을 때 발행되는 이벤트. </w:t>
       </w:r>
       <w:r>
         <w:rPr>
@@ -1605,61 +1237,7 @@
         <w:t>getAuthentication()</w:t>
       </w:r>
       <w:r>
-        <w:t xml:space="preserve"> </w:t>
-      </w:r>
-      <w:r>
-        <w:t>으로</w:t>
-      </w:r>
-      <w:r>
-        <w:t xml:space="preserve"> </w:t>
-      </w:r>
-      <w:r>
-        <w:t>인증된</w:t>
-      </w:r>
-      <w:r>
-        <w:t xml:space="preserve"> Authentication </w:t>
-      </w:r>
-      <w:r>
-        <w:t>객체</w:t>
-      </w:r>
-      <w:r>
-        <w:t>(</w:t>
-      </w:r>
-      <w:r>
-        <w:t>사용자명</w:t>
-      </w:r>
-      <w:r>
-        <w:t>·</w:t>
-      </w:r>
-      <w:r>
-        <w:t>권한</w:t>
-      </w:r>
-      <w:r>
-        <w:t xml:space="preserve"> </w:t>
-      </w:r>
-      <w:r>
-        <w:t>등</w:t>
-      </w:r>
-      <w:r>
-        <w:t>)</w:t>
-      </w:r>
-      <w:r>
-        <w:t>를</w:t>
-      </w:r>
-      <w:r>
-        <w:t xml:space="preserve"> </w:t>
-      </w:r>
-      <w:r>
-        <w:t>담고</w:t>
-      </w:r>
-      <w:r>
-        <w:t xml:space="preserve"> </w:t>
-      </w:r>
-      <w:r>
-        <w:t>있다</w:t>
-      </w:r>
-      <w:r>
-        <w:t>.</w:t>
+        <w:t xml:space="preserve"> 으로 인증된 Authentication 객체(사용자명·권한 등)를 담고 있다.</w:t>
       </w:r>
     </w:p>
     <w:p>
@@ -1671,122 +1249,10 @@
           <w:b/>
           <w:bCs/>
         </w:rPr>
-        <w:t>Ab</w:t>
-      </w:r>
-      <w:r>
-        <w:rPr>
-          <w:b/>
-          <w:bCs/>
-        </w:rPr>
-        <w:t xml:space="preserve">stractAuthenticationFailureEvent — </w:t>
-      </w:r>
-      <w:r>
-        <w:t>인증</w:t>
-      </w:r>
-      <w:r>
-        <w:t xml:space="preserve"> </w:t>
-      </w:r>
-      <w:r>
-        <w:t>실패</w:t>
-      </w:r>
-      <w:r>
-        <w:t xml:space="preserve"> </w:t>
-      </w:r>
-      <w:r>
-        <w:t>이벤트들의</w:t>
-      </w:r>
-      <w:r>
-        <w:t xml:space="preserve"> </w:t>
-      </w:r>
-      <w:r>
-        <w:t>공통</w:t>
-      </w:r>
-      <w:r>
-        <w:t xml:space="preserve"> </w:t>
-      </w:r>
-      <w:r>
-        <w:t>부모</w:t>
-      </w:r>
-      <w:r>
-        <w:t xml:space="preserve"> </w:t>
-      </w:r>
-      <w:r>
-        <w:t>클래스</w:t>
-      </w:r>
-      <w:r>
-        <w:t>(</w:t>
-      </w:r>
-      <w:r>
-        <w:t>추상</w:t>
-      </w:r>
-      <w:r>
-        <w:t xml:space="preserve"> </w:t>
-      </w:r>
-      <w:r>
-        <w:t>클래스</w:t>
-      </w:r>
-      <w:r>
-        <w:t xml:space="preserve">). </w:t>
-      </w:r>
-      <w:r>
-        <w:t>실제로</w:t>
-      </w:r>
-      <w:r>
-        <w:t xml:space="preserve"> </w:t>
-      </w:r>
-      <w:r>
-        <w:t>발행되는</w:t>
-      </w:r>
-      <w:r>
-        <w:t xml:space="preserve"> </w:t>
-      </w:r>
-      <w:r>
-        <w:t>것은</w:t>
-      </w:r>
-      <w:r>
-        <w:t xml:space="preserve"> </w:t>
-      </w:r>
-      <w:r>
-        <w:t>실패</w:t>
-      </w:r>
-      <w:r>
-        <w:t xml:space="preserve"> </w:t>
-      </w:r>
-      <w:r>
-        <w:t>원인별</w:t>
-      </w:r>
-      <w:r>
-        <w:t xml:space="preserve"> </w:t>
-      </w:r>
-      <w:r>
-        <w:t>구체</w:t>
-      </w:r>
-      <w:r>
-        <w:t xml:space="preserve"> </w:t>
-      </w:r>
-      <w:r>
-        <w:t>이벤트</w:t>
-      </w:r>
-      <w:r>
-        <w:t>(</w:t>
-      </w:r>
-      <w:r>
-        <w:t>예</w:t>
-      </w:r>
-      <w:r>
-        <w:t xml:space="preserve">: AuthenticationFailureBadCredentialsEvent, AuthenticationFailureLockedEvent, AuthenticationFailureDisabledEvent </w:t>
-      </w:r>
-      <w:r>
-        <w:t>등</w:t>
-      </w:r>
-      <w:r>
-        <w:t>)</w:t>
-      </w:r>
-      <w:r>
-        <w:t>이며</w:t>
-      </w:r>
-      <w:r>
-        <w:t xml:space="preserve">, </w:t>
+        <w:t xml:space="preserve">AbstractAuthenticationFailureEvent — </w:t>
+      </w:r>
+      <w:r>
+        <w:t xml:space="preserve">인증 실패 이벤트들의 공통 부모 클래스(추상 클래스). 실제로 발행되는 것은 실패 원인별 구체 이벤트(예: AuthenticationFailureBadCredentialsEvent, AuthenticationFailureLockedEvent, AuthenticationFailureDisabledEvent 등)이며, </w:t>
       </w:r>
       <w:r>
         <w:rPr>
@@ -1796,49 +1262,7 @@
         <w:t>getException()</w:t>
       </w:r>
       <w:r>
-        <w:t xml:space="preserve"> </w:t>
-      </w:r>
-      <w:r>
-        <w:t>으로</w:t>
-      </w:r>
-      <w:r>
-        <w:t xml:space="preserve"> </w:t>
-      </w:r>
-      <w:r>
-        <w:t>실패</w:t>
-      </w:r>
-      <w:r>
-        <w:t xml:space="preserve"> </w:t>
-      </w:r>
-      <w:r>
-        <w:t>원인</w:t>
-      </w:r>
-      <w:r>
-        <w:t xml:space="preserve"> </w:t>
-      </w:r>
-      <w:r>
-        <w:t>예외를</w:t>
-      </w:r>
-      <w:r>
-        <w:t xml:space="preserve"> </w:t>
-      </w:r>
-      <w:r>
-        <w:t>꺼낼</w:t>
-      </w:r>
-      <w:r>
-        <w:t xml:space="preserve"> </w:t>
-      </w:r>
-      <w:r>
-        <w:t>수</w:t>
-      </w:r>
-      <w:r>
-        <w:t xml:space="preserve"> </w:t>
-      </w:r>
-      <w:r>
-        <w:t>있다</w:t>
-      </w:r>
-      <w:r>
-        <w:t>.</w:t>
+        <w:t xml:space="preserve"> 으로 실패 원인 예외를 꺼낼 수 있다.</w:t>
       </w:r>
     </w:p>
     <w:p>
@@ -1850,302 +1274,10 @@
           <w:b/>
           <w:bCs/>
         </w:rPr>
-        <w:t>Securit</w:t>
-      </w:r>
-      <w:r>
-        <w:rPr>
-          <w:b/>
-          <w:bCs/>
-        </w:rPr>
-        <w:t xml:space="preserve">yAuditListener </w:t>
-      </w:r>
-      <w:r>
-        <w:rPr>
-          <w:b/>
-          <w:bCs/>
-        </w:rPr>
-        <w:t>는</w:t>
-      </w:r>
-      <w:r>
-        <w:rPr>
-          <w:b/>
-          <w:bCs/>
-        </w:rPr>
-        <w:t xml:space="preserve"> </w:t>
-      </w:r>
-      <w:r>
-        <w:rPr>
-          <w:b/>
-          <w:bCs/>
-        </w:rPr>
-        <w:t>위</w:t>
-      </w:r>
-      <w:r>
-        <w:rPr>
-          <w:b/>
-          <w:bCs/>
-        </w:rPr>
-        <w:t xml:space="preserve"> </w:t>
-      </w:r>
-      <w:r>
-        <w:rPr>
-          <w:b/>
-          <w:bCs/>
-        </w:rPr>
-        <w:t>이벤트들의</w:t>
-      </w:r>
-      <w:r>
-        <w:rPr>
-          <w:b/>
-          <w:bCs/>
-        </w:rPr>
-        <w:t xml:space="preserve"> </w:t>
-      </w:r>
-      <w:r>
-        <w:rPr>
-          <w:b/>
-          <w:bCs/>
-        </w:rPr>
-        <w:t>변동사항을</w:t>
-      </w:r>
-      <w:r>
-        <w:rPr>
-          <w:b/>
-          <w:bCs/>
-        </w:rPr>
-        <w:t xml:space="preserve"> </w:t>
-      </w:r>
-      <w:r>
-        <w:rPr>
-          <w:b/>
-          <w:bCs/>
-        </w:rPr>
-        <w:t>리스닝</w:t>
-      </w:r>
-      <w:r>
-        <w:rPr>
-          <w:b/>
-          <w:bCs/>
-        </w:rPr>
-        <w:t xml:space="preserve"> </w:t>
-      </w:r>
-      <w:r>
-        <w:rPr>
-          <w:b/>
-          <w:bCs/>
-        </w:rPr>
-        <w:t>하는가</w:t>
-      </w:r>
-      <w:r>
-        <w:rPr>
-          <w:b/>
-          <w:bCs/>
-        </w:rPr>
-        <w:t xml:space="preserve"> — </w:t>
-      </w:r>
-      <w:r>
-        <w:t>그렇다</w:t>
-      </w:r>
-      <w:r>
-        <w:t xml:space="preserve">. onAuthenticationFailure(AbstractAuthenticationFailureEvent event) </w:t>
-      </w:r>
-      <w:r>
-        <w:t>는</w:t>
-      </w:r>
-      <w:r>
-        <w:t xml:space="preserve"> </w:t>
-      </w:r>
-      <w:r>
-        <w:t>파라미터를</w:t>
-      </w:r>
-      <w:r>
-        <w:t xml:space="preserve"> </w:t>
-      </w:r>
-      <w:r>
-        <w:t>부모</w:t>
-      </w:r>
-      <w:r>
-        <w:t xml:space="preserve"> </w:t>
-      </w:r>
-      <w:r>
-        <w:t>타입으로</w:t>
-      </w:r>
-      <w:r>
-        <w:t xml:space="preserve"> </w:t>
-      </w:r>
-      <w:r>
-        <w:t>선언했기</w:t>
-      </w:r>
-      <w:r>
-        <w:t xml:space="preserve"> </w:t>
-      </w:r>
-      <w:r>
-        <w:t>때문에</w:t>
-      </w:r>
-      <w:r>
-        <w:t xml:space="preserve">, </w:t>
-      </w:r>
-      <w:r>
-        <w:t>어떤</w:t>
-      </w:r>
-      <w:r>
-        <w:t xml:space="preserve"> </w:t>
-      </w:r>
-      <w:r>
-        <w:t>구체</w:t>
-      </w:r>
-      <w:r>
-        <w:t xml:space="preserve"> </w:t>
-      </w:r>
-      <w:r>
-        <w:t>실패</w:t>
-      </w:r>
-      <w:r>
-        <w:t xml:space="preserve"> </w:t>
-      </w:r>
-      <w:r>
-        <w:t>이벤트가</w:t>
-      </w:r>
-      <w:r>
-        <w:t xml:space="preserve"> </w:t>
-      </w:r>
-      <w:r>
-        <w:t>발행되든</w:t>
-      </w:r>
-      <w:r>
-        <w:t xml:space="preserve"> </w:t>
-      </w:r>
-      <w:r>
-        <w:t>이</w:t>
-      </w:r>
-      <w:r>
-        <w:t xml:space="preserve"> </w:t>
-      </w:r>
-      <w:r>
-        <w:t>메서드</w:t>
-      </w:r>
-      <w:r>
-        <w:t xml:space="preserve"> </w:t>
-      </w:r>
-      <w:r>
-        <w:t>하나가</w:t>
-      </w:r>
-      <w:r>
-        <w:t xml:space="preserve"> </w:t>
-      </w:r>
-      <w:r>
-        <w:t>전부</w:t>
-      </w:r>
-      <w:r>
-        <w:t xml:space="preserve"> </w:t>
-      </w:r>
-      <w:r>
-        <w:t>수신한다</w:t>
-      </w:r>
-      <w:r>
-        <w:t xml:space="preserve">. onAuthenticationSuccess </w:t>
-      </w:r>
-      <w:r>
-        <w:t>는</w:t>
-      </w:r>
-      <w:r>
-        <w:t xml:space="preserve"> </w:t>
-      </w:r>
-      <w:r>
-        <w:t>성공</w:t>
-      </w:r>
-      <w:r>
-        <w:t xml:space="preserve"> </w:t>
-      </w:r>
-      <w:r>
-        <w:t>이벤트만</w:t>
-      </w:r>
-      <w:r>
-        <w:t xml:space="preserve"> </w:t>
-      </w:r>
-      <w:r>
-        <w:t>수신한다</w:t>
-      </w:r>
-      <w:r>
-        <w:t xml:space="preserve">. </w:t>
-      </w:r>
-      <w:r>
-        <w:t>따라서</w:t>
-      </w:r>
-      <w:r>
-        <w:t xml:space="preserve"> </w:t>
-      </w:r>
-      <w:r>
-        <w:t>인증</w:t>
-      </w:r>
-      <w:r>
-        <w:t xml:space="preserve"> </w:t>
-      </w:r>
-      <w:r>
-        <w:t>성공</w:t>
-      </w:r>
-      <w:r>
-        <w:t>/</w:t>
-      </w:r>
-      <w:r>
-        <w:t>실패라는</w:t>
-      </w:r>
-      <w:r>
-        <w:t xml:space="preserve"> </w:t>
-      </w:r>
-      <w:r>
-        <w:t>두</w:t>
-      </w:r>
-      <w:r>
-        <w:t xml:space="preserve"> </w:t>
-      </w:r>
-      <w:r>
-        <w:t>가지</w:t>
-      </w:r>
-      <w:r>
-        <w:t xml:space="preserve"> </w:t>
-      </w:r>
-      <w:r>
-        <w:t>상태</w:t>
-      </w:r>
-      <w:r>
-        <w:t xml:space="preserve"> </w:t>
-      </w:r>
-      <w:r>
-        <w:t>변화를</w:t>
-      </w:r>
-      <w:r>
-        <w:t xml:space="preserve"> </w:t>
-      </w:r>
-      <w:r>
-        <w:t>누락</w:t>
-      </w:r>
-      <w:r>
-        <w:t xml:space="preserve"> </w:t>
-      </w:r>
-      <w:r>
-        <w:t>없이</w:t>
-      </w:r>
-      <w:r>
-        <w:t xml:space="preserve"> </w:t>
-      </w:r>
-      <w:r>
-        <w:t>감사</w:t>
-      </w:r>
-      <w:r>
-        <w:t xml:space="preserve"> </w:t>
-      </w:r>
-      <w:r>
-        <w:t>로그로</w:t>
-      </w:r>
-      <w:r>
-        <w:t xml:space="preserve"> </w:t>
-      </w:r>
-      <w:r>
-        <w:t>남긴다</w:t>
-      </w:r>
-      <w:r>
-        <w:t>.</w:t>
+        <w:t xml:space="preserve">SecurityAuditListener 는 위 이벤트들의 변동사항을 리스닝 하는가 — </w:t>
+      </w:r>
+      <w:r>
+        <w:t xml:space="preserve">그렇다. onAuthenticationFailure(AbstractAuthenticationFailureEvent event) 는 파라미터를 부모 타입으로 선언했기 때문에, 어떤 구체 실패 이벤트가 발행되든 이 메서드 하나가 전부 수신한다. onAuthenticationSuccess 는 성공 이벤트만 수신한다. 따라서 인증 성공/실패라는 두 가지 상태 변화를 누락 없이 감사 로그로 남긴다.</w:t>
       </w:r>
     </w:p>
     <w:p>
@@ -2580,23 +1712,7 @@
           <w:sz w:val="18"/>
           <w:szCs w:val="18"/>
         </w:rPr>
-        <w:t xml:space="preserve">        .authenticationEntryPoint(a</w:t>
-      </w:r>
-      <w:r>
-        <w:rPr>
-          <w:rFonts w:ascii="Consolas" w:eastAsia="Consolas" w:hAnsi="Consolas" w:cs="Consolas"/>
-          <w:sz w:val="18"/>
-          <w:szCs w:val="18"/>
-        </w:rPr>
-        <w:t xml:space="preserve">uthenticationEntryPoint())  </w:t>
-      </w:r>
-      <w:r>
-        <w:rPr>
-          <w:rFonts w:ascii="Consolas" w:eastAsia="Consolas" w:hAnsi="Consolas" w:cs="Consolas"/>
-          <w:sz w:val="18"/>
-          <w:szCs w:val="18"/>
-        </w:rPr>
-        <w:t>// 401 → [AUDIT] 로그 + JSON 응답</w:t>
+        <w:t xml:space="preserve">        .authenticationEntryPoint(authenticationEntryPoint())  // 401 → [AUDIT] 로그 + JSON 응답</w:t>
       </w:r>
     </w:p>
     <w:p>
@@ -2613,23 +1729,7 @@
           <w:sz w:val="18"/>
           <w:szCs w:val="18"/>
         </w:rPr>
-        <w:t xml:space="preserve">        .accessDeniedHandler(auditedAccessDeniedHandler()))</w:t>
-      </w:r>
-      <w:r>
-        <w:rPr>
-          <w:rFonts w:ascii="Consolas" w:eastAsia="Consolas" w:hAnsi="Consolas" w:cs="Consolas"/>
-          <w:sz w:val="18"/>
-          <w:szCs w:val="18"/>
-        </w:rPr>
-        <w:t xml:space="preserve">    </w:t>
-      </w:r>
-      <w:r>
-        <w:rPr>
-          <w:rFonts w:ascii="Consolas" w:eastAsia="Consolas" w:hAnsi="Consolas" w:cs="Consolas"/>
-          <w:sz w:val="18"/>
-          <w:szCs w:val="18"/>
-        </w:rPr>
-        <w:t>// 403 → [AUDIT] 로그 + JSON 응답</w:t>
+        <w:t xml:space="preserve">        .accessDeniedHandler(auditedAccessDeniedHandler()))    // 403 → [AUDIT] 로그 + JSON 응답</w:t>
       </w:r>
     </w:p>
     <w:p>
@@ -2741,23 +1841,7 @@
           <w:sz w:val="18"/>
           <w:szCs w:val="18"/>
         </w:rPr>
-        <w:t xml:space="preserve">        .authenticationEntryPoint(auditedLoginEntryP</w:t>
-      </w:r>
-      <w:r>
-        <w:rPr>
-          <w:rFonts w:ascii="Consolas" w:eastAsia="Consolas" w:hAnsi="Consolas" w:cs="Consolas"/>
-          <w:sz w:val="18"/>
-          <w:szCs w:val="18"/>
-        </w:rPr>
-        <w:t xml:space="preserve">oint())    </w:t>
-      </w:r>
-      <w:r>
-        <w:rPr>
-          <w:rFonts w:ascii="Consolas" w:eastAsia="Consolas" w:hAnsi="Consolas" w:cs="Consolas"/>
-          <w:sz w:val="18"/>
-          <w:szCs w:val="18"/>
-        </w:rPr>
-        <w:t>// 401 → [AUDIT] 로그 + /login 리다이렉트(기존 동작 유지)</w:t>
+        <w:t xml:space="preserve">        .authenticationEntryPoint(auditedLoginEntryPoint())    // 401 → [AUDIT] 로그 + /login 리다이렉트(기존 동작 유지)</w:t>
       </w:r>
     </w:p>
     <w:p>
@@ -2774,23 +1858,7 @@
           <w:sz w:val="18"/>
           <w:szCs w:val="18"/>
         </w:rPr>
-        <w:t xml:space="preserve">        .accessDeniedHandler(audite</w:t>
-      </w:r>
-      <w:r>
-        <w:rPr>
-          <w:rFonts w:ascii="Consolas" w:eastAsia="Consolas" w:hAnsi="Consolas" w:cs="Consolas"/>
-          <w:sz w:val="18"/>
-          <w:szCs w:val="18"/>
-        </w:rPr>
-        <w:t xml:space="preserve">dAccessDeniedHandler()))    </w:t>
-      </w:r>
-      <w:r>
-        <w:rPr>
-          <w:rFonts w:ascii="Consolas" w:eastAsia="Consolas" w:hAnsi="Consolas" w:cs="Consolas"/>
-          <w:sz w:val="18"/>
-          <w:szCs w:val="18"/>
-        </w:rPr>
-        <w:t>// 403 → [AUDIT] 로그 + JSON 응답(API 체인과 공유)</w:t>
+        <w:t xml:space="preserve">        .accessDeniedHandler(auditedAccessDeniedHandler()))    // 403 → [AUDIT] 로그 + JSON 응답(API 체인과 공유)</w:t>
       </w:r>
     </w:p>
     <w:p>
@@ -3381,6 +2449,471 @@
           <w:rFonts w:hint="eastAsia"/>
         </w:rPr>
         <w:t>처리해 주어야 합니다</w:t>
+      </w:r>
+    </w:p>
+    <w:p>
+      <w:pPr>
+        <w:pStyle w:val="2"/>
+        <w:spacing w:before="240" w:after="100"/>
+      </w:pPr>
+      <w:r>
+        <w:rPr>
+          <w:b/>
+          <w:bCs/>
+          <w:color w:val="2E5496"/>
+        </w:rPr>
+        <w:t>4-5. formLoginFilterChain 403 응답을 HTML 에러 페이지로</w:t>
+      </w:r>
+    </w:p>
+    <w:p>
+      <w:pPr>
+        <w:spacing w:after="90" w:line="272" w:lineRule="auto"/>
+      </w:pPr>
+      <w:r>
+        <w:t xml:space="preserve">4-4의 auditedAccessDeniedHandler()는 403을 JSON으로 응답한다. REST API(securityFilterChain)는 이게 맞지만, </w:t>
+      </w:r>
+      <w:r>
+        <w:rPr>
+          <w:b/>
+          <w:bCs/>
+        </w:rPr>
+        <w:t xml:space="preserve">브라우저로 접근하는 formLoginFilterChain에서는 사용자에게 JSON이 그대로 보이는 게 부자연스럽다. </w:t>
+      </w:r>
+      <w:r>
+        <w:t xml:space="preserve">그래서 formLoginFilterChain 전용으로 auditedHtmlAccessDeniedHandler()를 따로 두어, 같은 [AUDIT] 로그를 남기되 응답은 HTML 에러 페이지로 분리했다.</w:t>
+      </w:r>
+    </w:p>
+    <w:p>
+      <w:pPr>
+        <w:pBdr>
+          <w:top w:val="single" w:sz="4" w:space="3" w:color="D9D9D9"/>
+          <w:left w:val="single" w:sz="18" w:space="6" w:color="C0C0C0"/>
+        </w:pBdr>
+        <w:shd w:val="clear" w:color="auto" w:fill="F4F4F4"/>
+      </w:pPr>
+      <w:r>
+        <w:rPr>
+          <w:rFonts w:ascii="Consolas" w:eastAsia="Consolas" w:hAnsi="Consolas" w:cs="Consolas"/>
+          <w:sz w:val="18"/>
+          <w:szCs w:val="18"/>
+        </w:rPr>
+        <w:t xml:space="preserve">private AccessDeniedHandler auditedHtmlAccessDeniedHandler() {</w:t>
+      </w:r>
+    </w:p>
+    <w:p>
+      <w:pPr>
+        <w:pBdr>
+          <w:left w:val="single" w:sz="18" w:space="6" w:color="C0C0C0"/>
+        </w:pBdr>
+        <w:shd w:val="clear" w:color="auto" w:fill="F4F4F4"/>
+      </w:pPr>
+      <w:r>
+        <w:rPr>
+          <w:rFonts w:ascii="Consolas" w:eastAsia="Consolas" w:hAnsi="Consolas" w:cs="Consolas"/>
+          <w:sz w:val="18"/>
+          <w:szCs w:val="18"/>
+        </w:rPr>
+        <w:t xml:space="preserve">    return (request, response, accessDeniedException) -&gt; {</w:t>
+      </w:r>
+    </w:p>
+    <w:p>
+      <w:pPr>
+        <w:pBdr>
+          <w:left w:val="single" w:sz="18" w:space="6" w:color="C0C0C0"/>
+        </w:pBdr>
+        <w:shd w:val="clear" w:color="auto" w:fill="F4F4F4"/>
+      </w:pPr>
+      <w:r>
+        <w:rPr>
+          <w:rFonts w:ascii="Consolas" w:eastAsia="Consolas" w:hAnsi="Consolas" w:cs="Consolas"/>
+          <w:sz w:val="18"/>
+          <w:szCs w:val="18"/>
+        </w:rPr>
+        <w:t xml:space="preserve">        log.warn("[AUDIT] 접근 거부(403) - {} {} from {} : {}",</w:t>
+      </w:r>
+    </w:p>
+    <w:p>
+      <w:pPr>
+        <w:pBdr>
+          <w:left w:val="single" w:sz="18" w:space="6" w:color="C0C0C0"/>
+        </w:pBdr>
+        <w:shd w:val="clear" w:color="auto" w:fill="F4F4F4"/>
+      </w:pPr>
+      <w:r>
+        <w:rPr>
+          <w:rFonts w:ascii="Consolas" w:eastAsia="Consolas" w:hAnsi="Consolas" w:cs="Consolas"/>
+          <w:sz w:val="18"/>
+          <w:szCs w:val="18"/>
+        </w:rPr>
+        <w:t xml:space="preserve">                request.getMethod(), request.getRequestURI(), clientIp(request),</w:t>
+      </w:r>
+    </w:p>
+    <w:p>
+      <w:pPr>
+        <w:pBdr>
+          <w:left w:val="single" w:sz="18" w:space="6" w:color="C0C0C0"/>
+        </w:pBdr>
+        <w:shd w:val="clear" w:color="auto" w:fill="F4F4F4"/>
+      </w:pPr>
+      <w:r>
+        <w:rPr>
+          <w:rFonts w:ascii="Consolas" w:eastAsia="Consolas" w:hAnsi="Consolas" w:cs="Consolas"/>
+          <w:sz w:val="18"/>
+          <w:szCs w:val="18"/>
+        </w:rPr>
+        <w:t xml:space="preserve">                accessDeniedException.getMessage());</w:t>
+      </w:r>
+    </w:p>
+    <w:p>
+      <w:pPr>
+        <w:pBdr>
+          <w:left w:val="single" w:sz="18" w:space="6" w:color="C0C0C0"/>
+        </w:pBdr>
+        <w:shd w:val="clear" w:color="auto" w:fill="F4F4F4"/>
+      </w:pPr>
+      <w:r>
+        <w:rPr>
+          <w:rFonts w:ascii="Consolas" w:eastAsia="Consolas" w:hAnsi="Consolas" w:cs="Consolas"/>
+          <w:sz w:val="18"/>
+          <w:szCs w:val="18"/>
+        </w:rPr>
+        <w:t xml:space="preserve">        response.sendError(HttpServletResponse.SC_FORBIDDEN, "접근 권한이 없습니다");</w:t>
+      </w:r>
+    </w:p>
+    <w:p>
+      <w:pPr>
+        <w:pBdr>
+          <w:left w:val="single" w:sz="18" w:space="6" w:color="C0C0C0"/>
+        </w:pBdr>
+        <w:shd w:val="clear" w:color="auto" w:fill="F4F4F4"/>
+      </w:pPr>
+      <w:r>
+        <w:rPr>
+          <w:rFonts w:ascii="Consolas" w:eastAsia="Consolas" w:hAnsi="Consolas" w:cs="Consolas"/>
+          <w:sz w:val="18"/>
+          <w:szCs w:val="18"/>
+        </w:rPr>
+        <w:t xml:space="preserve">    };</w:t>
+      </w:r>
+    </w:p>
+    <w:p>
+      <w:pPr>
+        <w:pBdr>
+          <w:left w:val="single" w:sz="18" w:space="6" w:color="C0C0C0"/>
+          <w:bottom w:val="single" w:sz="4" w:space="3" w:color="D9D9D9"/>
+        </w:pBdr>
+        <w:shd w:val="clear" w:color="auto" w:fill="F4F4F4"/>
+      </w:pPr>
+      <w:r>
+        <w:rPr>
+          <w:rFonts w:ascii="Consolas" w:eastAsia="Consolas" w:hAnsi="Consolas" w:cs="Consolas"/>
+          <w:sz w:val="18"/>
+          <w:szCs w:val="18"/>
+        </w:rPr>
+        <w:t xml:space="preserve">}</w:t>
+      </w:r>
+    </w:p>
+    <w:p>
+      <w:pPr>
+        <w:spacing w:before="180" w:after="80" w:line="272" w:lineRule="auto"/>
+      </w:pPr>
+      <w:r>
+        <w:rPr>
+          <w:b/>
+          <w:bCs/>
+          <w:color w:val="1F3864"/>
+        </w:rPr>
+        <w:t>동작 원리</w:t>
+      </w:r>
+    </w:p>
+    <w:p>
+      <w:pPr>
+        <w:spacing w:after="90" w:line="272" w:lineRule="auto"/>
+      </w:pPr>
+      <w:r>
+        <w:t xml:space="preserve">JSON을 직접 작성하는 대신 response.sendError(403, ...)을 호출한다. 서블릿 컨테이너는 sendError()가 호출되면 그 요청을 server.error.path(기본값 /error)로 포워드하고, Spring Boot의 BasicErrorController가 이를 받아 DefaultErrorViewResolver로 상태 코드에 맞는 에러 뷰(error/403)를 찾는다. 이때 templates/error/403.html을 Thymeleaf 템플릿으로 두면(아래), 일반 페이지와 동일하게 </w:t>
+      </w:r>
+      <w:r>
+        <w:rPr>
+          <w:b/>
+          <w:bCs/>
+        </w:rPr>
+        <w:t xml:space="preserve">layout:decorate로 레이아웃(헤더·네비바·푸터)이 그대로 적용된 채</w:t>
+      </w:r>
+      <w:r>
+        <w:t xml:space="preserve"> 렌더링된다. (처음에는 static/error/403.html로 만들었으나, 정적 리소스로는 Thymeleaf 레이아웃을 적용할 수 없어 templates/error/403.html로 옮겼다.)</w:t>
+      </w:r>
+    </w:p>
+    <w:p>
+      <w:pPr>
+        <w:pBdr>
+          <w:top w:val="single" w:sz="4" w:space="3" w:color="D9D9D9"/>
+          <w:left w:val="single" w:sz="18" w:space="6" w:color="C0C0C0"/>
+        </w:pBdr>
+        <w:shd w:val="clear" w:color="auto" w:fill="F4F4F4"/>
+      </w:pPr>
+      <w:r>
+        <w:rPr>
+          <w:rFonts w:ascii="Consolas" w:eastAsia="Consolas" w:hAnsi="Consolas" w:cs="Consolas"/>
+          <w:sz w:val="18"/>
+          <w:szCs w:val="18"/>
+        </w:rPr>
+        <w:t xml:space="preserve">&lt;!-- templates/error/403.html --&gt;</w:t>
+      </w:r>
+    </w:p>
+    <w:p>
+      <w:pPr>
+        <w:pBdr>
+          <w:left w:val="single" w:sz="18" w:space="6" w:color="C0C0C0"/>
+        </w:pBdr>
+        <w:shd w:val="clear" w:color="auto" w:fill="F4F4F4"/>
+      </w:pPr>
+      <w:r>
+        <w:rPr>
+          <w:rFonts w:ascii="Consolas" w:eastAsia="Consolas" w:hAnsi="Consolas" w:cs="Consolas"/>
+          <w:sz w:val="18"/>
+          <w:szCs w:val="18"/>
+        </w:rPr>
+        <w:t xml:space="preserve">&lt;!DOCTYPE html&gt;</w:t>
+      </w:r>
+    </w:p>
+    <w:p>
+      <w:pPr>
+        <w:pBdr>
+          <w:left w:val="single" w:sz="18" w:space="6" w:color="C0C0C0"/>
+        </w:pBdr>
+        <w:shd w:val="clear" w:color="auto" w:fill="F4F4F4"/>
+      </w:pPr>
+      <w:r>
+        <w:rPr>
+          <w:rFonts w:ascii="Consolas" w:eastAsia="Consolas" w:hAnsi="Consolas" w:cs="Consolas"/>
+          <w:sz w:val="18"/>
+          <w:szCs w:val="18"/>
+        </w:rPr>
+        <w:t xml:space="preserve">&lt;html xmlns:th="http://www.thymeleaf.org"</w:t>
+      </w:r>
+    </w:p>
+    <w:p>
+      <w:pPr>
+        <w:pBdr>
+          <w:left w:val="single" w:sz="18" w:space="6" w:color="C0C0C0"/>
+        </w:pBdr>
+        <w:shd w:val="clear" w:color="auto" w:fill="F4F4F4"/>
+      </w:pPr>
+      <w:r>
+        <w:rPr>
+          <w:rFonts w:ascii="Consolas" w:eastAsia="Consolas" w:hAnsi="Consolas" w:cs="Consolas"/>
+          <w:sz w:val="18"/>
+          <w:szCs w:val="18"/>
+        </w:rPr>
+        <w:t xml:space="preserve">      xmlns:layout="http://www.ultraq.net.nz/thymeleaf/layout" layout:decorate="layout/default_layout"&gt;</w:t>
+      </w:r>
+    </w:p>
+    <w:p>
+      <w:pPr>
+        <w:pBdr>
+          <w:left w:val="single" w:sz="18" w:space="6" w:color="C0C0C0"/>
+        </w:pBdr>
+        <w:shd w:val="clear" w:color="auto" w:fill="F4F4F4"/>
+      </w:pPr>
+      <w:r>
+        <w:rPr>
+          <w:rFonts w:ascii="Consolas" w:eastAsia="Consolas" w:hAnsi="Consolas" w:cs="Consolas"/>
+          <w:sz w:val="18"/>
+          <w:szCs w:val="18"/>
+        </w:rPr>
+        <w:t xml:space="preserve">&lt;meta charset="UTF-8"&gt;</w:t>
+      </w:r>
+    </w:p>
+    <w:p>
+      <w:pPr>
+        <w:pBdr>
+          <w:left w:val="single" w:sz="18" w:space="6" w:color="C0C0C0"/>
+        </w:pBdr>
+        <w:shd w:val="clear" w:color="auto" w:fill="F4F4F4"/>
+      </w:pPr>
+      <w:r>
+        <w:rPr>
+          <w:rFonts w:ascii="Consolas" w:eastAsia="Consolas" w:hAnsi="Consolas" w:cs="Consolas"/>
+          <w:sz w:val="18"/>
+          <w:szCs w:val="18"/>
+        </w:rPr>
+        <w:t xml:space="preserve">&lt;th:block layout:fragment="content"&gt;</w:t>
+      </w:r>
+    </w:p>
+    <w:p>
+      <w:pPr>
+        <w:pBdr>
+          <w:left w:val="single" w:sz="18" w:space="6" w:color="C0C0C0"/>
+        </w:pBdr>
+        <w:shd w:val="clear" w:color="auto" w:fill="F4F4F4"/>
+      </w:pPr>
+      <w:r>
+        <w:rPr>
+          <w:rFonts w:ascii="Consolas" w:eastAsia="Consolas" w:hAnsi="Consolas" w:cs="Consolas"/>
+          <w:sz w:val="18"/>
+          <w:szCs w:val="18"/>
+        </w:rPr>
+        <w:t xml:space="preserve">    &lt;div class="container mt-5 text-center"&gt;</w:t>
+      </w:r>
+    </w:p>
+    <w:p>
+      <w:pPr>
+        <w:pBdr>
+          <w:left w:val="single" w:sz="18" w:space="6" w:color="C0C0C0"/>
+        </w:pBdr>
+        <w:shd w:val="clear" w:color="auto" w:fill="F4F4F4"/>
+      </w:pPr>
+      <w:r>
+        <w:rPr>
+          <w:rFonts w:ascii="Consolas" w:eastAsia="Consolas" w:hAnsi="Consolas" w:cs="Consolas"/>
+          <w:sz w:val="18"/>
+          <w:szCs w:val="18"/>
+        </w:rPr>
+        <w:t xml:space="preserve">        &lt;h1 class="display-4"&gt;403&lt;/h1&gt;</w:t>
+      </w:r>
+    </w:p>
+    <w:p>
+      <w:pPr>
+        <w:pBdr>
+          <w:left w:val="single" w:sz="18" w:space="6" w:color="C0C0C0"/>
+        </w:pBdr>
+        <w:shd w:val="clear" w:color="auto" w:fill="F4F4F4"/>
+      </w:pPr>
+      <w:r>
+        <w:rPr>
+          <w:rFonts w:ascii="Consolas" w:eastAsia="Consolas" w:hAnsi="Consolas" w:cs="Consolas"/>
+          <w:sz w:val="18"/>
+          <w:szCs w:val="18"/>
+        </w:rPr>
+        <w:t xml:space="preserve">        &lt;p class="lead"&gt;접근 권한이 없습니다.&lt;/p&gt;</w:t>
+      </w:r>
+    </w:p>
+    <w:p>
+      <w:pPr>
+        <w:pBdr>
+          <w:left w:val="single" w:sz="18" w:space="6" w:color="C0C0C0"/>
+        </w:pBdr>
+        <w:shd w:val="clear" w:color="auto" w:fill="F4F4F4"/>
+      </w:pPr>
+      <w:r>
+        <w:rPr>
+          <w:rFonts w:ascii="Consolas" w:eastAsia="Consolas" w:hAnsi="Consolas" w:cs="Consolas"/>
+          <w:sz w:val="18"/>
+          <w:szCs w:val="18"/>
+        </w:rPr>
+        <w:t xml:space="preserve">        &lt;p class="text-muted"&gt;이 페이지에 접근하려면 필요한 권한(역할)이 없습니다. 해당 요청은 감사 로그에 기록되었습니다.&lt;/p&gt;</w:t>
+      </w:r>
+    </w:p>
+    <w:p>
+      <w:pPr>
+        <w:pBdr>
+          <w:left w:val="single" w:sz="18" w:space="6" w:color="C0C0C0"/>
+        </w:pBdr>
+        <w:shd w:val="clear" w:color="auto" w:fill="F4F4F4"/>
+      </w:pPr>
+      <w:r>
+        <w:rPr>
+          <w:rFonts w:ascii="Consolas" w:eastAsia="Consolas" w:hAnsi="Consolas" w:cs="Consolas"/>
+          <w:sz w:val="18"/>
+          <w:szCs w:val="18"/>
+        </w:rPr>
+        <w:t xml:space="preserve">        &lt;a href="/" class="btn btn-primary mt-3"&gt;홈으로&lt;/a&gt;</w:t>
+      </w:r>
+    </w:p>
+    <w:p>
+      <w:pPr>
+        <w:pBdr>
+          <w:left w:val="single" w:sz="18" w:space="6" w:color="C0C0C0"/>
+        </w:pBdr>
+        <w:shd w:val="clear" w:color="auto" w:fill="F4F4F4"/>
+      </w:pPr>
+      <w:r>
+        <w:rPr>
+          <w:rFonts w:ascii="Consolas" w:eastAsia="Consolas" w:hAnsi="Consolas" w:cs="Consolas"/>
+          <w:sz w:val="18"/>
+          <w:szCs w:val="18"/>
+        </w:rPr>
+        <w:t xml:space="preserve">    &lt;/div&gt;</w:t>
+      </w:r>
+    </w:p>
+    <w:p>
+      <w:pPr>
+        <w:pBdr>
+          <w:left w:val="single" w:sz="18" w:space="6" w:color="C0C0C0"/>
+        </w:pBdr>
+        <w:shd w:val="clear" w:color="auto" w:fill="F4F4F4"/>
+      </w:pPr>
+      <w:r>
+        <w:rPr>
+          <w:rFonts w:ascii="Consolas" w:eastAsia="Consolas" w:hAnsi="Consolas" w:cs="Consolas"/>
+          <w:sz w:val="18"/>
+          <w:szCs w:val="18"/>
+        </w:rPr>
+        <w:t xml:space="preserve">&lt;/th:block&gt;</w:t>
+      </w:r>
+    </w:p>
+    <w:p>
+      <w:pPr>
+        <w:pBdr>
+          <w:left w:val="single" w:sz="18" w:space="6" w:color="C0C0C0"/>
+          <w:bottom w:val="single" w:sz="4" w:space="3" w:color="D9D9D9"/>
+        </w:pBdr>
+        <w:shd w:val="clear" w:color="auto" w:fill="F4F4F4"/>
+      </w:pPr>
+      <w:r>
+        <w:rPr>
+          <w:rFonts w:ascii="Consolas" w:eastAsia="Consolas" w:hAnsi="Consolas" w:cs="Consolas"/>
+          <w:sz w:val="18"/>
+          <w:szCs w:val="18"/>
+        </w:rPr>
+        <w:t xml:space="preserve">&lt;/html&gt;</w:t>
+      </w:r>
+    </w:p>
+    <w:p>
+      <w:pPr>
+        <w:spacing w:before="180" w:after="80" w:line="272" w:lineRule="auto"/>
+      </w:pPr>
+      <w:r>
+        <w:rPr>
+          <w:b/>
+          <w:bCs/>
+          <w:color w:val="1F3864"/>
+        </w:rPr>
+        <w:t>API 체인은 왜 그대로 JSON인가</w:t>
+      </w:r>
+    </w:p>
+    <w:p>
+      <w:pPr>
+        <w:spacing w:after="90" w:line="272" w:lineRule="auto"/>
+      </w:pPr>
+      <w:r>
+        <w:t xml:space="preserve">securityFilterChain(/api/**)의 403은 여전히 auditedAccessDeniedHandler()(writeError()로 JSON 작성)를 그대로 쓴다. REST API 클라이언트는 HTML 에러 페이지를 파싱할 이유가 없고, JSON 구조(statusCode/message/timestamp)를 기대하기 때문이다. 같은 403이라도 </w:t>
+      </w:r>
+      <w:r>
+        <w:rPr>
+          <w:b/>
+          <w:bCs/>
+        </w:rPr>
+        <w:t xml:space="preserve">호출 주체(브라우저 vs API 클라이언트)에 따라 응답 형식을 분리</w:t>
+      </w:r>
+      <w:r>
+        <w:t xml:space="preserve">한 것이지, 로직이나 감사 로그 내용이 달라진 것은 아니다.</w:t>
+      </w:r>
+    </w:p>
+    <w:p>
+      <w:pPr>
+        <w:spacing w:after="90" w:line="272" w:lineRule="auto"/>
+      </w:pPr>
+      <w:r>
+        <w:rPr>
+          <w:b/>
+          <w:bCs/>
+        </w:rPr>
+        <w:t xml:space="preserve">참고 — </w:t>
+      </w:r>
+      <w:r>
+        <w:t xml:space="preserve">401(인증 실패)은 formLoginFilterChain에서 이미 /login으로 리다이렉트되는 것으로 충분한 안내가 되므로, 403과 달리 별도의 error/401.html은 만들지 않았다.</w:t>
       </w:r>
     </w:p>
     <w:p>
@@ -3866,39 +3399,312 @@
           <w:sz w:val="18"/>
           <w:szCs w:val="18"/>
         </w:rPr>
-        <w:t xml:space="preserve">[AUDIT] </w:t>
-      </w:r>
+        <w:t xml:space="preserve">[AUDIT] 로그인 실패 - user=us***@aa.com, reason=BadCredentialsException</w:t>
+      </w:r>
+    </w:p>
+    <w:p>
+      <w:pPr>
+        <w:pBdr>
+          <w:left w:val="single" w:sz="18" w:space="6" w:color="C0C0C0"/>
+          <w:bottom w:val="single" w:sz="4" w:space="3" w:color="D9D9D9"/>
+        </w:pBdr>
+        <w:shd w:val="clear" w:color="auto" w:fill="F4F4F4"/>
+      </w:pPr>
       <w:r>
         <w:rPr>
           <w:rFonts w:ascii="Consolas" w:hAnsi="Consolas"/>
           <w:sz w:val="18"/>
           <w:szCs w:val="18"/>
         </w:rPr>
-        <w:t>로그인</w:t>
-      </w:r>
+        <w:t xml:space="preserve">[AUDIT] 인증 실패(401) - POST /api/userinfos/login from ...::1 : 자격 증명에 실패하였습니다.</w:t>
+      </w:r>
+    </w:p>
+    <w:p>
+      <w:pPr>
+        <w:spacing w:after="70" w:line="272" w:lineRule="auto"/>
+      </w:pPr>
+      <w:r>
+        <w:rPr>
+          <w:b/>
+          <w:bCs/>
+        </w:rPr>
+        <w:t>확인</w:t>
+      </w:r>
+    </w:p>
+    <w:p>
+      <w:pPr>
+        <w:pBdr>
+          <w:top w:val="single" w:sz="4" w:space="3" w:color="D9D9D9"/>
+          <w:left w:val="single" w:sz="18" w:space="6" w:color="C0C0C0"/>
+          <w:bottom w:val="single" w:sz="4" w:space="3" w:color="D9D9D9"/>
+        </w:pBdr>
+        <w:shd w:val="clear" w:color="auto" w:fill="F4F4F4"/>
+      </w:pPr>
       <w:r>
         <w:rPr>
           <w:rFonts w:ascii="Consolas" w:hAnsi="Consolas"/>
           <w:sz w:val="18"/>
           <w:szCs w:val="18"/>
         </w:rPr>
+        <w:t xml:space="preserve">grep -E "로그인 실패|인증 실패" logs/spring.log | tail -2</w:t>
+      </w:r>
+    </w:p>
+    <w:p>
+      <w:pPr>
+        <w:spacing w:after="70" w:line="272" w:lineRule="auto"/>
+      </w:pPr>
+      <w:r>
+        <w:rPr>
+          <w:b/>
+          <w:bCs/>
+          <w:color w:val="2E7D32"/>
+        </w:rPr>
+        <w:t>② 로그인 성공 → HTTP 200 (토큰 발급)</w:t>
+      </w:r>
+    </w:p>
+    <w:p>
+      <w:pPr>
+        <w:spacing w:after="70" w:line="272" w:lineRule="auto"/>
+        <w:rPr>
+          <w:b/>
+          <w:bCs/>
+        </w:rPr>
+      </w:pPr>
+    </w:p>
+    <w:p>
+      <w:pPr>
+        <w:spacing w:after="70" w:line="272" w:lineRule="auto"/>
+      </w:pPr>
+      <w:r>
+        <w:rPr>
+          <w:b/>
+          <w:bCs/>
+        </w:rPr>
+        <w:t>요청</w:t>
+      </w:r>
+    </w:p>
+    <w:p>
+      <w:pPr>
+        <w:pBdr>
+          <w:top w:val="single" w:sz="4" w:space="3" w:color="D9D9D9"/>
+          <w:left w:val="single" w:sz="18" w:space="6" w:color="C0C0C0"/>
+        </w:pBdr>
+        <w:shd w:val="clear" w:color="auto" w:fill="F4F4F4"/>
+      </w:pPr>
+      <w:r>
+        <w:rPr>
+          <w:rFonts w:ascii="Consolas" w:hAnsi="Consolas"/>
+          <w:sz w:val="18"/>
+          <w:szCs w:val="18"/>
+        </w:rPr>
+        <w:t>curl -s -X POST "http://localhost:8080/api/userinfos/login" \</w:t>
+      </w:r>
+    </w:p>
+    <w:p>
+      <w:pPr>
+        <w:pBdr>
+          <w:left w:val="single" w:sz="18" w:space="6" w:color="C0C0C0"/>
+          <w:bottom w:val="single" w:sz="4" w:space="3" w:color="D9D9D9"/>
+        </w:pBdr>
+        <w:shd w:val="clear" w:color="auto" w:fill="F4F4F4"/>
+      </w:pPr>
+      <w:r>
+        <w:rPr>
+          <w:rFonts w:ascii="Consolas" w:hAnsi="Consolas"/>
+          <w:sz w:val="18"/>
+          <w:szCs w:val="18"/>
+        </w:rPr>
+        <w:t xml:space="preserve">  -H "Content-Type: application/json" -d '{"email":"user@aa.com","password":"pwd2"}'</w:t>
+      </w:r>
+    </w:p>
+    <w:p>
+      <w:pPr>
+        <w:spacing w:after="70" w:line="272" w:lineRule="auto"/>
+      </w:pPr>
+      <w:r>
+        <w:rPr>
+          <w:b/>
+          <w:bCs/>
+        </w:rPr>
+        <w:t>출력 로그 (1줄)</w:t>
+      </w:r>
+    </w:p>
+    <w:p>
+      <w:pPr>
+        <w:pBdr>
+          <w:top w:val="single" w:sz="4" w:space="3" w:color="D9D9D9"/>
+          <w:left w:val="single" w:sz="18" w:space="6" w:color="C0C0C0"/>
+          <w:bottom w:val="single" w:sz="4" w:space="3" w:color="D9D9D9"/>
+        </w:pBdr>
+        <w:shd w:val="clear" w:color="auto" w:fill="F4F4F4"/>
+      </w:pPr>
+      <w:r>
+        <w:rPr>
+          <w:rFonts w:ascii="Consolas" w:hAnsi="Consolas"/>
+          <w:sz w:val="18"/>
+          <w:szCs w:val="18"/>
+        </w:rPr>
+        <w:t xml:space="preserve">[AUDIT] 로그인 성공 - user=us***@aa.com</w:t>
+      </w:r>
+    </w:p>
+    <w:p>
+      <w:pPr>
+        <w:spacing w:after="70" w:line="272" w:lineRule="auto"/>
+      </w:pPr>
+      <w:r>
+        <w:rPr>
+          <w:b/>
+          <w:bCs/>
+        </w:rPr>
+        <w:t>확인</w:t>
+      </w:r>
+    </w:p>
+    <w:p>
+      <w:pPr>
+        <w:pBdr>
+          <w:top w:val="single" w:sz="4" w:space="3" w:color="D9D9D9"/>
+          <w:left w:val="single" w:sz="18" w:space="6" w:color="C0C0C0"/>
+          <w:bottom w:val="single" w:sz="4" w:space="3" w:color="D9D9D9"/>
+        </w:pBdr>
+        <w:shd w:val="clear" w:color="auto" w:fill="F4F4F4"/>
+      </w:pPr>
+      <w:r>
+        <w:rPr>
+          <w:rFonts w:ascii="Consolas" w:hAnsi="Consolas"/>
+          <w:sz w:val="18"/>
+          <w:szCs w:val="18"/>
+        </w:rPr>
+        <w:t xml:space="preserve">grep "로그인 성공" logs/spring.log | tail -1</w:t>
+      </w:r>
+    </w:p>
+    <w:p>
+      <w:pPr>
+        <w:spacing w:after="70" w:line="272" w:lineRule="auto"/>
+      </w:pPr>
+      <w:r>
+        <w:rPr>
+          <w:b/>
+          <w:bCs/>
+          <w:color w:val="C00000"/>
+        </w:rPr>
+        <w:t>③ 접근 거부 (user가 admin 프로필) → HTTP 403</w:t>
+      </w:r>
+    </w:p>
+    <w:p>
+      <w:pPr>
+        <w:spacing w:after="70" w:line="272" w:lineRule="auto"/>
+      </w:pPr>
+      <w:r>
+        <w:rPr>
+          <w:b/>
+          <w:bCs/>
+        </w:rPr>
+        <w:t>요청 (</w:t>
+      </w:r>
+      <w:r>
+        <w:rPr>
+          <w:b/>
+          <w:bCs/>
+          <w:color w:val="FF0000"/>
+        </w:rPr>
+        <w:t>TOKEN</w:t>
+      </w:r>
+      <w:r>
+        <w:rPr>
+          <w:rFonts w:hint="eastAsia"/>
+          <w:b/>
+          <w:bCs/>
+          <w:color w:val="FF0000"/>
+        </w:rPr>
+        <w:t>변수의 값은</w:t>
+      </w:r>
+      <w:r>
+        <w:rPr>
+          <w:b/>
+          <w:bCs/>
+          <w:color w:val="FF0000"/>
+        </w:rPr>
+        <w:t xml:space="preserve"> 위 ②에서 받은 </w:t>
+      </w:r>
+      <w:r>
+        <w:rPr>
+          <w:rFonts w:hint="eastAsia"/>
+          <w:b/>
+          <w:bCs/>
+          <w:color w:val="FF0000"/>
+        </w:rPr>
+        <w:t xml:space="preserve">토큰 값을 </w:t>
+      </w:r>
+      <w:r>
+        <w:rPr>
+          <w:b/>
+          <w:bCs/>
+          <w:color w:val="FF0000"/>
+        </w:rPr>
+        <w:t>사용</w:t>
+      </w:r>
+      <w:r>
+        <w:rPr>
+          <w:rFonts w:hint="eastAsia"/>
+          <w:b/>
+          <w:bCs/>
+          <w:color w:val="FF0000"/>
+        </w:rPr>
+        <w:t>해야 합니다.</w:t>
+      </w:r>
+      <w:r>
+        <w:rPr>
+          <w:b/>
+          <w:bCs/>
+          <w:color w:val="FF0000"/>
+        </w:rPr>
         <w:t xml:space="preserve"> </w:t>
       </w:r>
       <w:r>
         <w:rPr>
+          <w:b/>
+          <w:bCs/>
+        </w:rPr>
+        <w:t>)</w:t>
+      </w:r>
+    </w:p>
+    <w:p>
+      <w:pPr>
+        <w:pBdr>
+          <w:top w:val="single" w:sz="4" w:space="3" w:color="D9D9D9"/>
+          <w:left w:val="single" w:sz="18" w:space="6" w:color="C0C0C0"/>
+        </w:pBdr>
+        <w:shd w:val="clear" w:color="auto" w:fill="F4F4F4"/>
+        <w:rPr>
           <w:rFonts w:ascii="Consolas" w:hAnsi="Consolas"/>
           <w:sz w:val="18"/>
           <w:szCs w:val="18"/>
         </w:rPr>
-        <w:t>실패</w:t>
-      </w:r>
+      </w:pPr>
       <w:r>
         <w:rPr>
           <w:rFonts w:ascii="Consolas" w:hAnsi="Consolas"/>
           <w:sz w:val="18"/>
           <w:szCs w:val="18"/>
         </w:rPr>
-        <w:t xml:space="preserve"> - user=us***@aa.com, reason=BadCredentialsException</w:t>
+        <w:t>TOKEN=eyJhbGciOiJIUz</w:t>
+      </w:r>
+    </w:p>
+    <w:p>
+      <w:pPr>
+        <w:pBdr>
+          <w:top w:val="single" w:sz="4" w:space="3" w:color="D9D9D9"/>
+          <w:left w:val="single" w:sz="18" w:space="6" w:color="C0C0C0"/>
+        </w:pBdr>
+        <w:shd w:val="clear" w:color="auto" w:fill="F4F4F4"/>
+      </w:pPr>
+      <w:r>
+        <w:rPr>
+          <w:rFonts w:ascii="Consolas" w:hAnsi="Consolas"/>
+          <w:sz w:val="18"/>
+          <w:szCs w:val="18"/>
+        </w:rPr>
+        <w:t>curl -s -o /dev/null -H "Authorization: Bearer $TOKEN" \</w:t>
       </w:r>
     </w:p>
     <w:p>
@@ -3915,732 +3721,67 @@
           <w:sz w:val="18"/>
           <w:szCs w:val="18"/>
         </w:rPr>
-        <w:t xml:space="preserve">[AUDIT] </w:t>
-      </w:r>
+        <w:t xml:space="preserve">  "http://localhost:8080/api/idor/profiles-safe/1"</w:t>
+      </w:r>
+    </w:p>
+    <w:p>
+      <w:pPr>
+        <w:spacing w:after="70" w:line="272" w:lineRule="auto"/>
+      </w:pPr>
+      <w:r>
+        <w:rPr>
+          <w:b/>
+          <w:bCs/>
+        </w:rPr>
+        <w:t>출력 로그 (1줄)</w:t>
+      </w:r>
+    </w:p>
+    <w:p>
+      <w:pPr>
+        <w:pBdr>
+          <w:top w:val="single" w:sz="4" w:space="3" w:color="D9D9D9"/>
+          <w:left w:val="single" w:sz="18" w:space="6" w:color="C0C0C0"/>
+          <w:bottom w:val="single" w:sz="4" w:space="3" w:color="D9D9D9"/>
+        </w:pBdr>
+        <w:shd w:val="clear" w:color="auto" w:fill="F4F4F4"/>
+      </w:pPr>
       <w:r>
         <w:rPr>
           <w:rFonts w:ascii="Consolas" w:hAnsi="Consolas"/>
           <w:sz w:val="18"/>
           <w:szCs w:val="18"/>
         </w:rPr>
-        <w:t>인증</w:t>
-      </w:r>
+        <w:t xml:space="preserve">[AUDIT] 접근 거부(403) - GET /api/idor/profiles-safe/1 from ...::1 : 본인 또는 관리자만 조회할 수 있습니다</w:t>
+      </w:r>
+    </w:p>
+    <w:p>
+      <w:pPr>
+        <w:spacing w:after="70" w:line="272" w:lineRule="auto"/>
+      </w:pPr>
+      <w:r>
+        <w:rPr>
+          <w:b/>
+          <w:bCs/>
+        </w:rPr>
+        <w:t>확인</w:t>
+      </w:r>
+    </w:p>
+    <w:p>
+      <w:pPr>
+        <w:pBdr>
+          <w:top w:val="single" w:sz="4" w:space="3" w:color="D9D9D9"/>
+          <w:left w:val="single" w:sz="18" w:space="6" w:color="C0C0C0"/>
+          <w:bottom w:val="single" w:sz="4" w:space="3" w:color="D9D9D9"/>
+        </w:pBdr>
+        <w:shd w:val="clear" w:color="auto" w:fill="F4F4F4"/>
+      </w:pPr>
       <w:r>
         <w:rPr>
           <w:rFonts w:ascii="Consolas" w:hAnsi="Consolas"/>
           <w:sz w:val="18"/>
           <w:szCs w:val="18"/>
         </w:rPr>
-        <w:t xml:space="preserve"> </w:t>
-      </w:r>
-      <w:r>
-        <w:rPr>
-          <w:rFonts w:ascii="Consolas" w:hAnsi="Consolas"/>
-          <w:sz w:val="18"/>
-          <w:szCs w:val="18"/>
-        </w:rPr>
-        <w:t>실패</w:t>
-      </w:r>
-      <w:r>
-        <w:rPr>
-          <w:rFonts w:ascii="Consolas" w:hAnsi="Consolas"/>
-          <w:sz w:val="18"/>
-          <w:szCs w:val="18"/>
-        </w:rPr>
-        <w:t xml:space="preserve">(401) - POST /api/userinfos/login from ...::1 : </w:t>
-      </w:r>
-      <w:r>
-        <w:rPr>
-          <w:rFonts w:ascii="Consolas" w:hAnsi="Consolas"/>
-          <w:sz w:val="18"/>
-          <w:szCs w:val="18"/>
-        </w:rPr>
-        <w:t>자격</w:t>
-      </w:r>
-      <w:r>
-        <w:rPr>
-          <w:rFonts w:ascii="Consolas" w:hAnsi="Consolas"/>
-          <w:sz w:val="18"/>
-          <w:szCs w:val="18"/>
-        </w:rPr>
-        <w:t xml:space="preserve"> </w:t>
-      </w:r>
-      <w:r>
-        <w:rPr>
-          <w:rFonts w:ascii="Consolas" w:hAnsi="Consolas"/>
-          <w:sz w:val="18"/>
-          <w:szCs w:val="18"/>
-        </w:rPr>
-        <w:t>증명에</w:t>
-      </w:r>
-      <w:r>
-        <w:rPr>
-          <w:rFonts w:ascii="Consolas" w:hAnsi="Consolas"/>
-          <w:sz w:val="18"/>
-          <w:szCs w:val="18"/>
-        </w:rPr>
-        <w:t xml:space="preserve"> </w:t>
-      </w:r>
-      <w:r>
-        <w:rPr>
-          <w:rFonts w:ascii="Consolas" w:hAnsi="Consolas"/>
-          <w:sz w:val="18"/>
-          <w:szCs w:val="18"/>
-        </w:rPr>
-        <w:t>실패하였습니다</w:t>
-      </w:r>
-      <w:r>
-        <w:rPr>
-          <w:rFonts w:ascii="Consolas" w:hAnsi="Consolas"/>
-          <w:sz w:val="18"/>
-          <w:szCs w:val="18"/>
-        </w:rPr>
-        <w:t>.</w:t>
-      </w:r>
-    </w:p>
-    <w:p>
-      <w:pPr>
-        <w:spacing w:after="70" w:line="272" w:lineRule="auto"/>
-      </w:pPr>
-      <w:r>
-        <w:rPr>
-          <w:b/>
-          <w:bCs/>
-        </w:rPr>
-        <w:t>확인</w:t>
-      </w:r>
-    </w:p>
-    <w:p>
-      <w:pPr>
-        <w:pBdr>
-          <w:top w:val="single" w:sz="4" w:space="3" w:color="D9D9D9"/>
-          <w:left w:val="single" w:sz="18" w:space="6" w:color="C0C0C0"/>
-          <w:bottom w:val="single" w:sz="4" w:space="3" w:color="D9D9D9"/>
-        </w:pBdr>
-        <w:shd w:val="clear" w:color="auto" w:fill="F4F4F4"/>
-      </w:pPr>
-      <w:r>
-        <w:rPr>
-          <w:rFonts w:ascii="Consolas" w:hAnsi="Consolas"/>
-          <w:sz w:val="18"/>
-          <w:szCs w:val="18"/>
-        </w:rPr>
-        <w:t>grep -E "</w:t>
-      </w:r>
-      <w:r>
-        <w:rPr>
-          <w:rFonts w:ascii="Consolas" w:hAnsi="Consolas"/>
-          <w:sz w:val="18"/>
-          <w:szCs w:val="18"/>
-        </w:rPr>
-        <w:t>로그인</w:t>
-      </w:r>
-      <w:r>
-        <w:rPr>
-          <w:rFonts w:ascii="Consolas" w:hAnsi="Consolas"/>
-          <w:sz w:val="18"/>
-          <w:szCs w:val="18"/>
-        </w:rPr>
-        <w:t xml:space="preserve"> </w:t>
-      </w:r>
-      <w:r>
-        <w:rPr>
-          <w:rFonts w:ascii="Consolas" w:hAnsi="Consolas"/>
-          <w:sz w:val="18"/>
-          <w:szCs w:val="18"/>
-        </w:rPr>
-        <w:t>실패</w:t>
-      </w:r>
-      <w:r>
-        <w:rPr>
-          <w:rFonts w:ascii="Consolas" w:hAnsi="Consolas"/>
-          <w:sz w:val="18"/>
-          <w:szCs w:val="18"/>
-        </w:rPr>
-        <w:t>|</w:t>
-      </w:r>
-      <w:r>
-        <w:rPr>
-          <w:rFonts w:ascii="Consolas" w:hAnsi="Consolas"/>
-          <w:sz w:val="18"/>
-          <w:szCs w:val="18"/>
-        </w:rPr>
-        <w:t>인증</w:t>
-      </w:r>
-      <w:r>
-        <w:rPr>
-          <w:rFonts w:ascii="Consolas" w:hAnsi="Consolas"/>
-          <w:sz w:val="18"/>
-          <w:szCs w:val="18"/>
-        </w:rPr>
-        <w:t xml:space="preserve"> </w:t>
-      </w:r>
-      <w:r>
-        <w:rPr>
-          <w:rFonts w:ascii="Consolas" w:hAnsi="Consolas"/>
-          <w:sz w:val="18"/>
-          <w:szCs w:val="18"/>
-        </w:rPr>
-        <w:t>실패</w:t>
-      </w:r>
-      <w:r>
-        <w:rPr>
-          <w:rFonts w:ascii="Consolas" w:hAnsi="Consolas"/>
-          <w:sz w:val="18"/>
-          <w:szCs w:val="18"/>
-        </w:rPr>
-        <w:t>" logs/spring.log | tail -2</w:t>
-      </w:r>
-    </w:p>
-    <w:p>
-      <w:pPr>
-        <w:spacing w:after="70" w:line="272" w:lineRule="auto"/>
-      </w:pPr>
-      <w:r>
-        <w:rPr>
-          <w:b/>
-          <w:bCs/>
-          <w:color w:val="2E7D32"/>
-        </w:rPr>
-        <w:t>② 로그인 성공 → HTTP 200 (토큰 발급)</w:t>
-      </w:r>
-    </w:p>
-    <w:p>
-      <w:pPr>
-        <w:spacing w:after="70" w:line="272" w:lineRule="auto"/>
-        <w:rPr>
-          <w:b/>
-          <w:bCs/>
-        </w:rPr>
-      </w:pPr>
-    </w:p>
-    <w:p>
-      <w:pPr>
-        <w:spacing w:after="70" w:line="272" w:lineRule="auto"/>
-      </w:pPr>
-      <w:r>
-        <w:rPr>
-          <w:b/>
-          <w:bCs/>
-        </w:rPr>
-        <w:t>요청</w:t>
-      </w:r>
-    </w:p>
-    <w:p>
-      <w:pPr>
-        <w:pBdr>
-          <w:top w:val="single" w:sz="4" w:space="3" w:color="D9D9D9"/>
-          <w:left w:val="single" w:sz="18" w:space="6" w:color="C0C0C0"/>
-        </w:pBdr>
-        <w:shd w:val="clear" w:color="auto" w:fill="F4F4F4"/>
-      </w:pPr>
-      <w:r>
-        <w:rPr>
-          <w:rFonts w:ascii="Consolas" w:hAnsi="Consolas"/>
-          <w:sz w:val="18"/>
-          <w:szCs w:val="18"/>
-        </w:rPr>
-        <w:t>curl -s -X POST "http://localhost:8080/api/userinfos/login" \</w:t>
-      </w:r>
-    </w:p>
-    <w:p>
-      <w:pPr>
-        <w:pBdr>
-          <w:left w:val="single" w:sz="18" w:space="6" w:color="C0C0C0"/>
-          <w:bottom w:val="single" w:sz="4" w:space="3" w:color="D9D9D9"/>
-        </w:pBdr>
-        <w:shd w:val="clear" w:color="auto" w:fill="F4F4F4"/>
-      </w:pPr>
-      <w:r>
-        <w:rPr>
-          <w:rFonts w:ascii="Consolas" w:hAnsi="Consolas"/>
-          <w:sz w:val="18"/>
-          <w:szCs w:val="18"/>
-        </w:rPr>
-        <w:t xml:space="preserve">  -H "Content-Type: application/json" -d '{"email":"user@aa.com","password":"pwd2"}'</w:t>
-      </w:r>
-    </w:p>
-    <w:p>
-      <w:pPr>
-        <w:spacing w:after="70" w:line="272" w:lineRule="auto"/>
-      </w:pPr>
-      <w:r>
-        <w:rPr>
-          <w:b/>
-          <w:bCs/>
-        </w:rPr>
-        <w:t>출력 로그 (1줄)</w:t>
-      </w:r>
-    </w:p>
-    <w:p>
-      <w:pPr>
-        <w:pBdr>
-          <w:top w:val="single" w:sz="4" w:space="3" w:color="D9D9D9"/>
-          <w:left w:val="single" w:sz="18" w:space="6" w:color="C0C0C0"/>
-          <w:bottom w:val="single" w:sz="4" w:space="3" w:color="D9D9D9"/>
-        </w:pBdr>
-        <w:shd w:val="clear" w:color="auto" w:fill="F4F4F4"/>
-      </w:pPr>
-      <w:r>
-        <w:rPr>
-          <w:rFonts w:ascii="Consolas" w:hAnsi="Consolas"/>
-          <w:sz w:val="18"/>
-          <w:szCs w:val="18"/>
-        </w:rPr>
-        <w:t xml:space="preserve">[AUDIT] </w:t>
-      </w:r>
-      <w:r>
-        <w:rPr>
-          <w:rFonts w:ascii="Consolas" w:hAnsi="Consolas"/>
-          <w:sz w:val="18"/>
-          <w:szCs w:val="18"/>
-        </w:rPr>
-        <w:t>로그인</w:t>
-      </w:r>
-      <w:r>
-        <w:rPr>
-          <w:rFonts w:ascii="Consolas" w:hAnsi="Consolas"/>
-          <w:sz w:val="18"/>
-          <w:szCs w:val="18"/>
-        </w:rPr>
-        <w:t xml:space="preserve"> </w:t>
-      </w:r>
-      <w:r>
-        <w:rPr>
-          <w:rFonts w:ascii="Consolas" w:hAnsi="Consolas"/>
-          <w:sz w:val="18"/>
-          <w:szCs w:val="18"/>
-        </w:rPr>
-        <w:t>성공</w:t>
-      </w:r>
-      <w:r>
-        <w:rPr>
-          <w:rFonts w:ascii="Consolas" w:hAnsi="Consolas"/>
-          <w:sz w:val="18"/>
-          <w:szCs w:val="18"/>
-        </w:rPr>
-        <w:t xml:space="preserve"> - user=us***@aa.com</w:t>
-      </w:r>
-    </w:p>
-    <w:p>
-      <w:pPr>
-        <w:spacing w:after="70" w:line="272" w:lineRule="auto"/>
-      </w:pPr>
-      <w:r>
-        <w:rPr>
-          <w:b/>
-          <w:bCs/>
-        </w:rPr>
-        <w:t>확인</w:t>
-      </w:r>
-    </w:p>
-    <w:p>
-      <w:pPr>
-        <w:pBdr>
-          <w:top w:val="single" w:sz="4" w:space="3" w:color="D9D9D9"/>
-          <w:left w:val="single" w:sz="18" w:space="6" w:color="C0C0C0"/>
-          <w:bottom w:val="single" w:sz="4" w:space="3" w:color="D9D9D9"/>
-        </w:pBdr>
-        <w:shd w:val="clear" w:color="auto" w:fill="F4F4F4"/>
-      </w:pPr>
-      <w:r>
-        <w:rPr>
-          <w:rFonts w:ascii="Consolas" w:hAnsi="Consolas"/>
-          <w:sz w:val="18"/>
-          <w:szCs w:val="18"/>
-        </w:rPr>
-        <w:t>grep "</w:t>
-      </w:r>
-      <w:r>
-        <w:rPr>
-          <w:rFonts w:ascii="Consolas" w:hAnsi="Consolas"/>
-          <w:sz w:val="18"/>
-          <w:szCs w:val="18"/>
-        </w:rPr>
-        <w:t>로그인</w:t>
-      </w:r>
-      <w:r>
-        <w:rPr>
-          <w:rFonts w:ascii="Consolas" w:hAnsi="Consolas"/>
-          <w:sz w:val="18"/>
-          <w:szCs w:val="18"/>
-        </w:rPr>
-        <w:t xml:space="preserve"> </w:t>
-      </w:r>
-      <w:r>
-        <w:rPr>
-          <w:rFonts w:ascii="Consolas" w:hAnsi="Consolas"/>
-          <w:sz w:val="18"/>
-          <w:szCs w:val="18"/>
-        </w:rPr>
-        <w:t>성공</w:t>
-      </w:r>
-      <w:r>
-        <w:rPr>
-          <w:rFonts w:ascii="Consolas" w:hAnsi="Consolas"/>
-          <w:sz w:val="18"/>
-          <w:szCs w:val="18"/>
-        </w:rPr>
-        <w:t>" logs/spring.log | tail -1</w:t>
-      </w:r>
-    </w:p>
-    <w:p>
-      <w:pPr>
-        <w:spacing w:after="70" w:line="272" w:lineRule="auto"/>
-      </w:pPr>
-      <w:r>
-        <w:rPr>
-          <w:b/>
-          <w:bCs/>
-          <w:color w:val="C00000"/>
-        </w:rPr>
-        <w:t>③ 접근 거부 (user가 admin 프로필) → HTTP 403</w:t>
-      </w:r>
-    </w:p>
-    <w:p>
-      <w:pPr>
-        <w:spacing w:after="70" w:line="272" w:lineRule="auto"/>
-      </w:pPr>
-      <w:r>
-        <w:rPr>
-          <w:b/>
-          <w:bCs/>
-        </w:rPr>
-        <w:t>요청 (</w:t>
-      </w:r>
-      <w:r>
-        <w:rPr>
-          <w:b/>
-          <w:bCs/>
-          <w:color w:val="FF0000"/>
-        </w:rPr>
-        <w:t>TOKEN</w:t>
-      </w:r>
-      <w:r>
-        <w:rPr>
-          <w:rFonts w:hint="eastAsia"/>
-          <w:b/>
-          <w:bCs/>
-          <w:color w:val="FF0000"/>
-        </w:rPr>
-        <w:t>변수의 값은</w:t>
-      </w:r>
-      <w:r>
-        <w:rPr>
-          <w:b/>
-          <w:bCs/>
-          <w:color w:val="FF0000"/>
-        </w:rPr>
-        <w:t xml:space="preserve"> 위 ②에서 받은 </w:t>
-      </w:r>
-      <w:r>
-        <w:rPr>
-          <w:rFonts w:hint="eastAsia"/>
-          <w:b/>
-          <w:bCs/>
-          <w:color w:val="FF0000"/>
-        </w:rPr>
-        <w:t xml:space="preserve">토큰 값을 </w:t>
-      </w:r>
-      <w:r>
-        <w:rPr>
-          <w:b/>
-          <w:bCs/>
-          <w:color w:val="FF0000"/>
-        </w:rPr>
-        <w:t>사용</w:t>
-      </w:r>
-      <w:r>
-        <w:rPr>
-          <w:rFonts w:hint="eastAsia"/>
-          <w:b/>
-          <w:bCs/>
-          <w:color w:val="FF0000"/>
-        </w:rPr>
-        <w:t>해야 합니다.</w:t>
-      </w:r>
-      <w:r>
-        <w:rPr>
-          <w:b/>
-          <w:bCs/>
-          <w:color w:val="FF0000"/>
-        </w:rPr>
-        <w:t xml:space="preserve"> </w:t>
-      </w:r>
-      <w:r>
-        <w:rPr>
-          <w:b/>
-          <w:bCs/>
-        </w:rPr>
-        <w:t>)</w:t>
-      </w:r>
-    </w:p>
-    <w:p>
-      <w:pPr>
-        <w:pBdr>
-          <w:top w:val="single" w:sz="4" w:space="3" w:color="D9D9D9"/>
-          <w:left w:val="single" w:sz="18" w:space="6" w:color="C0C0C0"/>
-        </w:pBdr>
-        <w:shd w:val="clear" w:color="auto" w:fill="F4F4F4"/>
-        <w:rPr>
-          <w:rFonts w:ascii="Consolas" w:hAnsi="Consolas"/>
-          <w:sz w:val="18"/>
-          <w:szCs w:val="18"/>
-        </w:rPr>
-      </w:pPr>
-      <w:r>
-        <w:rPr>
-          <w:rFonts w:ascii="Consolas" w:hAnsi="Consolas"/>
-          <w:sz w:val="18"/>
-          <w:szCs w:val="18"/>
-        </w:rPr>
-        <w:t>TOKEN=eyJhbGciOiJIUz</w:t>
-      </w:r>
-    </w:p>
-    <w:p>
-      <w:pPr>
-        <w:pBdr>
-          <w:top w:val="single" w:sz="4" w:space="3" w:color="D9D9D9"/>
-          <w:left w:val="single" w:sz="18" w:space="6" w:color="C0C0C0"/>
-        </w:pBdr>
-        <w:shd w:val="clear" w:color="auto" w:fill="F4F4F4"/>
-      </w:pPr>
-      <w:r>
-        <w:rPr>
-          <w:rFonts w:ascii="Consolas" w:hAnsi="Consolas"/>
-          <w:sz w:val="18"/>
-          <w:szCs w:val="18"/>
-        </w:rPr>
-        <w:t>curl -s -o /dev/null -H "Authorization: Bearer $TOKEN" \</w:t>
-      </w:r>
-    </w:p>
-    <w:p>
-      <w:pPr>
-        <w:pBdr>
-          <w:left w:val="single" w:sz="18" w:space="6" w:color="C0C0C0"/>
-          <w:bottom w:val="single" w:sz="4" w:space="3" w:color="D9D9D9"/>
-        </w:pBdr>
-        <w:shd w:val="clear" w:color="auto" w:fill="F4F4F4"/>
-      </w:pPr>
-      <w:r>
-        <w:rPr>
-          <w:rFonts w:ascii="Consolas" w:hAnsi="Consolas"/>
-          <w:sz w:val="18"/>
-          <w:szCs w:val="18"/>
-        </w:rPr>
-        <w:t xml:space="preserve">  "http://localhost:8080/api/idor/profiles-safe/1"</w:t>
-      </w:r>
-    </w:p>
-    <w:p>
-      <w:pPr>
-        <w:spacing w:after="70" w:line="272" w:lineRule="auto"/>
-      </w:pPr>
-      <w:r>
-        <w:rPr>
-          <w:b/>
-          <w:bCs/>
-        </w:rPr>
-        <w:t>출력 로그 (1줄)</w:t>
-      </w:r>
-    </w:p>
-    <w:p>
-      <w:pPr>
-        <w:pBdr>
-          <w:top w:val="single" w:sz="4" w:space="3" w:color="D9D9D9"/>
-          <w:left w:val="single" w:sz="18" w:space="6" w:color="C0C0C0"/>
-          <w:bottom w:val="single" w:sz="4" w:space="3" w:color="D9D9D9"/>
-        </w:pBdr>
-        <w:shd w:val="clear" w:color="auto" w:fill="F4F4F4"/>
-      </w:pPr>
-      <w:r>
-        <w:rPr>
-          <w:rFonts w:ascii="Consolas" w:hAnsi="Consolas"/>
-          <w:sz w:val="18"/>
-          <w:szCs w:val="18"/>
-        </w:rPr>
-        <w:t xml:space="preserve">[AUDIT] </w:t>
-      </w:r>
-      <w:r>
-        <w:rPr>
-          <w:rFonts w:ascii="Consolas" w:hAnsi="Consolas"/>
-          <w:sz w:val="18"/>
-          <w:szCs w:val="18"/>
-        </w:rPr>
-        <w:t>접근</w:t>
-      </w:r>
-      <w:r>
-        <w:rPr>
-          <w:rFonts w:ascii="Consolas" w:hAnsi="Consolas"/>
-          <w:sz w:val="18"/>
-          <w:szCs w:val="18"/>
-        </w:rPr>
-        <w:t xml:space="preserve"> </w:t>
-      </w:r>
-      <w:r>
-        <w:rPr>
-          <w:rFonts w:ascii="Consolas" w:hAnsi="Consolas"/>
-          <w:sz w:val="18"/>
-          <w:szCs w:val="18"/>
-        </w:rPr>
-        <w:t>거부</w:t>
-      </w:r>
-      <w:r>
-        <w:rPr>
-          <w:rFonts w:ascii="Consolas" w:hAnsi="Consolas"/>
-          <w:sz w:val="18"/>
-          <w:szCs w:val="18"/>
-        </w:rPr>
-        <w:t xml:space="preserve">(403) - GET /api/idor/profiles-safe/1 from ...::1 : </w:t>
-      </w:r>
-      <w:r>
-        <w:rPr>
-          <w:rFonts w:ascii="Consolas" w:hAnsi="Consolas"/>
-          <w:sz w:val="18"/>
-          <w:szCs w:val="18"/>
-        </w:rPr>
-        <w:t>본인</w:t>
-      </w:r>
-      <w:r>
-        <w:rPr>
-          <w:rFonts w:ascii="Consolas" w:hAnsi="Consolas"/>
-          <w:sz w:val="18"/>
-          <w:szCs w:val="18"/>
-        </w:rPr>
-        <w:t xml:space="preserve"> </w:t>
-      </w:r>
-      <w:r>
-        <w:rPr>
-          <w:rFonts w:ascii="Consolas" w:hAnsi="Consolas"/>
-          <w:sz w:val="18"/>
-          <w:szCs w:val="18"/>
-        </w:rPr>
-        <w:t>또는</w:t>
-      </w:r>
-      <w:r>
-        <w:rPr>
-          <w:rFonts w:ascii="Consolas" w:hAnsi="Consolas"/>
-          <w:sz w:val="18"/>
-          <w:szCs w:val="18"/>
-        </w:rPr>
-        <w:t xml:space="preserve"> </w:t>
-      </w:r>
-      <w:r>
-        <w:rPr>
-          <w:rFonts w:ascii="Consolas" w:hAnsi="Consolas"/>
-          <w:sz w:val="18"/>
-          <w:szCs w:val="18"/>
-        </w:rPr>
-        <w:t>관리자만</w:t>
-      </w:r>
-      <w:r>
-        <w:rPr>
-          <w:rFonts w:ascii="Consolas" w:hAnsi="Consolas"/>
-          <w:sz w:val="18"/>
-          <w:szCs w:val="18"/>
-        </w:rPr>
-        <w:t xml:space="preserve"> </w:t>
-      </w:r>
-      <w:r>
-        <w:rPr>
-          <w:rFonts w:ascii="Consolas" w:hAnsi="Consolas"/>
-          <w:sz w:val="18"/>
-          <w:szCs w:val="18"/>
-        </w:rPr>
-        <w:t>조회할</w:t>
-      </w:r>
-      <w:r>
-        <w:rPr>
-          <w:rFonts w:ascii="Consolas" w:hAnsi="Consolas"/>
-          <w:sz w:val="18"/>
-          <w:szCs w:val="18"/>
-        </w:rPr>
-        <w:t xml:space="preserve"> </w:t>
-      </w:r>
-      <w:r>
-        <w:rPr>
-          <w:rFonts w:ascii="Consolas" w:hAnsi="Consolas"/>
-          <w:sz w:val="18"/>
-          <w:szCs w:val="18"/>
-        </w:rPr>
-        <w:t>수</w:t>
-      </w:r>
-      <w:r>
-        <w:rPr>
-          <w:rFonts w:ascii="Consolas" w:hAnsi="Consolas"/>
-          <w:sz w:val="18"/>
-          <w:szCs w:val="18"/>
-        </w:rPr>
-        <w:t xml:space="preserve"> </w:t>
-      </w:r>
-      <w:r>
-        <w:rPr>
-          <w:rFonts w:ascii="Consolas" w:hAnsi="Consolas"/>
-          <w:sz w:val="18"/>
-          <w:szCs w:val="18"/>
-        </w:rPr>
-        <w:t>있습니다</w:t>
-      </w:r>
-    </w:p>
-    <w:p>
-      <w:pPr>
-        <w:spacing w:after="70" w:line="272" w:lineRule="auto"/>
-      </w:pPr>
-      <w:r>
-        <w:rPr>
-          <w:b/>
-          <w:bCs/>
-        </w:rPr>
-        <w:t>확인</w:t>
-      </w:r>
-    </w:p>
-    <w:p>
-      <w:pPr>
-        <w:pBdr>
-          <w:top w:val="single" w:sz="4" w:space="3" w:color="D9D9D9"/>
-          <w:left w:val="single" w:sz="18" w:space="6" w:color="C0C0C0"/>
-          <w:bottom w:val="single" w:sz="4" w:space="3" w:color="D9D9D9"/>
-        </w:pBdr>
-        <w:shd w:val="clear" w:color="auto" w:fill="F4F4F4"/>
-      </w:pPr>
-      <w:r>
-        <w:rPr>
-          <w:rFonts w:ascii="Consolas" w:hAnsi="Consolas"/>
-          <w:sz w:val="18"/>
-          <w:szCs w:val="18"/>
-        </w:rPr>
-        <w:t>grep "</w:t>
-      </w:r>
-      <w:r>
-        <w:rPr>
-          <w:rFonts w:ascii="Consolas" w:hAnsi="Consolas"/>
-          <w:sz w:val="18"/>
-          <w:szCs w:val="18"/>
-        </w:rPr>
-        <w:t>접근</w:t>
-      </w:r>
-      <w:r>
-        <w:rPr>
-          <w:rFonts w:ascii="Consolas" w:hAnsi="Consolas"/>
-          <w:sz w:val="18"/>
-          <w:szCs w:val="18"/>
-        </w:rPr>
-        <w:t xml:space="preserve"> </w:t>
-      </w:r>
-      <w:r>
-        <w:rPr>
-          <w:rFonts w:ascii="Consolas" w:hAnsi="Consolas"/>
-          <w:sz w:val="18"/>
-          <w:szCs w:val="18"/>
-        </w:rPr>
-        <w:t>거부</w:t>
-      </w:r>
-      <w:r>
-        <w:rPr>
-          <w:rFonts w:ascii="Consolas" w:hAnsi="Consolas"/>
-          <w:sz w:val="18"/>
-          <w:szCs w:val="18"/>
-        </w:rPr>
-        <w:t>" logs/spring.log | tail -1</w:t>
+        <w:t xml:space="preserve">grep "접근 거부" logs/spring.log | tail -1</w:t>
       </w:r>
     </w:p>
     <w:p>
@@ -4850,279 +3991,55 @@
           <w:sz w:val="18"/>
           <w:szCs w:val="18"/>
         </w:rPr>
-        <w:t xml:space="preserve">    // </w:t>
-      </w:r>
+        <w:t xml:space="preserve">    // 내부 로그: 상세 + traceId</w:t>
+      </w:r>
+    </w:p>
+    <w:p>
+      <w:pPr>
+        <w:pBdr>
+          <w:left w:val="single" w:sz="18" w:space="6" w:color="C0C0C0"/>
+        </w:pBdr>
+        <w:shd w:val="clear" w:color="auto" w:fill="F4F4F4"/>
+      </w:pPr>
       <w:r>
         <w:rPr>
           <w:rFonts w:ascii="Consolas" w:hAnsi="Consolas"/>
           <w:sz w:val="18"/>
           <w:szCs w:val="18"/>
         </w:rPr>
-        <w:t>내부</w:t>
-      </w:r>
+        <w:t xml:space="preserve">    log.error("[ERROR][{}] {} {} : {}", traceId, request.getMethod(), request.getRequestURI(), e.getMessage(), e);</w:t>
+      </w:r>
+    </w:p>
+    <w:p>
+      <w:pPr>
+        <w:pBdr>
+          <w:left w:val="single" w:sz="18" w:space="6" w:color="C0C0C0"/>
+        </w:pBdr>
+        <w:shd w:val="clear" w:color="auto" w:fill="F4F4F4"/>
+      </w:pPr>
       <w:r>
         <w:rPr>
           <w:rFonts w:ascii="Consolas" w:hAnsi="Consolas"/>
           <w:sz w:val="18"/>
           <w:szCs w:val="18"/>
         </w:rPr>
-        <w:t xml:space="preserve"> </w:t>
-      </w:r>
+        <w:t xml:space="preserve">    // 외부 응답: 일반 메시지 + traceId (내부 메시지 숨김)</w:t>
+      </w:r>
+    </w:p>
+    <w:p>
+      <w:pPr>
+        <w:pBdr>
+          <w:left w:val="single" w:sz="18" w:space="6" w:color="C0C0C0"/>
+        </w:pBdr>
+        <w:shd w:val="clear" w:color="auto" w:fill="F4F4F4"/>
+      </w:pPr>
       <w:r>
         <w:rPr>
           <w:rFonts w:ascii="Consolas" w:hAnsi="Consolas"/>
           <w:sz w:val="18"/>
           <w:szCs w:val="18"/>
         </w:rPr>
-        <w:t>로그</w:t>
-      </w:r>
-      <w:r>
-        <w:rPr>
-          <w:rFonts w:ascii="Consolas" w:hAnsi="Consolas"/>
-          <w:sz w:val="18"/>
-          <w:szCs w:val="18"/>
-        </w:rPr>
-        <w:t xml:space="preserve">: </w:t>
-      </w:r>
-      <w:r>
-        <w:rPr>
-          <w:rFonts w:ascii="Consolas" w:hAnsi="Consolas"/>
-          <w:sz w:val="18"/>
-          <w:szCs w:val="18"/>
-        </w:rPr>
-        <w:t>상세</w:t>
-      </w:r>
-      <w:r>
-        <w:rPr>
-          <w:rFonts w:ascii="Consolas" w:hAnsi="Consolas"/>
-          <w:sz w:val="18"/>
-          <w:szCs w:val="18"/>
-        </w:rPr>
-        <w:t xml:space="preserve"> + traceId</w:t>
-      </w:r>
-    </w:p>
-    <w:p>
-      <w:pPr>
-        <w:pBdr>
-          <w:left w:val="single" w:sz="18" w:space="6" w:color="C0C0C0"/>
-        </w:pBdr>
-        <w:shd w:val="clear" w:color="auto" w:fill="F4F4F4"/>
-      </w:pPr>
-      <w:r>
-        <w:rPr>
-          <w:rFonts w:ascii="Consolas" w:hAnsi="Consolas"/>
-          <w:sz w:val="18"/>
-          <w:szCs w:val="18"/>
-        </w:rPr>
-        <w:t xml:space="preserve">    log.error("[ERROR][{}] {} {} : {}", traceId, request.getMethod(), request.getRequestURI(), e.getMessage(), e);</w:t>
-      </w:r>
-    </w:p>
-    <w:p>
-      <w:pPr>
-        <w:pBdr>
-          <w:left w:val="single" w:sz="18" w:space="6" w:color="C0C0C0"/>
-        </w:pBdr>
-        <w:shd w:val="clear" w:color="auto" w:fill="F4F4F4"/>
-      </w:pPr>
-      <w:r>
-        <w:rPr>
-          <w:rFonts w:ascii="Consolas" w:hAnsi="Consolas"/>
-          <w:sz w:val="18"/>
-          <w:szCs w:val="18"/>
-        </w:rPr>
-        <w:t xml:space="preserve">    // </w:t>
-      </w:r>
-      <w:r>
-        <w:rPr>
-          <w:rFonts w:ascii="Consolas" w:hAnsi="Consolas"/>
-          <w:sz w:val="18"/>
-          <w:szCs w:val="18"/>
-        </w:rPr>
-        <w:t>외부</w:t>
-      </w:r>
-      <w:r>
-        <w:rPr>
-          <w:rFonts w:ascii="Consolas" w:hAnsi="Consolas"/>
-          <w:sz w:val="18"/>
-          <w:szCs w:val="18"/>
-        </w:rPr>
-        <w:t xml:space="preserve"> </w:t>
-      </w:r>
-      <w:r>
-        <w:rPr>
-          <w:rFonts w:ascii="Consolas" w:hAnsi="Consolas"/>
-          <w:sz w:val="18"/>
-          <w:szCs w:val="18"/>
-        </w:rPr>
-        <w:t>응답</w:t>
-      </w:r>
-      <w:r>
-        <w:rPr>
-          <w:rFonts w:ascii="Consolas" w:hAnsi="Consolas"/>
-          <w:sz w:val="18"/>
-          <w:szCs w:val="18"/>
-        </w:rPr>
-        <w:t xml:space="preserve">: </w:t>
-      </w:r>
-      <w:r>
-        <w:rPr>
-          <w:rFonts w:ascii="Consolas" w:hAnsi="Consolas"/>
-          <w:sz w:val="18"/>
-          <w:szCs w:val="18"/>
-        </w:rPr>
-        <w:t>일반</w:t>
-      </w:r>
-      <w:r>
-        <w:rPr>
-          <w:rFonts w:ascii="Consolas" w:hAnsi="Consolas"/>
-          <w:sz w:val="18"/>
-          <w:szCs w:val="18"/>
-        </w:rPr>
-        <w:t xml:space="preserve"> </w:t>
-      </w:r>
-      <w:r>
-        <w:rPr>
-          <w:rFonts w:ascii="Consolas" w:hAnsi="Consolas"/>
-          <w:sz w:val="18"/>
-          <w:szCs w:val="18"/>
-        </w:rPr>
-        <w:t>메시지</w:t>
-      </w:r>
-      <w:r>
-        <w:rPr>
-          <w:rFonts w:ascii="Consolas" w:hAnsi="Consolas"/>
-          <w:sz w:val="18"/>
-          <w:szCs w:val="18"/>
-        </w:rPr>
-        <w:t xml:space="preserve"> + traceId (</w:t>
-      </w:r>
-      <w:r>
-        <w:rPr>
-          <w:rFonts w:ascii="Consolas" w:hAnsi="Consolas"/>
-          <w:sz w:val="18"/>
-          <w:szCs w:val="18"/>
-        </w:rPr>
-        <w:t>내부</w:t>
-      </w:r>
-      <w:r>
-        <w:rPr>
-          <w:rFonts w:ascii="Consolas" w:hAnsi="Consolas"/>
-          <w:sz w:val="18"/>
-          <w:szCs w:val="18"/>
-        </w:rPr>
-        <w:t xml:space="preserve"> </w:t>
-      </w:r>
-      <w:r>
-        <w:rPr>
-          <w:rFonts w:ascii="Consolas" w:hAnsi="Consolas"/>
-          <w:sz w:val="18"/>
-          <w:szCs w:val="18"/>
-        </w:rPr>
-        <w:t>메시지</w:t>
-      </w:r>
-      <w:r>
-        <w:rPr>
-          <w:rFonts w:ascii="Consolas" w:hAnsi="Consolas"/>
-          <w:sz w:val="18"/>
-          <w:szCs w:val="18"/>
-        </w:rPr>
-        <w:t xml:space="preserve"> </w:t>
-      </w:r>
-      <w:r>
-        <w:rPr>
-          <w:rFonts w:ascii="Consolas" w:hAnsi="Consolas"/>
-          <w:sz w:val="18"/>
-          <w:szCs w:val="18"/>
-        </w:rPr>
-        <w:t>숨김</w:t>
-      </w:r>
-      <w:r>
-        <w:rPr>
-          <w:rFonts w:ascii="Consolas" w:hAnsi="Consolas"/>
-          <w:sz w:val="18"/>
-          <w:szCs w:val="18"/>
-        </w:rPr>
-        <w:t>)</w:t>
-      </w:r>
-    </w:p>
-    <w:p>
-      <w:pPr>
-        <w:pBdr>
-          <w:left w:val="single" w:sz="18" w:space="6" w:color="C0C0C0"/>
-        </w:pBdr>
-        <w:shd w:val="clear" w:color="auto" w:fill="F4F4F4"/>
-      </w:pPr>
-      <w:r>
-        <w:rPr>
-          <w:rFonts w:ascii="Consolas" w:hAnsi="Consolas"/>
-          <w:sz w:val="18"/>
-          <w:szCs w:val="18"/>
-        </w:rPr>
-        <w:t xml:space="preserve">    errorObject.setMessage("</w:t>
-      </w:r>
-      <w:r>
-        <w:rPr>
-          <w:rFonts w:ascii="Consolas" w:hAnsi="Consolas"/>
-          <w:sz w:val="18"/>
-          <w:szCs w:val="18"/>
-        </w:rPr>
-        <w:t>서버</w:t>
-      </w:r>
-      <w:r>
-        <w:rPr>
-          <w:rFonts w:ascii="Consolas" w:hAnsi="Consolas"/>
-          <w:sz w:val="18"/>
-          <w:szCs w:val="18"/>
-        </w:rPr>
-        <w:t xml:space="preserve"> </w:t>
-      </w:r>
-      <w:r>
-        <w:rPr>
-          <w:rFonts w:ascii="Consolas" w:hAnsi="Consolas"/>
-          <w:sz w:val="18"/>
-          <w:szCs w:val="18"/>
-        </w:rPr>
-        <w:t>내부</w:t>
-      </w:r>
-      <w:r>
-        <w:rPr>
-          <w:rFonts w:ascii="Consolas" w:hAnsi="Consolas"/>
-          <w:sz w:val="18"/>
-          <w:szCs w:val="18"/>
-        </w:rPr>
-        <w:t xml:space="preserve"> </w:t>
-      </w:r>
-      <w:r>
-        <w:rPr>
-          <w:rFonts w:ascii="Consolas" w:hAnsi="Consolas"/>
-          <w:sz w:val="18"/>
-          <w:szCs w:val="18"/>
-        </w:rPr>
-        <w:t>오류가</w:t>
-      </w:r>
-      <w:r>
-        <w:rPr>
-          <w:rFonts w:ascii="Consolas" w:hAnsi="Consolas"/>
-          <w:sz w:val="18"/>
-          <w:szCs w:val="18"/>
-        </w:rPr>
-        <w:t xml:space="preserve"> </w:t>
-      </w:r>
-      <w:r>
-        <w:rPr>
-          <w:rFonts w:ascii="Consolas" w:hAnsi="Consolas"/>
-          <w:sz w:val="18"/>
-          <w:szCs w:val="18"/>
-        </w:rPr>
-        <w:t>발생했습니다</w:t>
-      </w:r>
-      <w:r>
-        <w:rPr>
-          <w:rFonts w:ascii="Consolas" w:hAnsi="Consolas"/>
-          <w:sz w:val="18"/>
-          <w:szCs w:val="18"/>
-        </w:rPr>
-        <w:t>. (traceId: " + traceId + ")");</w:t>
+        <w:t xml:space="preserve">    errorObject.setMessage("서버 내부 오류가 발생했습니다. (traceId: " + traceId + ")");</w:t>
       </w:r>
     </w:p>
     <w:p>
@@ -5226,71 +4143,7 @@
           <w:sz w:val="18"/>
           <w:szCs w:val="18"/>
         </w:rPr>
-        <w:t>{"statusCode":500,"message":"</w:t>
-      </w:r>
-      <w:r>
-        <w:rPr>
-          <w:rFonts w:ascii="Consolas" w:hAnsi="Consolas"/>
-          <w:sz w:val="18"/>
-          <w:szCs w:val="18"/>
-        </w:rPr>
-        <w:t>서버</w:t>
-      </w:r>
-      <w:r>
-        <w:rPr>
-          <w:rFonts w:ascii="Consolas" w:hAnsi="Consolas"/>
-          <w:sz w:val="18"/>
-          <w:szCs w:val="18"/>
-        </w:rPr>
-        <w:t xml:space="preserve"> </w:t>
-      </w:r>
-      <w:r>
-        <w:rPr>
-          <w:rFonts w:ascii="Consolas" w:hAnsi="Consolas"/>
-          <w:sz w:val="18"/>
-          <w:szCs w:val="18"/>
-        </w:rPr>
-        <w:t>내부</w:t>
-      </w:r>
-      <w:r>
-        <w:rPr>
-          <w:rFonts w:ascii="Consolas" w:hAnsi="Consolas"/>
-          <w:sz w:val="18"/>
-          <w:szCs w:val="18"/>
-        </w:rPr>
-        <w:t xml:space="preserve"> </w:t>
-      </w:r>
-      <w:r>
-        <w:rPr>
-          <w:rFonts w:ascii="Consolas" w:hAnsi="Consolas"/>
-          <w:sz w:val="18"/>
-          <w:szCs w:val="18"/>
-        </w:rPr>
-        <w:t>오류가</w:t>
-      </w:r>
-      <w:r>
-        <w:rPr>
-          <w:rFonts w:ascii="Consolas" w:hAnsi="Consolas"/>
-          <w:sz w:val="18"/>
-          <w:szCs w:val="18"/>
-        </w:rPr>
-        <w:t xml:space="preserve"> </w:t>
-      </w:r>
-      <w:r>
-        <w:rPr>
-          <w:rFonts w:ascii="Consolas" w:hAnsi="Consolas"/>
-          <w:sz w:val="18"/>
-          <w:szCs w:val="18"/>
-        </w:rPr>
-        <w:t>발생했습니다</w:t>
-      </w:r>
-      <w:r>
-        <w:rPr>
-          <w:rFonts w:ascii="Consolas" w:hAnsi="Consolas"/>
-          <w:sz w:val="18"/>
-          <w:szCs w:val="18"/>
-        </w:rPr>
-        <w:t>. (traceId: 9a51a868)", ...}</w:t>
+        <w:t xml:space="preserve">{"statusCode":500,"message":"서버 내부 오류가 발생했습니다. (traceId: 9a51a868)", ...}</w:t>
       </w:r>
     </w:p>
     <w:p>

</xml_diff>